<commit_message>
tabla nula para escala
</commit_message>
<xml_diff>
--- a/app/templates/tabla_escala.docx
+++ b/app/templates/tabla_escala.docx
@@ -101,7 +101,7 @@
         <w:tblStyle w:val="Tablaconcuadrcula"/>
         <w:tblW w:w="10500" w:type="dxa"/>
         <w:jc w:val="left"/>
-        <w:tblInd w:w="-734" w:type="dxa"/>
+        <w:tblInd w:w="-735" w:type="dxa"/>
         <w:tblLayout w:type="fixed"/>
         <w:tblCellMar>
           <w:top w:w="0" w:type="dxa"/>
@@ -114,9 +114,9 @@
       <w:tblGrid>
         <w:gridCol w:w="1059"/>
         <w:gridCol w:w="2935"/>
-        <w:gridCol w:w="994"/>
-        <w:gridCol w:w="1068"/>
-        <w:gridCol w:w="507"/>
+        <w:gridCol w:w="993"/>
+        <w:gridCol w:w="1069"/>
+        <w:gridCol w:w="506"/>
         <w:gridCol w:w="3937"/>
       </w:tblGrid>
       <w:tr>
@@ -167,7 +167,7 @@
         </w:tc>
         <w:tc>
           <w:tcPr>
-            <w:tcW w:w="994" w:type="dxa"/>
+            <w:tcW w:w="993" w:type="dxa"/>
             <w:tcBorders>
               <w:top w:val="single" w:sz="8" w:space="0" w:color="1F497D"/>
               <w:left w:val="single" w:sz="8" w:space="0" w:color="1F497D"/>
@@ -206,7 +206,7 @@
         </w:tc>
         <w:tc>
           <w:tcPr>
-            <w:tcW w:w="1068" w:type="dxa"/>
+            <w:tcW w:w="1069" w:type="dxa"/>
             <w:tcBorders>
               <w:top w:val="single" w:sz="8" w:space="0" w:color="1F497D"/>
               <w:left w:val="single" w:sz="8" w:space="0" w:color="1F497D"/>
@@ -245,7 +245,7 @@
         </w:tc>
         <w:tc>
           <w:tcPr>
-            <w:tcW w:w="507" w:type="dxa"/>
+            <w:tcW w:w="506" w:type="dxa"/>
             <w:tcBorders>
               <w:top w:val="nil"/>
               <w:left w:val="nil"/>
@@ -432,7 +432,7 @@
         </w:tc>
         <w:tc>
           <w:tcPr>
-            <w:tcW w:w="994" w:type="dxa"/>
+            <w:tcW w:w="993" w:type="dxa"/>
             <w:tcBorders>
               <w:top w:val="single" w:sz="8" w:space="0" w:color="1F497D"/>
               <w:left w:val="single" w:sz="8" w:space="0" w:color="1F497D"/>
@@ -476,7 +476,7 @@
         </w:tc>
         <w:tc>
           <w:tcPr>
-            <w:tcW w:w="1068" w:type="dxa"/>
+            <w:tcW w:w="1069" w:type="dxa"/>
             <w:tcBorders>
               <w:top w:val="single" w:sz="8" w:space="0" w:color="1F497D"/>
               <w:left w:val="single" w:sz="8" w:space="0" w:color="1F497D"/>
@@ -520,7 +520,7 @@
         </w:tc>
         <w:tc>
           <w:tcPr>
-            <w:tcW w:w="507" w:type="dxa"/>
+            <w:tcW w:w="506" w:type="dxa"/>
             <w:tcBorders>
               <w:top w:val="single" w:sz="8" w:space="0" w:color="1F497D"/>
               <w:left w:val="single" w:sz="8" w:space="0" w:color="1F497D"/>
@@ -690,7 +690,7 @@
         </w:tc>
         <w:tc>
           <w:tcPr>
-            <w:tcW w:w="994" w:type="dxa"/>
+            <w:tcW w:w="993" w:type="dxa"/>
             <w:tcBorders>
               <w:top w:val="single" w:sz="8" w:space="0" w:color="1F497D"/>
               <w:left w:val="single" w:sz="8" w:space="0" w:color="1F497D"/>
@@ -730,7 +730,7 @@
         </w:tc>
         <w:tc>
           <w:tcPr>
-            <w:tcW w:w="1068" w:type="dxa"/>
+            <w:tcW w:w="1069" w:type="dxa"/>
             <w:tcBorders>
               <w:top w:val="single" w:sz="8" w:space="0" w:color="1F497D"/>
               <w:left w:val="single" w:sz="8" w:space="0" w:color="1F497D"/>
@@ -770,7 +770,7 @@
         </w:tc>
         <w:tc>
           <w:tcPr>
-            <w:tcW w:w="507" w:type="dxa"/>
+            <w:tcW w:w="506" w:type="dxa"/>
             <w:tcBorders>
               <w:top w:val="single" w:sz="8" w:space="0" w:color="1F497D"/>
               <w:left w:val="single" w:sz="8" w:space="0" w:color="1F497D"/>
@@ -933,7 +933,7 @@
         </w:tc>
         <w:tc>
           <w:tcPr>
-            <w:tcW w:w="994" w:type="dxa"/>
+            <w:tcW w:w="993" w:type="dxa"/>
             <w:tcBorders>
               <w:top w:val="single" w:sz="8" w:space="0" w:color="1F497D"/>
               <w:left w:val="single" w:sz="8" w:space="0" w:color="1F497D"/>
@@ -973,7 +973,7 @@
         </w:tc>
         <w:tc>
           <w:tcPr>
-            <w:tcW w:w="1068" w:type="dxa"/>
+            <w:tcW w:w="1069" w:type="dxa"/>
             <w:tcBorders>
               <w:top w:val="single" w:sz="8" w:space="0" w:color="1F497D"/>
               <w:left w:val="single" w:sz="8" w:space="0" w:color="1F497D"/>
@@ -1013,7 +1013,7 @@
         </w:tc>
         <w:tc>
           <w:tcPr>
-            <w:tcW w:w="507" w:type="dxa"/>
+            <w:tcW w:w="506" w:type="dxa"/>
             <w:tcBorders>
               <w:top w:val="single" w:sz="8" w:space="0" w:color="1F497D"/>
               <w:left w:val="single" w:sz="8" w:space="0" w:color="1F497D"/>
@@ -1176,7 +1176,7 @@
         </w:tc>
         <w:tc>
           <w:tcPr>
-            <w:tcW w:w="994" w:type="dxa"/>
+            <w:tcW w:w="993" w:type="dxa"/>
             <w:tcBorders>
               <w:top w:val="single" w:sz="8" w:space="0" w:color="1F497D"/>
               <w:left w:val="single" w:sz="8" w:space="0" w:color="1F497D"/>
@@ -1216,7 +1216,7 @@
         </w:tc>
         <w:tc>
           <w:tcPr>
-            <w:tcW w:w="1068" w:type="dxa"/>
+            <w:tcW w:w="1069" w:type="dxa"/>
             <w:tcBorders>
               <w:top w:val="single" w:sz="8" w:space="0" w:color="1F497D"/>
               <w:left w:val="single" w:sz="8" w:space="0" w:color="1F497D"/>
@@ -1256,7 +1256,7 @@
         </w:tc>
         <w:tc>
           <w:tcPr>
-            <w:tcW w:w="507" w:type="dxa"/>
+            <w:tcW w:w="506" w:type="dxa"/>
             <w:tcBorders>
               <w:top w:val="single" w:sz="8" w:space="0" w:color="1F497D"/>
               <w:left w:val="single" w:sz="8" w:space="0" w:color="1F497D"/>
@@ -1419,7 +1419,7 @@
         </w:tc>
         <w:tc>
           <w:tcPr>
-            <w:tcW w:w="994" w:type="dxa"/>
+            <w:tcW w:w="993" w:type="dxa"/>
             <w:tcBorders>
               <w:top w:val="single" w:sz="8" w:space="0" w:color="1F497D"/>
               <w:left w:val="single" w:sz="8" w:space="0" w:color="1F497D"/>
@@ -1459,7 +1459,7 @@
         </w:tc>
         <w:tc>
           <w:tcPr>
-            <w:tcW w:w="1068" w:type="dxa"/>
+            <w:tcW w:w="1069" w:type="dxa"/>
             <w:tcBorders>
               <w:top w:val="single" w:sz="8" w:space="0" w:color="1F497D"/>
               <w:left w:val="single" w:sz="8" w:space="0" w:color="1F497D"/>
@@ -1499,7 +1499,7 @@
         </w:tc>
         <w:tc>
           <w:tcPr>
-            <w:tcW w:w="507" w:type="dxa"/>
+            <w:tcW w:w="506" w:type="dxa"/>
             <w:tcBorders>
               <w:top w:val="single" w:sz="8" w:space="0" w:color="1F497D"/>
               <w:left w:val="single" w:sz="8" w:space="0" w:color="1F497D"/>
@@ -1664,7 +1664,7 @@
         </w:tc>
         <w:tc>
           <w:tcPr>
-            <w:tcW w:w="994" w:type="dxa"/>
+            <w:tcW w:w="993" w:type="dxa"/>
             <w:tcBorders>
               <w:top w:val="single" w:sz="8" w:space="0" w:color="1F497D"/>
               <w:left w:val="single" w:sz="8" w:space="0" w:color="1F497D"/>
@@ -1704,7 +1704,7 @@
         </w:tc>
         <w:tc>
           <w:tcPr>
-            <w:tcW w:w="1068" w:type="dxa"/>
+            <w:tcW w:w="1069" w:type="dxa"/>
             <w:tcBorders>
               <w:top w:val="single" w:sz="8" w:space="0" w:color="1F497D"/>
               <w:left w:val="single" w:sz="8" w:space="0" w:color="1F497D"/>
@@ -1744,7 +1744,7 @@
         </w:tc>
         <w:tc>
           <w:tcPr>
-            <w:tcW w:w="507" w:type="dxa"/>
+            <w:tcW w:w="506" w:type="dxa"/>
             <w:tcBorders>
               <w:top w:val="single" w:sz="8" w:space="0" w:color="1F497D"/>
               <w:left w:val="single" w:sz="8" w:space="0" w:color="1F497D"/>
@@ -1909,7 +1909,7 @@
         </w:tc>
         <w:tc>
           <w:tcPr>
-            <w:tcW w:w="994" w:type="dxa"/>
+            <w:tcW w:w="993" w:type="dxa"/>
             <w:tcBorders>
               <w:top w:val="single" w:sz="8" w:space="0" w:color="1F497D"/>
               <w:left w:val="single" w:sz="8" w:space="0" w:color="1F497D"/>
@@ -1949,7 +1949,7 @@
         </w:tc>
         <w:tc>
           <w:tcPr>
-            <w:tcW w:w="1068" w:type="dxa"/>
+            <w:tcW w:w="1069" w:type="dxa"/>
             <w:tcBorders>
               <w:top w:val="single" w:sz="8" w:space="0" w:color="1F497D"/>
               <w:left w:val="single" w:sz="8" w:space="0" w:color="1F497D"/>
@@ -1989,7 +1989,7 @@
         </w:tc>
         <w:tc>
           <w:tcPr>
-            <w:tcW w:w="507" w:type="dxa"/>
+            <w:tcW w:w="506" w:type="dxa"/>
             <w:tcBorders>
               <w:top w:val="single" w:sz="8" w:space="0" w:color="1F497D"/>
               <w:left w:val="single" w:sz="8" w:space="0" w:color="1F497D"/>
@@ -2152,7 +2152,7 @@
         </w:tc>
         <w:tc>
           <w:tcPr>
-            <w:tcW w:w="994" w:type="dxa"/>
+            <w:tcW w:w="993" w:type="dxa"/>
             <w:tcBorders>
               <w:top w:val="single" w:sz="8" w:space="0" w:color="1F497D"/>
               <w:left w:val="single" w:sz="8" w:space="0" w:color="1F497D"/>
@@ -2192,7 +2192,7 @@
         </w:tc>
         <w:tc>
           <w:tcPr>
-            <w:tcW w:w="1068" w:type="dxa"/>
+            <w:tcW w:w="1069" w:type="dxa"/>
             <w:tcBorders>
               <w:top w:val="single" w:sz="8" w:space="0" w:color="1F497D"/>
               <w:left w:val="single" w:sz="8" w:space="0" w:color="1F497D"/>
@@ -2232,7 +2232,7 @@
         </w:tc>
         <w:tc>
           <w:tcPr>
-            <w:tcW w:w="507" w:type="dxa"/>
+            <w:tcW w:w="506" w:type="dxa"/>
             <w:tcBorders>
               <w:top w:val="single" w:sz="8" w:space="0" w:color="1F497D"/>
               <w:left w:val="single" w:sz="8" w:space="0" w:color="1F497D"/>
@@ -2400,7 +2400,7 @@
         </w:tc>
         <w:tc>
           <w:tcPr>
-            <w:tcW w:w="994" w:type="dxa"/>
+            <w:tcW w:w="993" w:type="dxa"/>
             <w:tcBorders>
               <w:top w:val="single" w:sz="8" w:space="0" w:color="1F497D"/>
               <w:left w:val="single" w:sz="8" w:space="0" w:color="1F497D"/>
@@ -2440,7 +2440,7 @@
         </w:tc>
         <w:tc>
           <w:tcPr>
-            <w:tcW w:w="1068" w:type="dxa"/>
+            <w:tcW w:w="1069" w:type="dxa"/>
             <w:tcBorders>
               <w:top w:val="single" w:sz="8" w:space="0" w:color="1F497D"/>
               <w:left w:val="single" w:sz="8" w:space="0" w:color="1F497D"/>
@@ -2480,7 +2480,7 @@
         </w:tc>
         <w:tc>
           <w:tcPr>
-            <w:tcW w:w="507" w:type="dxa"/>
+            <w:tcW w:w="506" w:type="dxa"/>
             <w:tcBorders>
               <w:top w:val="single" w:sz="8" w:space="0" w:color="1F497D"/>
               <w:left w:val="single" w:sz="8" w:space="0" w:color="1F497D"/>
@@ -2647,7 +2647,7 @@
         </w:tc>
         <w:tc>
           <w:tcPr>
-            <w:tcW w:w="994" w:type="dxa"/>
+            <w:tcW w:w="993" w:type="dxa"/>
             <w:tcBorders>
               <w:top w:val="single" w:sz="8" w:space="0" w:color="1F497D"/>
               <w:left w:val="single" w:sz="8" w:space="0" w:color="1F497D"/>
@@ -2687,7 +2687,7 @@
         </w:tc>
         <w:tc>
           <w:tcPr>
-            <w:tcW w:w="1068" w:type="dxa"/>
+            <w:tcW w:w="1069" w:type="dxa"/>
             <w:tcBorders>
               <w:top w:val="single" w:sz="8" w:space="0" w:color="1F497D"/>
               <w:left w:val="single" w:sz="8" w:space="0" w:color="1F497D"/>
@@ -2727,7 +2727,7 @@
         </w:tc>
         <w:tc>
           <w:tcPr>
-            <w:tcW w:w="507" w:type="dxa"/>
+            <w:tcW w:w="506" w:type="dxa"/>
             <w:tcBorders>
               <w:top w:val="single" w:sz="8" w:space="0" w:color="1F497D"/>
               <w:left w:val="single" w:sz="8" w:space="0" w:color="1F497D"/>
@@ -2890,7 +2890,7 @@
         </w:tc>
         <w:tc>
           <w:tcPr>
-            <w:tcW w:w="994" w:type="dxa"/>
+            <w:tcW w:w="993" w:type="dxa"/>
             <w:tcBorders>
               <w:top w:val="single" w:sz="8" w:space="0" w:color="1F497D"/>
               <w:left w:val="single" w:sz="8" w:space="0" w:color="1F497D"/>
@@ -2930,7 +2930,7 @@
         </w:tc>
         <w:tc>
           <w:tcPr>
-            <w:tcW w:w="1068" w:type="dxa"/>
+            <w:tcW w:w="1069" w:type="dxa"/>
             <w:tcBorders>
               <w:top w:val="single" w:sz="8" w:space="0" w:color="1F497D"/>
               <w:left w:val="single" w:sz="8" w:space="0" w:color="1F497D"/>
@@ -2970,7 +2970,7 @@
         </w:tc>
         <w:tc>
           <w:tcPr>
-            <w:tcW w:w="507" w:type="dxa"/>
+            <w:tcW w:w="506" w:type="dxa"/>
             <w:tcBorders>
               <w:top w:val="single" w:sz="8" w:space="0" w:color="1F497D"/>
               <w:left w:val="single" w:sz="8" w:space="0" w:color="1F497D"/>
@@ -3135,7 +3135,7 @@
         </w:tc>
         <w:tc>
           <w:tcPr>
-            <w:tcW w:w="994" w:type="dxa"/>
+            <w:tcW w:w="993" w:type="dxa"/>
             <w:tcBorders>
               <w:top w:val="single" w:sz="8" w:space="0" w:color="1F497D"/>
               <w:left w:val="single" w:sz="8" w:space="0" w:color="1F497D"/>
@@ -3175,7 +3175,7 @@
         </w:tc>
         <w:tc>
           <w:tcPr>
-            <w:tcW w:w="1068" w:type="dxa"/>
+            <w:tcW w:w="1069" w:type="dxa"/>
             <w:tcBorders>
               <w:top w:val="single" w:sz="8" w:space="0" w:color="1F497D"/>
               <w:left w:val="single" w:sz="8" w:space="0" w:color="1F497D"/>
@@ -3215,7 +3215,7 @@
         </w:tc>
         <w:tc>
           <w:tcPr>
-            <w:tcW w:w="507" w:type="dxa"/>
+            <w:tcW w:w="506" w:type="dxa"/>
             <w:tcBorders>
               <w:top w:val="single" w:sz="8" w:space="0" w:color="1F497D"/>
               <w:left w:val="single" w:sz="8" w:space="0" w:color="1F497D"/>
@@ -3323,18 +3323,30 @@
         <w:pStyle w:val="Normal"/>
         <w:widowControl w:val="false"/>
         <w:spacing w:before="0" w:after="0"/>
-        <w:ind w:hanging="0"/>
+        <w:ind w:left="0" w:right="0" w:hanging="0"/>
         <w:rPr>
-          <w:rFonts w:cs="Arial"/>
           <w:b/>
           <w:b/>
         </w:rPr>
       </w:pPr>
       <w:r>
         <w:rPr>
-          <w:rFonts w:cs="Arial"/>
           <w:b/>
         </w:rPr>
+        <w:t>{{na1-</w:t>
+      </w:r>
+      <w:r>
+        <w:rPr>
+          <w:b/>
+        </w:rPr>
+        <w:t>1</w:t>
+      </w:r>
+      <w:r>
+        <w:rPr>
+          <w:b/>
+        </w:rPr>
+        <w:t xml:space="preserve">}}          </w:t>
+        <w:tab/>
       </w:r>
     </w:p>
     <w:p>
@@ -3420,12 +3432,12 @@
       </w:tblPr>
       <w:tblGrid>
         <w:gridCol w:w="1472"/>
-        <w:gridCol w:w="2672"/>
-        <w:gridCol w:w="1050"/>
-        <w:gridCol w:w="1050"/>
+        <w:gridCol w:w="2671"/>
+        <w:gridCol w:w="1051"/>
+        <w:gridCol w:w="1049"/>
         <w:gridCol w:w="1078"/>
-        <w:gridCol w:w="534"/>
-        <w:gridCol w:w="2691"/>
+        <w:gridCol w:w="535"/>
+        <w:gridCol w:w="2690"/>
       </w:tblGrid>
       <w:tr>
         <w:trPr>
@@ -3477,7 +3489,7 @@
         </w:tc>
         <w:tc>
           <w:tcPr>
-            <w:tcW w:w="1050" w:type="dxa"/>
+            <w:tcW w:w="1049" w:type="dxa"/>
             <w:tcBorders>
               <w:top w:val="single" w:sz="12" w:space="0" w:color="000000"/>
               <w:left w:val="single" w:sz="6" w:space="0" w:color="000000"/>
@@ -3558,7 +3570,7 @@
         </w:tc>
         <w:tc>
           <w:tcPr>
-            <w:tcW w:w="534" w:type="dxa"/>
+            <w:tcW w:w="535" w:type="dxa"/>
             <w:tcBorders>
               <w:top w:val="nil"/>
               <w:left w:val="nil"/>
@@ -3593,7 +3605,7 @@
         </w:tc>
         <w:tc>
           <w:tcPr>
-            <w:tcW w:w="2691" w:type="dxa"/>
+            <w:tcW w:w="2690" w:type="dxa"/>
             <w:tcBorders>
               <w:top w:val="nil"/>
               <w:left w:val="nil"/>
@@ -3675,7 +3687,7 @@
         </w:tc>
         <w:tc>
           <w:tcPr>
-            <w:tcW w:w="2672" w:type="dxa"/>
+            <w:tcW w:w="2671" w:type="dxa"/>
             <w:tcBorders>
               <w:top w:val="single" w:sz="12" w:space="0" w:color="000000"/>
               <w:left w:val="single" w:sz="6" w:space="0" w:color="000000"/>
@@ -3715,7 +3727,7 @@
         </w:tc>
         <w:tc>
           <w:tcPr>
-            <w:tcW w:w="1050" w:type="dxa"/>
+            <w:tcW w:w="1051" w:type="dxa"/>
             <w:tcBorders>
               <w:top w:val="single" w:sz="12" w:space="0" w:color="000000"/>
               <w:left w:val="single" w:sz="6" w:space="0" w:color="000000"/>
@@ -3755,7 +3767,7 @@
         </w:tc>
         <w:tc>
           <w:tcPr>
-            <w:tcW w:w="1050" w:type="dxa"/>
+            <w:tcW w:w="1049" w:type="dxa"/>
             <w:tcBorders>
               <w:top w:val="single" w:sz="12" w:space="0" w:color="000000"/>
               <w:left w:val="single" w:sz="6" w:space="0" w:color="000000"/>
@@ -3837,7 +3849,7 @@
         </w:tc>
         <w:tc>
           <w:tcPr>
-            <w:tcW w:w="534" w:type="dxa"/>
+            <w:tcW w:w="535" w:type="dxa"/>
             <w:tcBorders>
               <w:top w:val="single" w:sz="12" w:space="0" w:color="000000"/>
               <w:left w:val="single" w:sz="6" w:space="0" w:color="000000"/>
@@ -3878,7 +3890,7 @@
         </w:tc>
         <w:tc>
           <w:tcPr>
-            <w:tcW w:w="2691" w:type="dxa"/>
+            <w:tcW w:w="2690" w:type="dxa"/>
             <w:tcBorders>
               <w:top w:val="single" w:sz="12" w:space="0" w:color="000000"/>
               <w:left w:val="single" w:sz="6" w:space="0" w:color="000000"/>
@@ -3965,7 +3977,7 @@
         </w:tc>
         <w:tc>
           <w:tcPr>
-            <w:tcW w:w="2672" w:type="dxa"/>
+            <w:tcW w:w="2671" w:type="dxa"/>
             <w:tcBorders>
               <w:top w:val="nil"/>
               <w:left w:val="nil"/>
@@ -4006,7 +4018,7 @@
         </w:tc>
         <w:tc>
           <w:tcPr>
-            <w:tcW w:w="1050" w:type="dxa"/>
+            <w:tcW w:w="1051" w:type="dxa"/>
             <w:tcBorders>
               <w:top w:val="nil"/>
               <w:left w:val="nil"/>
@@ -4045,7 +4057,7 @@
         </w:tc>
         <w:tc>
           <w:tcPr>
-            <w:tcW w:w="1050" w:type="dxa"/>
+            <w:tcW w:w="1049" w:type="dxa"/>
             <w:tcBorders>
               <w:top w:val="single" w:sz="12" w:space="0" w:color="000000"/>
               <w:left w:val="single" w:sz="6" w:space="0" w:color="000000"/>
@@ -4123,7 +4135,7 @@
         </w:tc>
         <w:tc>
           <w:tcPr>
-            <w:tcW w:w="534" w:type="dxa"/>
+            <w:tcW w:w="535" w:type="dxa"/>
             <w:tcBorders>
               <w:top w:val="single" w:sz="12" w:space="0" w:color="000000"/>
               <w:left w:val="single" w:sz="8" w:space="0" w:color="000000"/>
@@ -4156,7 +4168,7 @@
         </w:tc>
         <w:tc>
           <w:tcPr>
-            <w:tcW w:w="2691" w:type="dxa"/>
+            <w:tcW w:w="2690" w:type="dxa"/>
             <w:tcBorders>
               <w:top w:val="single" w:sz="12" w:space="0" w:color="000000"/>
               <w:left w:val="single" w:sz="8" w:space="0" w:color="000000"/>
@@ -4197,24 +4209,35 @@
         <w:pStyle w:val="Normal"/>
         <w:widowControl w:val="false"/>
         <w:spacing w:before="0" w:after="0"/>
-        <w:ind w:hanging="0"/>
+        <w:ind w:left="0" w:right="0" w:hanging="0"/>
         <w:rPr>
-          <w:rFonts w:cs="Arial"/>
           <w:b/>
           <w:b/>
-          <w:sz w:val="22"/>
-          <w:szCs w:val="22"/>
-          <w:lang w:val="es-ES"/>
         </w:rPr>
       </w:pPr>
       <w:r>
         <w:rPr>
-          <w:rFonts w:cs="Arial"/>
           <w:b/>
-          <w:sz w:val="22"/>
-          <w:szCs w:val="22"/>
-          <w:lang w:val="es-ES"/>
         </w:rPr>
+        <w:t xml:space="preserve">{{na1-2}}          </w:t>
+        <w:tab/>
+      </w:r>
+    </w:p>
+    <w:p>
+      <w:pPr>
+        <w:pStyle w:val="Normal"/>
+        <w:widowControl w:val="false"/>
+        <w:spacing w:before="0" w:after="0"/>
+        <w:ind w:left="0" w:right="0" w:hanging="0"/>
+        <w:rPr>
+          <w:b/>
+          <w:b/>
+        </w:rPr>
+      </w:pPr>
+      <w:r>
+        <w:rPr/>
+        <w:tab/>
+        <w:t>{{na2-1}}</w:t>
       </w:r>
     </w:p>
     <w:p>
@@ -4294,7 +4317,7 @@
         <w:tblStyle w:val="Tablaconcuadrcula"/>
         <w:tblW w:w="10509" w:type="dxa"/>
         <w:jc w:val="left"/>
-        <w:tblInd w:w="-739" w:type="dxa"/>
+        <w:tblInd w:w="-740" w:type="dxa"/>
         <w:tblLayout w:type="fixed"/>
         <w:tblCellMar>
           <w:top w:w="0" w:type="dxa"/>
@@ -4307,11 +4330,11 @@
       <w:tblGrid>
         <w:gridCol w:w="1425"/>
         <w:gridCol w:w="2691"/>
-        <w:gridCol w:w="1003"/>
-        <w:gridCol w:w="1078"/>
+        <w:gridCol w:w="1002"/>
+        <w:gridCol w:w="1079"/>
         <w:gridCol w:w="1078"/>
         <w:gridCol w:w="534"/>
-        <w:gridCol w:w="2700"/>
+        <w:gridCol w:w="2699"/>
       </w:tblGrid>
       <w:tr>
         <w:trPr>
@@ -4321,7 +4344,7 @@
         </w:trPr>
         <w:tc>
           <w:tcPr>
-            <w:tcW w:w="5119" w:type="dxa"/>
+            <w:tcW w:w="5118" w:type="dxa"/>
             <w:gridSpan w:val="3"/>
             <w:tcBorders>
               <w:top w:val="single" w:sz="12" w:space="0" w:color="000000"/>
@@ -4363,7 +4386,7 @@
         </w:tc>
         <w:tc>
           <w:tcPr>
-            <w:tcW w:w="1078" w:type="dxa"/>
+            <w:tcW w:w="1079" w:type="dxa"/>
             <w:tcBorders>
               <w:top w:val="single" w:sz="12" w:space="0" w:color="000000"/>
               <w:left w:val="single" w:sz="6" w:space="0" w:color="000000"/>
@@ -4479,7 +4502,7 @@
         </w:tc>
         <w:tc>
           <w:tcPr>
-            <w:tcW w:w="2700" w:type="dxa"/>
+            <w:tcW w:w="2699" w:type="dxa"/>
             <w:tcBorders>
               <w:top w:val="nil"/>
               <w:left w:val="nil"/>
@@ -4601,7 +4624,7 @@
         </w:tc>
         <w:tc>
           <w:tcPr>
-            <w:tcW w:w="1003" w:type="dxa"/>
+            <w:tcW w:w="1002" w:type="dxa"/>
             <w:tcBorders>
               <w:top w:val="single" w:sz="12" w:space="0" w:color="000000"/>
               <w:left w:val="single" w:sz="6" w:space="0" w:color="000000"/>
@@ -4641,7 +4664,7 @@
         </w:tc>
         <w:tc>
           <w:tcPr>
-            <w:tcW w:w="1078" w:type="dxa"/>
+            <w:tcW w:w="1079" w:type="dxa"/>
             <w:tcBorders>
               <w:top w:val="single" w:sz="12" w:space="0" w:color="000000"/>
               <w:left w:val="single" w:sz="6" w:space="0" w:color="000000"/>
@@ -4764,7 +4787,7 @@
         </w:tc>
         <w:tc>
           <w:tcPr>
-            <w:tcW w:w="2700" w:type="dxa"/>
+            <w:tcW w:w="2699" w:type="dxa"/>
             <w:tcBorders>
               <w:top w:val="single" w:sz="12" w:space="0" w:color="000000"/>
               <w:left w:val="single" w:sz="6" w:space="0" w:color="000000"/>
@@ -4892,7 +4915,7 @@
         </w:tc>
         <w:tc>
           <w:tcPr>
-            <w:tcW w:w="1003" w:type="dxa"/>
+            <w:tcW w:w="1002" w:type="dxa"/>
             <w:tcBorders>
               <w:top w:val="nil"/>
               <w:left w:val="nil"/>
@@ -4929,7 +4952,7 @@
         </w:tc>
         <w:tc>
           <w:tcPr>
-            <w:tcW w:w="1078" w:type="dxa"/>
+            <w:tcW w:w="1079" w:type="dxa"/>
             <w:tcBorders>
               <w:top w:val="single" w:sz="12" w:space="0" w:color="000000"/>
               <w:left w:val="single" w:sz="6" w:space="0" w:color="000000"/>
@@ -5041,7 +5064,7 @@
         </w:tc>
         <w:tc>
           <w:tcPr>
-            <w:tcW w:w="2700" w:type="dxa"/>
+            <w:tcW w:w="2699" w:type="dxa"/>
             <w:tcBorders>
               <w:top w:val="single" w:sz="12" w:space="0" w:color="000000"/>
               <w:left w:val="single" w:sz="8" w:space="0" w:color="000000"/>
@@ -5163,7 +5186,7 @@
         </w:tc>
         <w:tc>
           <w:tcPr>
-            <w:tcW w:w="1003" w:type="dxa"/>
+            <w:tcW w:w="1002" w:type="dxa"/>
             <w:tcBorders>
               <w:top w:val="nil"/>
               <w:left w:val="nil"/>
@@ -5199,7 +5222,7 @@
         </w:tc>
         <w:tc>
           <w:tcPr>
-            <w:tcW w:w="1078" w:type="dxa"/>
+            <w:tcW w:w="1079" w:type="dxa"/>
             <w:tcBorders>
               <w:top w:val="single" w:sz="8" w:space="0" w:color="000000"/>
               <w:left w:val="single" w:sz="6" w:space="0" w:color="000000"/>
@@ -5310,7 +5333,7 @@
         </w:tc>
         <w:tc>
           <w:tcPr>
-            <w:tcW w:w="2700" w:type="dxa"/>
+            <w:tcW w:w="2699" w:type="dxa"/>
             <w:tcBorders>
               <w:top w:val="single" w:sz="8" w:space="0" w:color="000000"/>
               <w:left w:val="single" w:sz="8" w:space="0" w:color="000000"/>
@@ -5430,7 +5453,7 @@
         </w:tc>
         <w:tc>
           <w:tcPr>
-            <w:tcW w:w="1003" w:type="dxa"/>
+            <w:tcW w:w="1002" w:type="dxa"/>
             <w:tcBorders>
               <w:left w:val="nil"/>
               <w:right w:val="single" w:sz="8" w:space="0" w:color="000000"/>
@@ -5465,7 +5488,7 @@
         </w:tc>
         <w:tc>
           <w:tcPr>
-            <w:tcW w:w="1078" w:type="dxa"/>
+            <w:tcW w:w="1079" w:type="dxa"/>
             <w:tcBorders>
               <w:top w:val="single" w:sz="8" w:space="0" w:color="000000"/>
               <w:left w:val="single" w:sz="6" w:space="0" w:color="000000"/>
@@ -5576,7 +5599,7 @@
         </w:tc>
         <w:tc>
           <w:tcPr>
-            <w:tcW w:w="2700" w:type="dxa"/>
+            <w:tcW w:w="2699" w:type="dxa"/>
             <w:tcBorders>
               <w:top w:val="single" w:sz="8" w:space="0" w:color="000000"/>
               <w:left w:val="single" w:sz="8" w:space="0" w:color="000000"/>
@@ -5698,7 +5721,7 @@
         </w:tc>
         <w:tc>
           <w:tcPr>
-            <w:tcW w:w="1003" w:type="dxa"/>
+            <w:tcW w:w="1002" w:type="dxa"/>
             <w:tcBorders>
               <w:left w:val="nil"/>
               <w:bottom w:val="single" w:sz="8" w:space="0" w:color="000000"/>
@@ -5734,7 +5757,7 @@
         </w:tc>
         <w:tc>
           <w:tcPr>
-            <w:tcW w:w="1078" w:type="dxa"/>
+            <w:tcW w:w="1079" w:type="dxa"/>
             <w:tcBorders>
               <w:top w:val="single" w:sz="8" w:space="0" w:color="000000"/>
               <w:left w:val="single" w:sz="6" w:space="0" w:color="000000"/>
@@ -5845,7 +5868,7 @@
         </w:tc>
         <w:tc>
           <w:tcPr>
-            <w:tcW w:w="2700" w:type="dxa"/>
+            <w:tcW w:w="2699" w:type="dxa"/>
             <w:tcBorders>
               <w:top w:val="single" w:sz="8" w:space="0" w:color="000000"/>
               <w:left w:val="single" w:sz="8" w:space="0" w:color="000000"/>
@@ -5969,7 +5992,7 @@
         </w:tc>
         <w:tc>
           <w:tcPr>
-            <w:tcW w:w="1003" w:type="dxa"/>
+            <w:tcW w:w="1002" w:type="dxa"/>
             <w:tcBorders>
               <w:top w:val="nil"/>
               <w:left w:val="nil"/>
@@ -6006,7 +6029,7 @@
         </w:tc>
         <w:tc>
           <w:tcPr>
-            <w:tcW w:w="1078" w:type="dxa"/>
+            <w:tcW w:w="1079" w:type="dxa"/>
             <w:tcBorders>
               <w:top w:val="single" w:sz="8" w:space="0" w:color="000000"/>
               <w:left w:val="single" w:sz="6" w:space="0" w:color="000000"/>
@@ -6118,7 +6141,7 @@
         </w:tc>
         <w:tc>
           <w:tcPr>
-            <w:tcW w:w="2700" w:type="dxa"/>
+            <w:tcW w:w="2699" w:type="dxa"/>
             <w:tcBorders>
               <w:top w:val="single" w:sz="8" w:space="0" w:color="000000"/>
               <w:left w:val="single" w:sz="8" w:space="0" w:color="000000"/>
@@ -6242,7 +6265,7 @@
         </w:tc>
         <w:tc>
           <w:tcPr>
-            <w:tcW w:w="1003" w:type="dxa"/>
+            <w:tcW w:w="1002" w:type="dxa"/>
             <w:tcBorders>
               <w:top w:val="nil"/>
               <w:left w:val="nil"/>
@@ -6279,7 +6302,7 @@
         </w:tc>
         <w:tc>
           <w:tcPr>
-            <w:tcW w:w="1078" w:type="dxa"/>
+            <w:tcW w:w="1079" w:type="dxa"/>
             <w:tcBorders>
               <w:top w:val="single" w:sz="8" w:space="0" w:color="000000"/>
               <w:left w:val="single" w:sz="6" w:space="0" w:color="000000"/>
@@ -6391,7 +6414,7 @@
         </w:tc>
         <w:tc>
           <w:tcPr>
-            <w:tcW w:w="2700" w:type="dxa"/>
+            <w:tcW w:w="2699" w:type="dxa"/>
             <w:tcBorders>
               <w:top w:val="single" w:sz="8" w:space="0" w:color="000000"/>
               <w:left w:val="single" w:sz="8" w:space="0" w:color="000000"/>
@@ -6457,20 +6480,63 @@
         <w:pStyle w:val="Normal"/>
         <w:widowControl w:val="false"/>
         <w:spacing w:before="0" w:after="0"/>
-        <w:ind w:hanging="0"/>
+        <w:ind w:left="0" w:right="0" w:hanging="0"/>
         <w:rPr>
-          <w:rFonts w:cs="Arial"/>
           <w:b/>
           <w:b/>
-          <w:lang w:val="es-ES"/>
         </w:rPr>
       </w:pPr>
       <w:r>
         <w:rPr>
-          <w:rFonts w:cs="Arial"/>
           <w:b/>
-          <w:lang w:val="es-ES"/>
         </w:rPr>
+        <w:t>{{na</w:t>
+      </w:r>
+      <w:r>
+        <w:rPr>
+          <w:b/>
+        </w:rPr>
+        <w:t>2</w:t>
+      </w:r>
+      <w:r>
+        <w:rPr>
+          <w:b/>
+        </w:rPr>
+        <w:t xml:space="preserve">-2}}          </w:t>
+        <w:tab/>
+      </w:r>
+    </w:p>
+    <w:p>
+      <w:pPr>
+        <w:pStyle w:val="Normal"/>
+        <w:widowControl w:val="false"/>
+        <w:spacing w:before="0" w:after="0"/>
+        <w:ind w:left="0" w:right="0" w:hanging="0"/>
+        <w:rPr>
+          <w:b/>
+          <w:b/>
+        </w:rPr>
+      </w:pPr>
+      <w:r>
+        <w:rPr/>
+        <w:tab/>
+        <w:t>{{na</w:t>
+      </w:r>
+      <w:r>
+        <w:rPr/>
+        <w:t>3</w:t>
+      </w:r>
+      <w:r>
+        <w:rPr/>
+        <w:t>-</w:t>
+      </w:r>
+      <w:r>
+        <w:rPr/>
+        <w:t>1</w:t>
+      </w:r>
+      <w:r>
+        <w:rPr/>
+        <w:t>}}</w:t>
       </w:r>
     </w:p>
     <w:p>
@@ -6538,10 +6604,10 @@
       <w:tblGrid>
         <w:gridCol w:w="1350"/>
         <w:gridCol w:w="2691"/>
-        <w:gridCol w:w="1003"/>
+        <w:gridCol w:w="1002"/>
         <w:gridCol w:w="1078"/>
-        <w:gridCol w:w="1078"/>
-        <w:gridCol w:w="534"/>
+        <w:gridCol w:w="1079"/>
+        <w:gridCol w:w="533"/>
         <w:gridCol w:w="2700"/>
       </w:tblGrid>
       <w:tr>
@@ -6552,7 +6618,7 @@
         </w:trPr>
         <w:tc>
           <w:tcPr>
-            <w:tcW w:w="5044" w:type="dxa"/>
+            <w:tcW w:w="5043" w:type="dxa"/>
             <w:gridSpan w:val="3"/>
             <w:tcBorders>
               <w:top w:val="single" w:sz="12" w:space="0" w:color="000000"/>
@@ -6634,7 +6700,7 @@
         </w:tc>
         <w:tc>
           <w:tcPr>
-            <w:tcW w:w="1078" w:type="dxa"/>
+            <w:tcW w:w="1079" w:type="dxa"/>
             <w:tcBorders>
               <w:top w:val="single" w:sz="12" w:space="0" w:color="000000"/>
               <w:left w:val="single" w:sz="6" w:space="0" w:color="000000"/>
@@ -6675,7 +6741,7 @@
         </w:tc>
         <w:tc>
           <w:tcPr>
-            <w:tcW w:w="534" w:type="dxa"/>
+            <w:tcW w:w="533" w:type="dxa"/>
             <w:tcBorders>
               <w:top w:val="nil"/>
               <w:left w:val="nil"/>
@@ -6832,7 +6898,7 @@
         </w:tc>
         <w:tc>
           <w:tcPr>
-            <w:tcW w:w="1003" w:type="dxa"/>
+            <w:tcW w:w="1002" w:type="dxa"/>
             <w:tcBorders>
               <w:top w:val="single" w:sz="12" w:space="0" w:color="000000"/>
               <w:left w:val="single" w:sz="6" w:space="0" w:color="000000"/>
@@ -6913,7 +6979,7 @@
         </w:tc>
         <w:tc>
           <w:tcPr>
-            <w:tcW w:w="1078" w:type="dxa"/>
+            <w:tcW w:w="1079" w:type="dxa"/>
             <w:tcBorders>
               <w:top w:val="single" w:sz="12" w:space="0" w:color="000000"/>
               <w:left w:val="single" w:sz="6" w:space="0" w:color="000000"/>
@@ -6954,7 +7020,7 @@
         </w:tc>
         <w:tc>
           <w:tcPr>
-            <w:tcW w:w="534" w:type="dxa"/>
+            <w:tcW w:w="533" w:type="dxa"/>
             <w:tcBorders>
               <w:top w:val="single" w:sz="12" w:space="0" w:color="000000"/>
               <w:left w:val="single" w:sz="6" w:space="0" w:color="000000"/>
@@ -7123,7 +7189,7 @@
         </w:tc>
         <w:tc>
           <w:tcPr>
-            <w:tcW w:w="1003" w:type="dxa"/>
+            <w:tcW w:w="1002" w:type="dxa"/>
             <w:tcBorders>
               <w:top w:val="nil"/>
               <w:left w:val="nil"/>
@@ -7201,7 +7267,7 @@
         </w:tc>
         <w:tc>
           <w:tcPr>
-            <w:tcW w:w="1078" w:type="dxa"/>
+            <w:tcW w:w="1079" w:type="dxa"/>
             <w:tcBorders>
               <w:top w:val="single" w:sz="12" w:space="0" w:color="000000"/>
               <w:left w:val="single" w:sz="6" w:space="0" w:color="000000"/>
@@ -7240,7 +7306,7 @@
         </w:tc>
         <w:tc>
           <w:tcPr>
-            <w:tcW w:w="534" w:type="dxa"/>
+            <w:tcW w:w="533" w:type="dxa"/>
             <w:tcBorders>
               <w:top w:val="single" w:sz="12" w:space="0" w:color="000000"/>
               <w:left w:val="single" w:sz="6" w:space="0" w:color="000000"/>
@@ -7397,7 +7463,7 @@
         </w:tc>
         <w:tc>
           <w:tcPr>
-            <w:tcW w:w="1003" w:type="dxa"/>
+            <w:tcW w:w="1002" w:type="dxa"/>
             <w:tcBorders>
               <w:top w:val="nil"/>
               <w:left w:val="nil"/>
@@ -7473,7 +7539,7 @@
         </w:tc>
         <w:tc>
           <w:tcPr>
-            <w:tcW w:w="1078" w:type="dxa"/>
+            <w:tcW w:w="1079" w:type="dxa"/>
             <w:tcBorders>
               <w:top w:val="single" w:sz="8" w:space="0" w:color="000000"/>
               <w:left w:val="single" w:sz="8" w:space="0" w:color="000000"/>
@@ -7512,7 +7578,7 @@
         </w:tc>
         <w:tc>
           <w:tcPr>
-            <w:tcW w:w="534" w:type="dxa"/>
+            <w:tcW w:w="533" w:type="dxa"/>
             <w:tcBorders>
               <w:top w:val="single" w:sz="8" w:space="0" w:color="000000"/>
               <w:left w:val="single" w:sz="8" w:space="0" w:color="000000"/>
@@ -7669,7 +7735,7 @@
         </w:tc>
         <w:tc>
           <w:tcPr>
-            <w:tcW w:w="1003" w:type="dxa"/>
+            <w:tcW w:w="1002" w:type="dxa"/>
             <w:tcBorders>
               <w:top w:val="nil"/>
               <w:left w:val="nil"/>
@@ -7745,7 +7811,7 @@
         </w:tc>
         <w:tc>
           <w:tcPr>
-            <w:tcW w:w="1078" w:type="dxa"/>
+            <w:tcW w:w="1079" w:type="dxa"/>
             <w:tcBorders>
               <w:top w:val="single" w:sz="8" w:space="0" w:color="000000"/>
               <w:left w:val="single" w:sz="8" w:space="0" w:color="000000"/>
@@ -7784,7 +7850,7 @@
         </w:tc>
         <w:tc>
           <w:tcPr>
-            <w:tcW w:w="534" w:type="dxa"/>
+            <w:tcW w:w="533" w:type="dxa"/>
             <w:tcBorders>
               <w:top w:val="single" w:sz="8" w:space="0" w:color="000000"/>
               <w:left w:val="single" w:sz="8" w:space="0" w:color="000000"/>
@@ -7941,7 +8007,7 @@
         </w:tc>
         <w:tc>
           <w:tcPr>
-            <w:tcW w:w="1003" w:type="dxa"/>
+            <w:tcW w:w="1002" w:type="dxa"/>
             <w:tcBorders>
               <w:top w:val="nil"/>
               <w:left w:val="nil"/>
@@ -8017,7 +8083,7 @@
         </w:tc>
         <w:tc>
           <w:tcPr>
-            <w:tcW w:w="1078" w:type="dxa"/>
+            <w:tcW w:w="1079" w:type="dxa"/>
             <w:tcBorders>
               <w:top w:val="single" w:sz="8" w:space="0" w:color="000000"/>
               <w:left w:val="single" w:sz="8" w:space="0" w:color="000000"/>
@@ -8057,7 +8123,7 @@
         </w:tc>
         <w:tc>
           <w:tcPr>
-            <w:tcW w:w="534" w:type="dxa"/>
+            <w:tcW w:w="533" w:type="dxa"/>
             <w:tcBorders>
               <w:top w:val="single" w:sz="8" w:space="0" w:color="000000"/>
               <w:left w:val="single" w:sz="8" w:space="0" w:color="000000"/>
@@ -8214,7 +8280,7 @@
         </w:tc>
         <w:tc>
           <w:tcPr>
-            <w:tcW w:w="1003" w:type="dxa"/>
+            <w:tcW w:w="1002" w:type="dxa"/>
             <w:tcBorders>
               <w:top w:val="nil"/>
               <w:left w:val="nil"/>
@@ -8290,7 +8356,7 @@
         </w:tc>
         <w:tc>
           <w:tcPr>
-            <w:tcW w:w="1078" w:type="dxa"/>
+            <w:tcW w:w="1079" w:type="dxa"/>
             <w:tcBorders>
               <w:top w:val="single" w:sz="8" w:space="0" w:color="000000"/>
               <w:left w:val="single" w:sz="8" w:space="0" w:color="000000"/>
@@ -8329,7 +8395,7 @@
         </w:tc>
         <w:tc>
           <w:tcPr>
-            <w:tcW w:w="534" w:type="dxa"/>
+            <w:tcW w:w="533" w:type="dxa"/>
             <w:tcBorders>
               <w:top w:val="single" w:sz="8" w:space="0" w:color="000000"/>
               <w:left w:val="single" w:sz="8" w:space="0" w:color="000000"/>
@@ -8486,7 +8552,7 @@
         </w:tc>
         <w:tc>
           <w:tcPr>
-            <w:tcW w:w="1003" w:type="dxa"/>
+            <w:tcW w:w="1002" w:type="dxa"/>
             <w:tcBorders>
               <w:top w:val="nil"/>
               <w:left w:val="nil"/>
@@ -8562,7 +8628,7 @@
         </w:tc>
         <w:tc>
           <w:tcPr>
-            <w:tcW w:w="1078" w:type="dxa"/>
+            <w:tcW w:w="1079" w:type="dxa"/>
             <w:tcBorders>
               <w:top w:val="single" w:sz="8" w:space="0" w:color="000000"/>
               <w:left w:val="single" w:sz="8" w:space="0" w:color="000000"/>
@@ -8601,7 +8667,7 @@
         </w:tc>
         <w:tc>
           <w:tcPr>
-            <w:tcW w:w="534" w:type="dxa"/>
+            <w:tcW w:w="533" w:type="dxa"/>
             <w:tcBorders>
               <w:top w:val="single" w:sz="8" w:space="0" w:color="000000"/>
               <w:left w:val="single" w:sz="8" w:space="0" w:color="000000"/>
@@ -8675,24 +8741,55 @@
         <w:pStyle w:val="Normal"/>
         <w:widowControl w:val="false"/>
         <w:spacing w:before="0" w:after="0"/>
-        <w:ind w:hanging="0"/>
+        <w:ind w:left="0" w:right="0" w:hanging="0"/>
         <w:rPr>
-          <w:rFonts w:cs="Arial"/>
           <w:b/>
           <w:b/>
-          <w:sz w:val="22"/>
-          <w:szCs w:val="22"/>
-          <w:lang w:val="es-ES"/>
         </w:rPr>
       </w:pPr>
       <w:r>
         <w:rPr>
-          <w:rFonts w:cs="Arial"/>
           <w:b/>
-          <w:sz w:val="22"/>
-          <w:szCs w:val="22"/>
-          <w:lang w:val="es-ES"/>
         </w:rPr>
+        <w:t>{{na</w:t>
+      </w:r>
+      <w:r>
+        <w:rPr>
+          <w:b/>
+        </w:rPr>
+        <w:t>3</w:t>
+      </w:r>
+      <w:r>
+        <w:rPr>
+          <w:b/>
+        </w:rPr>
+        <w:t xml:space="preserve">-2}}          </w:t>
+        <w:tab/>
+      </w:r>
+    </w:p>
+    <w:p>
+      <w:pPr>
+        <w:pStyle w:val="Normal"/>
+        <w:widowControl w:val="false"/>
+        <w:spacing w:before="0" w:after="0"/>
+        <w:ind w:left="0" w:right="0" w:hanging="0"/>
+        <w:rPr>
+          <w:b/>
+          <w:b/>
+        </w:rPr>
+      </w:pPr>
+      <w:r>
+        <w:rPr/>
+        <w:tab/>
+        <w:t>{{na</w:t>
+      </w:r>
+      <w:r>
+        <w:rPr/>
+        <w:t>4</w:t>
+      </w:r>
+      <w:r>
+        <w:rPr/>
+        <w:t>-1}}</w:t>
       </w:r>
     </w:p>
     <w:p>
@@ -8785,10 +8882,10 @@
       <w:tblGrid>
         <w:gridCol w:w="1350"/>
         <w:gridCol w:w="2691"/>
-        <w:gridCol w:w="1003"/>
+        <w:gridCol w:w="1002"/>
         <w:gridCol w:w="1078"/>
-        <w:gridCol w:w="1078"/>
-        <w:gridCol w:w="534"/>
+        <w:gridCol w:w="1079"/>
+        <w:gridCol w:w="533"/>
         <w:gridCol w:w="2700"/>
       </w:tblGrid>
       <w:tr>
@@ -8799,7 +8896,7 @@
         </w:trPr>
         <w:tc>
           <w:tcPr>
-            <w:tcW w:w="5044" w:type="dxa"/>
+            <w:tcW w:w="5043" w:type="dxa"/>
             <w:gridSpan w:val="3"/>
             <w:tcBorders>
               <w:top w:val="single" w:sz="12" w:space="0" w:color="000000"/>
@@ -8881,7 +8978,7 @@
         </w:tc>
         <w:tc>
           <w:tcPr>
-            <w:tcW w:w="1078" w:type="dxa"/>
+            <w:tcW w:w="1079" w:type="dxa"/>
             <w:tcBorders>
               <w:top w:val="single" w:sz="12" w:space="0" w:color="000000"/>
               <w:left w:val="single" w:sz="6" w:space="0" w:color="000000"/>
@@ -8922,7 +9019,7 @@
         </w:tc>
         <w:tc>
           <w:tcPr>
-            <w:tcW w:w="534" w:type="dxa"/>
+            <w:tcW w:w="533" w:type="dxa"/>
             <w:tcBorders>
               <w:top w:val="nil"/>
               <w:left w:val="nil"/>
@@ -9079,7 +9176,7 @@
         </w:tc>
         <w:tc>
           <w:tcPr>
-            <w:tcW w:w="1003" w:type="dxa"/>
+            <w:tcW w:w="1002" w:type="dxa"/>
             <w:tcBorders>
               <w:top w:val="single" w:sz="12" w:space="0" w:color="000000"/>
               <w:left w:val="single" w:sz="6" w:space="0" w:color="000000"/>
@@ -9160,7 +9257,7 @@
         </w:tc>
         <w:tc>
           <w:tcPr>
-            <w:tcW w:w="1078" w:type="dxa"/>
+            <w:tcW w:w="1079" w:type="dxa"/>
             <w:tcBorders>
               <w:top w:val="single" w:sz="12" w:space="0" w:color="000000"/>
               <w:left w:val="single" w:sz="6" w:space="0" w:color="000000"/>
@@ -9201,7 +9298,7 @@
         </w:tc>
         <w:tc>
           <w:tcPr>
-            <w:tcW w:w="534" w:type="dxa"/>
+            <w:tcW w:w="533" w:type="dxa"/>
             <w:tcBorders>
               <w:top w:val="single" w:sz="12" w:space="0" w:color="000000"/>
               <w:left w:val="single" w:sz="6" w:space="0" w:color="000000"/>
@@ -9366,7 +9463,7 @@
         </w:tc>
         <w:tc>
           <w:tcPr>
-            <w:tcW w:w="1003" w:type="dxa"/>
+            <w:tcW w:w="1002" w:type="dxa"/>
             <w:tcBorders>
               <w:top w:val="nil"/>
               <w:left w:val="nil"/>
@@ -9442,7 +9539,7 @@
         </w:tc>
         <w:tc>
           <w:tcPr>
-            <w:tcW w:w="1078" w:type="dxa"/>
+            <w:tcW w:w="1079" w:type="dxa"/>
             <w:tcBorders>
               <w:top w:val="single" w:sz="12" w:space="0" w:color="000000"/>
               <w:left w:val="single" w:sz="8" w:space="0" w:color="000000"/>
@@ -9481,7 +9578,7 @@
         </w:tc>
         <w:tc>
           <w:tcPr>
-            <w:tcW w:w="534" w:type="dxa"/>
+            <w:tcW w:w="533" w:type="dxa"/>
             <w:tcBorders>
               <w:top w:val="single" w:sz="12" w:space="0" w:color="000000"/>
               <w:left w:val="single" w:sz="8" w:space="0" w:color="000000"/>
@@ -9634,7 +9731,7 @@
         </w:tc>
         <w:tc>
           <w:tcPr>
-            <w:tcW w:w="1003" w:type="dxa"/>
+            <w:tcW w:w="1002" w:type="dxa"/>
             <w:tcBorders>
               <w:top w:val="nil"/>
               <w:left w:val="nil"/>
@@ -9710,7 +9807,7 @@
         </w:tc>
         <w:tc>
           <w:tcPr>
-            <w:tcW w:w="1078" w:type="dxa"/>
+            <w:tcW w:w="1079" w:type="dxa"/>
             <w:tcBorders>
               <w:top w:val="single" w:sz="8" w:space="0" w:color="000000"/>
               <w:left w:val="single" w:sz="8" w:space="0" w:color="000000"/>
@@ -9749,7 +9846,7 @@
         </w:tc>
         <w:tc>
           <w:tcPr>
-            <w:tcW w:w="534" w:type="dxa"/>
+            <w:tcW w:w="533" w:type="dxa"/>
             <w:tcBorders>
               <w:top w:val="single" w:sz="8" w:space="0" w:color="000000"/>
               <w:left w:val="single" w:sz="8" w:space="0" w:color="000000"/>
@@ -9902,7 +9999,7 @@
         </w:tc>
         <w:tc>
           <w:tcPr>
-            <w:tcW w:w="1003" w:type="dxa"/>
+            <w:tcW w:w="1002" w:type="dxa"/>
             <w:tcBorders>
               <w:top w:val="single" w:sz="8" w:space="0" w:color="000000"/>
               <w:left w:val="nil"/>
@@ -9978,7 +10075,7 @@
         </w:tc>
         <w:tc>
           <w:tcPr>
-            <w:tcW w:w="1078" w:type="dxa"/>
+            <w:tcW w:w="1079" w:type="dxa"/>
             <w:tcBorders>
               <w:top w:val="single" w:sz="8" w:space="0" w:color="000000"/>
               <w:left w:val="single" w:sz="8" w:space="0" w:color="000000"/>
@@ -10017,7 +10114,7 @@
         </w:tc>
         <w:tc>
           <w:tcPr>
-            <w:tcW w:w="534" w:type="dxa"/>
+            <w:tcW w:w="533" w:type="dxa"/>
             <w:tcBorders>
               <w:top w:val="single" w:sz="8" w:space="0" w:color="000000"/>
               <w:left w:val="single" w:sz="8" w:space="0" w:color="000000"/>
@@ -10170,7 +10267,7 @@
         </w:tc>
         <w:tc>
           <w:tcPr>
-            <w:tcW w:w="1003" w:type="dxa"/>
+            <w:tcW w:w="1002" w:type="dxa"/>
             <w:tcBorders>
               <w:top w:val="single" w:sz="8" w:space="0" w:color="000000"/>
               <w:left w:val="nil"/>
@@ -10246,7 +10343,7 @@
         </w:tc>
         <w:tc>
           <w:tcPr>
-            <w:tcW w:w="1078" w:type="dxa"/>
+            <w:tcW w:w="1079" w:type="dxa"/>
             <w:tcBorders>
               <w:top w:val="single" w:sz="8" w:space="0" w:color="000000"/>
               <w:left w:val="single" w:sz="8" w:space="0" w:color="000000"/>
@@ -10285,7 +10382,7 @@
         </w:tc>
         <w:tc>
           <w:tcPr>
-            <w:tcW w:w="534" w:type="dxa"/>
+            <w:tcW w:w="533" w:type="dxa"/>
             <w:tcBorders>
               <w:top w:val="single" w:sz="8" w:space="0" w:color="000000"/>
               <w:left w:val="single" w:sz="8" w:space="0" w:color="000000"/>
@@ -10438,7 +10535,7 @@
         </w:tc>
         <w:tc>
           <w:tcPr>
-            <w:tcW w:w="1003" w:type="dxa"/>
+            <w:tcW w:w="1002" w:type="dxa"/>
             <w:tcBorders>
               <w:top w:val="nil"/>
               <w:left w:val="nil"/>
@@ -10514,7 +10611,7 @@
         </w:tc>
         <w:tc>
           <w:tcPr>
-            <w:tcW w:w="1078" w:type="dxa"/>
+            <w:tcW w:w="1079" w:type="dxa"/>
             <w:tcBorders>
               <w:top w:val="single" w:sz="8" w:space="0" w:color="000000"/>
               <w:left w:val="single" w:sz="8" w:space="0" w:color="000000"/>
@@ -10553,7 +10650,7 @@
         </w:tc>
         <w:tc>
           <w:tcPr>
-            <w:tcW w:w="534" w:type="dxa"/>
+            <w:tcW w:w="533" w:type="dxa"/>
             <w:tcBorders>
               <w:top w:val="single" w:sz="8" w:space="0" w:color="000000"/>
               <w:left w:val="single" w:sz="8" w:space="0" w:color="000000"/>
@@ -10708,7 +10805,7 @@
         </w:tc>
         <w:tc>
           <w:tcPr>
-            <w:tcW w:w="1003" w:type="dxa"/>
+            <w:tcW w:w="1002" w:type="dxa"/>
             <w:tcBorders>
               <w:top w:val="nil"/>
               <w:left w:val="nil"/>
@@ -10784,7 +10881,7 @@
         </w:tc>
         <w:tc>
           <w:tcPr>
-            <w:tcW w:w="1078" w:type="dxa"/>
+            <w:tcW w:w="1079" w:type="dxa"/>
             <w:tcBorders>
               <w:top w:val="single" w:sz="8" w:space="0" w:color="000000"/>
               <w:left w:val="single" w:sz="8" w:space="0" w:color="000000"/>
@@ -10823,7 +10920,7 @@
         </w:tc>
         <w:tc>
           <w:tcPr>
-            <w:tcW w:w="534" w:type="dxa"/>
+            <w:tcW w:w="533" w:type="dxa"/>
             <w:tcBorders>
               <w:top w:val="single" w:sz="8" w:space="0" w:color="000000"/>
               <w:left w:val="single" w:sz="8" w:space="0" w:color="000000"/>
@@ -10976,7 +11073,7 @@
         </w:tc>
         <w:tc>
           <w:tcPr>
-            <w:tcW w:w="1003" w:type="dxa"/>
+            <w:tcW w:w="1002" w:type="dxa"/>
             <w:tcBorders>
               <w:top w:val="nil"/>
               <w:left w:val="nil"/>
@@ -11051,7 +11148,7 @@
         </w:tc>
         <w:tc>
           <w:tcPr>
-            <w:tcW w:w="1078" w:type="dxa"/>
+            <w:tcW w:w="1079" w:type="dxa"/>
             <w:tcBorders>
               <w:top w:val="single" w:sz="8" w:space="0" w:color="000000"/>
               <w:left w:val="single" w:sz="8" w:space="0" w:color="000000"/>
@@ -11090,7 +11187,7 @@
         </w:tc>
         <w:tc>
           <w:tcPr>
-            <w:tcW w:w="534" w:type="dxa"/>
+            <w:tcW w:w="533" w:type="dxa"/>
             <w:tcBorders>
               <w:top w:val="single" w:sz="8" w:space="0" w:color="000000"/>
               <w:left w:val="single" w:sz="8" w:space="0" w:color="000000"/>
@@ -11243,7 +11340,7 @@
         </w:tc>
         <w:tc>
           <w:tcPr>
-            <w:tcW w:w="1003" w:type="dxa"/>
+            <w:tcW w:w="1002" w:type="dxa"/>
             <w:tcBorders>
               <w:top w:val="nil"/>
               <w:left w:val="nil"/>
@@ -11319,7 +11416,7 @@
         </w:tc>
         <w:tc>
           <w:tcPr>
-            <w:tcW w:w="1078" w:type="dxa"/>
+            <w:tcW w:w="1079" w:type="dxa"/>
             <w:tcBorders>
               <w:top w:val="single" w:sz="8" w:space="0" w:color="000000"/>
               <w:left w:val="single" w:sz="8" w:space="0" w:color="000000"/>
@@ -11358,7 +11455,7 @@
         </w:tc>
         <w:tc>
           <w:tcPr>
-            <w:tcW w:w="534" w:type="dxa"/>
+            <w:tcW w:w="533" w:type="dxa"/>
             <w:tcBorders>
               <w:top w:val="single" w:sz="8" w:space="0" w:color="000000"/>
               <w:left w:val="single" w:sz="8" w:space="0" w:color="000000"/>
@@ -11513,7 +11610,7 @@
         </w:tc>
         <w:tc>
           <w:tcPr>
-            <w:tcW w:w="1003" w:type="dxa"/>
+            <w:tcW w:w="1002" w:type="dxa"/>
             <w:tcBorders>
               <w:top w:val="nil"/>
               <w:left w:val="nil"/>
@@ -11589,7 +11686,7 @@
         </w:tc>
         <w:tc>
           <w:tcPr>
-            <w:tcW w:w="1078" w:type="dxa"/>
+            <w:tcW w:w="1079" w:type="dxa"/>
             <w:tcBorders>
               <w:top w:val="single" w:sz="8" w:space="0" w:color="000000"/>
               <w:left w:val="single" w:sz="8" w:space="0" w:color="000000"/>
@@ -11628,7 +11725,7 @@
         </w:tc>
         <w:tc>
           <w:tcPr>
-            <w:tcW w:w="534" w:type="dxa"/>
+            <w:tcW w:w="533" w:type="dxa"/>
             <w:tcBorders>
               <w:top w:val="single" w:sz="8" w:space="0" w:color="000000"/>
               <w:left w:val="single" w:sz="8" w:space="0" w:color="000000"/>
@@ -11727,24 +11824,55 @@
         <w:pStyle w:val="Normal"/>
         <w:widowControl w:val="false"/>
         <w:spacing w:before="0" w:after="0"/>
-        <w:ind w:hanging="0"/>
+        <w:ind w:left="0" w:right="0" w:hanging="0"/>
         <w:rPr>
-          <w:rFonts w:cs="Arial"/>
           <w:b/>
           <w:b/>
-          <w:sz w:val="22"/>
-          <w:szCs w:val="22"/>
-          <w:lang w:val="es-ES"/>
         </w:rPr>
       </w:pPr>
       <w:r>
         <w:rPr>
-          <w:rFonts w:cs="Arial"/>
           <w:b/>
-          <w:sz w:val="22"/>
-          <w:szCs w:val="22"/>
-          <w:lang w:val="es-ES"/>
         </w:rPr>
+        <w:t>{{na</w:t>
+      </w:r>
+      <w:r>
+        <w:rPr>
+          <w:b/>
+        </w:rPr>
+        <w:t>4</w:t>
+      </w:r>
+      <w:r>
+        <w:rPr>
+          <w:b/>
+        </w:rPr>
+        <w:t xml:space="preserve">-2}}          </w:t>
+        <w:tab/>
+      </w:r>
+    </w:p>
+    <w:p>
+      <w:pPr>
+        <w:pStyle w:val="Normal"/>
+        <w:widowControl w:val="false"/>
+        <w:spacing w:before="0" w:after="0"/>
+        <w:ind w:left="0" w:right="0" w:hanging="0"/>
+        <w:rPr>
+          <w:b/>
+          <w:b/>
+        </w:rPr>
+      </w:pPr>
+      <w:r>
+        <w:rPr/>
+        <w:tab/>
+        <w:t>{{na</w:t>
+      </w:r>
+      <w:r>
+        <w:rPr/>
+        <w:t>5</w:t>
+      </w:r>
+      <w:r>
+        <w:rPr/>
+        <w:t>-1}}</w:t>
       </w:r>
     </w:p>
     <w:p>
@@ -11811,12 +11939,12 @@
       </w:tblPr>
       <w:tblGrid>
         <w:gridCol w:w="1350"/>
-        <w:gridCol w:w="2691"/>
+        <w:gridCol w:w="2690"/>
         <w:gridCol w:w="1003"/>
-        <w:gridCol w:w="1078"/>
+        <w:gridCol w:w="1079"/>
         <w:gridCol w:w="1078"/>
         <w:gridCol w:w="534"/>
-        <w:gridCol w:w="2715"/>
+        <w:gridCol w:w="2714"/>
       </w:tblGrid>
       <w:tr>
         <w:trPr>
@@ -11826,7 +11954,7 @@
         </w:trPr>
         <w:tc>
           <w:tcPr>
-            <w:tcW w:w="5044" w:type="dxa"/>
+            <w:tcW w:w="5043" w:type="dxa"/>
             <w:gridSpan w:val="3"/>
             <w:tcBorders>
               <w:top w:val="single" w:sz="12" w:space="0" w:color="000000"/>
@@ -11868,7 +11996,7 @@
         </w:tc>
         <w:tc>
           <w:tcPr>
-            <w:tcW w:w="1078" w:type="dxa"/>
+            <w:tcW w:w="1079" w:type="dxa"/>
             <w:tcBorders>
               <w:top w:val="single" w:sz="12" w:space="0" w:color="000000"/>
               <w:left w:val="single" w:sz="6" w:space="0" w:color="000000"/>
@@ -11984,7 +12112,7 @@
         </w:tc>
         <w:tc>
           <w:tcPr>
-            <w:tcW w:w="2715" w:type="dxa"/>
+            <w:tcW w:w="2714" w:type="dxa"/>
             <w:tcBorders>
               <w:top w:val="nil"/>
               <w:left w:val="nil"/>
@@ -12066,7 +12194,7 @@
         </w:tc>
         <w:tc>
           <w:tcPr>
-            <w:tcW w:w="2691" w:type="dxa"/>
+            <w:tcW w:w="2690" w:type="dxa"/>
             <w:tcBorders>
               <w:top w:val="single" w:sz="12" w:space="0" w:color="000000"/>
               <w:left w:val="single" w:sz="6" w:space="0" w:color="000000"/>
@@ -12146,7 +12274,7 @@
         </w:tc>
         <w:tc>
           <w:tcPr>
-            <w:tcW w:w="1078" w:type="dxa"/>
+            <w:tcW w:w="1079" w:type="dxa"/>
             <w:tcBorders>
               <w:top w:val="single" w:sz="12" w:space="0" w:color="000000"/>
               <w:left w:val="single" w:sz="6" w:space="0" w:color="000000"/>
@@ -12269,7 +12397,7 @@
         </w:tc>
         <w:tc>
           <w:tcPr>
-            <w:tcW w:w="2715" w:type="dxa"/>
+            <w:tcW w:w="2714" w:type="dxa"/>
             <w:tcBorders>
               <w:top w:val="single" w:sz="12" w:space="0" w:color="000000"/>
               <w:left w:val="single" w:sz="6" w:space="0" w:color="000000"/>
@@ -12354,7 +12482,7 @@
         </w:tc>
         <w:tc>
           <w:tcPr>
-            <w:tcW w:w="2691" w:type="dxa"/>
+            <w:tcW w:w="2690" w:type="dxa"/>
             <w:tcBorders>
               <w:top w:val="nil"/>
               <w:left w:val="nil"/>
@@ -12430,7 +12558,7 @@
         </w:tc>
         <w:tc>
           <w:tcPr>
-            <w:tcW w:w="1078" w:type="dxa"/>
+            <w:tcW w:w="1079" w:type="dxa"/>
             <w:tcBorders>
               <w:top w:val="single" w:sz="12" w:space="0" w:color="000000"/>
               <w:left w:val="single" w:sz="6" w:space="0" w:color="000000"/>
@@ -12541,7 +12669,7 @@
         </w:tc>
         <w:tc>
           <w:tcPr>
-            <w:tcW w:w="2715" w:type="dxa"/>
+            <w:tcW w:w="2714" w:type="dxa"/>
             <w:tcBorders>
               <w:top w:val="single" w:sz="12" w:space="0" w:color="000000"/>
               <w:left w:val="single" w:sz="8" w:space="0" w:color="000000"/>
@@ -12622,7 +12750,7 @@
         </w:tc>
         <w:tc>
           <w:tcPr>
-            <w:tcW w:w="2691" w:type="dxa"/>
+            <w:tcW w:w="2690" w:type="dxa"/>
             <w:tcBorders>
               <w:top w:val="single" w:sz="8" w:space="0" w:color="000000"/>
               <w:left w:val="single" w:sz="8" w:space="0" w:color="2B4F60"/>
@@ -12698,7 +12826,7 @@
         </w:tc>
         <w:tc>
           <w:tcPr>
-            <w:tcW w:w="1078" w:type="dxa"/>
+            <w:tcW w:w="1079" w:type="dxa"/>
             <w:tcBorders>
               <w:top w:val="single" w:sz="8" w:space="0" w:color="000000"/>
               <w:left w:val="single" w:sz="6" w:space="0" w:color="000000"/>
@@ -12809,7 +12937,7 @@
         </w:tc>
         <w:tc>
           <w:tcPr>
-            <w:tcW w:w="2715" w:type="dxa"/>
+            <w:tcW w:w="2714" w:type="dxa"/>
             <w:tcBorders>
               <w:top w:val="single" w:sz="8" w:space="0" w:color="000000"/>
               <w:left w:val="single" w:sz="8" w:space="0" w:color="000000"/>
@@ -12890,7 +13018,7 @@
         </w:tc>
         <w:tc>
           <w:tcPr>
-            <w:tcW w:w="2691" w:type="dxa"/>
+            <w:tcW w:w="2690" w:type="dxa"/>
             <w:tcBorders>
               <w:top w:val="single" w:sz="8" w:space="0" w:color="000000"/>
               <w:left w:val="nil"/>
@@ -12966,7 +13094,7 @@
         </w:tc>
         <w:tc>
           <w:tcPr>
-            <w:tcW w:w="1078" w:type="dxa"/>
+            <w:tcW w:w="1079" w:type="dxa"/>
             <w:tcBorders>
               <w:top w:val="single" w:sz="8" w:space="0" w:color="000000"/>
               <w:left w:val="single" w:sz="6" w:space="0" w:color="000000"/>
@@ -13078,7 +13206,7 @@
         </w:tc>
         <w:tc>
           <w:tcPr>
-            <w:tcW w:w="2715" w:type="dxa"/>
+            <w:tcW w:w="2714" w:type="dxa"/>
             <w:tcBorders>
               <w:top w:val="single" w:sz="8" w:space="0" w:color="000000"/>
               <w:left w:val="single" w:sz="8" w:space="0" w:color="000000"/>
@@ -13159,7 +13287,7 @@
         </w:tc>
         <w:tc>
           <w:tcPr>
-            <w:tcW w:w="2691" w:type="dxa"/>
+            <w:tcW w:w="2690" w:type="dxa"/>
             <w:tcBorders>
               <w:top w:val="nil"/>
               <w:left w:val="nil"/>
@@ -13235,7 +13363,7 @@
         </w:tc>
         <w:tc>
           <w:tcPr>
-            <w:tcW w:w="1078" w:type="dxa"/>
+            <w:tcW w:w="1079" w:type="dxa"/>
             <w:tcBorders>
               <w:top w:val="single" w:sz="8" w:space="0" w:color="000000"/>
               <w:left w:val="single" w:sz="6" w:space="0" w:color="000000"/>
@@ -13346,7 +13474,7 @@
         </w:tc>
         <w:tc>
           <w:tcPr>
-            <w:tcW w:w="2715" w:type="dxa"/>
+            <w:tcW w:w="2714" w:type="dxa"/>
             <w:tcBorders>
               <w:top w:val="single" w:sz="8" w:space="0" w:color="000000"/>
               <w:left w:val="single" w:sz="8" w:space="0" w:color="000000"/>
@@ -13427,7 +13555,7 @@
         </w:tc>
         <w:tc>
           <w:tcPr>
-            <w:tcW w:w="2691" w:type="dxa"/>
+            <w:tcW w:w="2690" w:type="dxa"/>
             <w:tcBorders>
               <w:top w:val="single" w:sz="8" w:space="0" w:color="000000"/>
               <w:left w:val="nil"/>
@@ -13503,7 +13631,7 @@
         </w:tc>
         <w:tc>
           <w:tcPr>
-            <w:tcW w:w="1078" w:type="dxa"/>
+            <w:tcW w:w="1079" w:type="dxa"/>
             <w:tcBorders>
               <w:top w:val="single" w:sz="8" w:space="0" w:color="000000"/>
               <w:left w:val="single" w:sz="6" w:space="0" w:color="000000"/>
@@ -13615,7 +13743,7 @@
         </w:tc>
         <w:tc>
           <w:tcPr>
-            <w:tcW w:w="2715" w:type="dxa"/>
+            <w:tcW w:w="2714" w:type="dxa"/>
             <w:tcBorders>
               <w:top w:val="single" w:sz="8" w:space="0" w:color="000000"/>
               <w:left w:val="single" w:sz="8" w:space="0" w:color="000000"/>
@@ -13677,20 +13805,55 @@
         <w:pStyle w:val="Normal"/>
         <w:widowControl w:val="false"/>
         <w:spacing w:before="0" w:after="0"/>
-        <w:ind w:hanging="0"/>
+        <w:ind w:left="0" w:right="0" w:hanging="0"/>
         <w:rPr>
-          <w:rFonts w:cs="Arial"/>
           <w:b/>
           <w:b/>
-          <w:lang w:val="es-ES"/>
         </w:rPr>
       </w:pPr>
       <w:r>
         <w:rPr>
-          <w:rFonts w:cs="Arial"/>
           <w:b/>
-          <w:lang w:val="es-ES"/>
         </w:rPr>
+        <w:t>{{na</w:t>
+      </w:r>
+      <w:r>
+        <w:rPr>
+          <w:b/>
+        </w:rPr>
+        <w:t>5</w:t>
+      </w:r>
+      <w:r>
+        <w:rPr>
+          <w:b/>
+        </w:rPr>
+        <w:t xml:space="preserve">-2}}          </w:t>
+        <w:tab/>
+      </w:r>
+    </w:p>
+    <w:p>
+      <w:pPr>
+        <w:pStyle w:val="Normal"/>
+        <w:widowControl w:val="false"/>
+        <w:spacing w:before="0" w:after="0"/>
+        <w:ind w:left="0" w:right="0" w:hanging="0"/>
+        <w:rPr>
+          <w:b/>
+          <w:b/>
+        </w:rPr>
+      </w:pPr>
+      <w:r>
+        <w:rPr/>
+        <w:tab/>
+        <w:t>{{na</w:t>
+      </w:r>
+      <w:r>
+        <w:rPr/>
+        <w:t>6</w:t>
+      </w:r>
+      <w:r>
+        <w:rPr/>
+        <w:t>-1}}</w:t>
       </w:r>
     </w:p>
     <w:p>
@@ -13757,12 +13920,12 @@
       </w:tblPr>
       <w:tblGrid>
         <w:gridCol w:w="1313"/>
-        <w:gridCol w:w="2690"/>
+        <w:gridCol w:w="2689"/>
         <w:gridCol w:w="1003"/>
         <w:gridCol w:w="1078"/>
-        <w:gridCol w:w="1079"/>
+        <w:gridCol w:w="1080"/>
         <w:gridCol w:w="534"/>
-        <w:gridCol w:w="2719"/>
+        <w:gridCol w:w="2718"/>
       </w:tblGrid>
       <w:tr>
         <w:trPr>
@@ -13772,7 +13935,7 @@
         </w:trPr>
         <w:tc>
           <w:tcPr>
-            <w:tcW w:w="5006" w:type="dxa"/>
+            <w:tcW w:w="5005" w:type="dxa"/>
             <w:gridSpan w:val="3"/>
             <w:tcBorders>
               <w:top w:val="single" w:sz="12" w:space="0" w:color="000000"/>
@@ -13854,7 +14017,7 @@
         </w:tc>
         <w:tc>
           <w:tcPr>
-            <w:tcW w:w="1079" w:type="dxa"/>
+            <w:tcW w:w="1080" w:type="dxa"/>
             <w:tcBorders>
               <w:top w:val="single" w:sz="12" w:space="0" w:color="000000"/>
               <w:left w:val="single" w:sz="6" w:space="0" w:color="000000"/>
@@ -13930,7 +14093,7 @@
         </w:tc>
         <w:tc>
           <w:tcPr>
-            <w:tcW w:w="2719" w:type="dxa"/>
+            <w:tcW w:w="2718" w:type="dxa"/>
             <w:tcBorders>
               <w:top w:val="nil"/>
               <w:left w:val="nil"/>
@@ -14012,7 +14175,7 @@
         </w:tc>
         <w:tc>
           <w:tcPr>
-            <w:tcW w:w="2690" w:type="dxa"/>
+            <w:tcW w:w="2689" w:type="dxa"/>
             <w:tcBorders>
               <w:top w:val="single" w:sz="12" w:space="0" w:color="000000"/>
               <w:left w:val="single" w:sz="6" w:space="0" w:color="000000"/>
@@ -14133,7 +14296,7 @@
         </w:tc>
         <w:tc>
           <w:tcPr>
-            <w:tcW w:w="1079" w:type="dxa"/>
+            <w:tcW w:w="1080" w:type="dxa"/>
             <w:tcBorders>
               <w:top w:val="single" w:sz="12" w:space="0" w:color="000000"/>
               <w:left w:val="single" w:sz="6" w:space="0" w:color="000000"/>
@@ -14215,7 +14378,7 @@
         </w:tc>
         <w:tc>
           <w:tcPr>
-            <w:tcW w:w="2719" w:type="dxa"/>
+            <w:tcW w:w="2718" w:type="dxa"/>
             <w:tcBorders>
               <w:top w:val="single" w:sz="12" w:space="0" w:color="000000"/>
               <w:left w:val="single" w:sz="6" w:space="0" w:color="000000"/>
@@ -14300,7 +14463,7 @@
         </w:tc>
         <w:tc>
           <w:tcPr>
-            <w:tcW w:w="2690" w:type="dxa"/>
+            <w:tcW w:w="2689" w:type="dxa"/>
             <w:tcBorders>
               <w:top w:val="nil"/>
               <w:left w:val="nil"/>
@@ -14415,7 +14578,7 @@
         </w:tc>
         <w:tc>
           <w:tcPr>
-            <w:tcW w:w="1079" w:type="dxa"/>
+            <w:tcW w:w="1080" w:type="dxa"/>
             <w:tcBorders>
               <w:top w:val="single" w:sz="12" w:space="0" w:color="000000"/>
               <w:left w:val="single" w:sz="8" w:space="0" w:color="000000"/>
@@ -14487,7 +14650,7 @@
         </w:tc>
         <w:tc>
           <w:tcPr>
-            <w:tcW w:w="2719" w:type="dxa"/>
+            <w:tcW w:w="2718" w:type="dxa"/>
             <w:tcBorders>
               <w:top w:val="single" w:sz="12" w:space="0" w:color="000000"/>
               <w:left w:val="single" w:sz="8" w:space="0" w:color="000000"/>
@@ -14568,7 +14731,7 @@
         </w:tc>
         <w:tc>
           <w:tcPr>
-            <w:tcW w:w="2690" w:type="dxa"/>
+            <w:tcW w:w="2689" w:type="dxa"/>
             <w:tcBorders>
               <w:top w:val="single" w:sz="8" w:space="0" w:color="000000"/>
               <w:left w:val="single" w:sz="8" w:space="0" w:color="2B4F60"/>
@@ -14683,7 +14846,7 @@
         </w:tc>
         <w:tc>
           <w:tcPr>
-            <w:tcW w:w="1079" w:type="dxa"/>
+            <w:tcW w:w="1080" w:type="dxa"/>
             <w:tcBorders>
               <w:top w:val="single" w:sz="8" w:space="0" w:color="000000"/>
               <w:left w:val="single" w:sz="8" w:space="0" w:color="000000"/>
@@ -14756,7 +14919,7 @@
         </w:tc>
         <w:tc>
           <w:tcPr>
-            <w:tcW w:w="2719" w:type="dxa"/>
+            <w:tcW w:w="2718" w:type="dxa"/>
             <w:tcBorders>
               <w:top w:val="single" w:sz="8" w:space="0" w:color="000000"/>
               <w:left w:val="single" w:sz="8" w:space="0" w:color="000000"/>
@@ -14837,7 +15000,7 @@
         </w:tc>
         <w:tc>
           <w:tcPr>
-            <w:tcW w:w="2690" w:type="dxa"/>
+            <w:tcW w:w="2689" w:type="dxa"/>
             <w:tcBorders>
               <w:top w:val="single" w:sz="8" w:space="0" w:color="000000"/>
               <w:left w:val="nil"/>
@@ -14951,7 +15114,7 @@
         </w:tc>
         <w:tc>
           <w:tcPr>
-            <w:tcW w:w="1079" w:type="dxa"/>
+            <w:tcW w:w="1080" w:type="dxa"/>
             <w:tcBorders>
               <w:top w:val="single" w:sz="8" w:space="0" w:color="000000"/>
               <w:left w:val="single" w:sz="8" w:space="0" w:color="000000"/>
@@ -15024,7 +15187,7 @@
         </w:tc>
         <w:tc>
           <w:tcPr>
-            <w:tcW w:w="2719" w:type="dxa"/>
+            <w:tcW w:w="2718" w:type="dxa"/>
             <w:tcBorders>
               <w:top w:val="single" w:sz="8" w:space="0" w:color="000000"/>
               <w:left w:val="single" w:sz="8" w:space="0" w:color="000000"/>
@@ -15105,7 +15268,7 @@
         </w:tc>
         <w:tc>
           <w:tcPr>
-            <w:tcW w:w="2690" w:type="dxa"/>
+            <w:tcW w:w="2689" w:type="dxa"/>
             <w:tcBorders>
               <w:top w:val="nil"/>
               <w:left w:val="nil"/>
@@ -15220,7 +15383,7 @@
         </w:tc>
         <w:tc>
           <w:tcPr>
-            <w:tcW w:w="1079" w:type="dxa"/>
+            <w:tcW w:w="1080" w:type="dxa"/>
             <w:tcBorders>
               <w:top w:val="single" w:sz="8" w:space="0" w:color="000000"/>
               <w:left w:val="single" w:sz="8" w:space="0" w:color="000000"/>
@@ -15293,7 +15456,7 @@
         </w:tc>
         <w:tc>
           <w:tcPr>
-            <w:tcW w:w="2719" w:type="dxa"/>
+            <w:tcW w:w="2718" w:type="dxa"/>
             <w:tcBorders>
               <w:top w:val="single" w:sz="8" w:space="0" w:color="000000"/>
               <w:left w:val="single" w:sz="8" w:space="0" w:color="000000"/>
@@ -15374,7 +15537,7 @@
         </w:tc>
         <w:tc>
           <w:tcPr>
-            <w:tcW w:w="2690" w:type="dxa"/>
+            <w:tcW w:w="2689" w:type="dxa"/>
             <w:tcBorders>
               <w:top w:val="nil"/>
               <w:left w:val="nil"/>
@@ -15489,7 +15652,7 @@
         </w:tc>
         <w:tc>
           <w:tcPr>
-            <w:tcW w:w="1079" w:type="dxa"/>
+            <w:tcW w:w="1080" w:type="dxa"/>
             <w:tcBorders>
               <w:top w:val="single" w:sz="8" w:space="0" w:color="000000"/>
               <w:left w:val="single" w:sz="8" w:space="0" w:color="000000"/>
@@ -15562,7 +15725,7 @@
         </w:tc>
         <w:tc>
           <w:tcPr>
-            <w:tcW w:w="2719" w:type="dxa"/>
+            <w:tcW w:w="2718" w:type="dxa"/>
             <w:tcBorders>
               <w:top w:val="single" w:sz="8" w:space="0" w:color="000000"/>
               <w:left w:val="single" w:sz="8" w:space="0" w:color="000000"/>
@@ -15624,20 +15787,55 @@
         <w:pStyle w:val="Normal"/>
         <w:widowControl w:val="false"/>
         <w:spacing w:before="0" w:after="0"/>
-        <w:ind w:hanging="0"/>
+        <w:ind w:left="0" w:right="0" w:hanging="0"/>
         <w:rPr>
-          <w:rFonts w:cs="Arial"/>
           <w:b/>
           <w:b/>
-          <w:lang w:val="es-ES"/>
         </w:rPr>
       </w:pPr>
       <w:r>
         <w:rPr>
-          <w:rFonts w:cs="Arial"/>
           <w:b/>
-          <w:lang w:val="es-ES"/>
         </w:rPr>
+        <w:t>{{na</w:t>
+      </w:r>
+      <w:r>
+        <w:rPr>
+          <w:b/>
+        </w:rPr>
+        <w:t>6</w:t>
+      </w:r>
+      <w:r>
+        <w:rPr>
+          <w:b/>
+        </w:rPr>
+        <w:t xml:space="preserve">-2}}          </w:t>
+        <w:tab/>
+      </w:r>
+    </w:p>
+    <w:p>
+      <w:pPr>
+        <w:pStyle w:val="Normal"/>
+        <w:widowControl w:val="false"/>
+        <w:spacing w:before="0" w:after="0"/>
+        <w:ind w:left="0" w:right="0" w:hanging="0"/>
+        <w:rPr>
+          <w:b/>
+          <w:b/>
+        </w:rPr>
+      </w:pPr>
+      <w:r>
+        <w:rPr/>
+        <w:tab/>
+        <w:t>{{na</w:t>
+      </w:r>
+      <w:r>
+        <w:rPr/>
+        <w:t>7</w:t>
+      </w:r>
+      <w:r>
+        <w:rPr/>
+        <w:t>-1}}</w:t>
       </w:r>
     </w:p>
     <w:p>
@@ -15699,13 +15897,13 @@
         <w:tblLook w:val="0000" w:noHBand="0" w:noVBand="0" w:firstColumn="0" w:lastRow="0" w:lastColumn="0" w:firstRow="0"/>
       </w:tblPr>
       <w:tblGrid>
-        <w:gridCol w:w="1313"/>
-        <w:gridCol w:w="2690"/>
+        <w:gridCol w:w="1312"/>
+        <w:gridCol w:w="2691"/>
         <w:gridCol w:w="1003"/>
-        <w:gridCol w:w="1078"/>
+        <w:gridCol w:w="1077"/>
         <w:gridCol w:w="1088"/>
-        <w:gridCol w:w="544"/>
-        <w:gridCol w:w="2696"/>
+        <w:gridCol w:w="545"/>
+        <w:gridCol w:w="2695"/>
       </w:tblGrid>
       <w:tr>
         <w:trPr>
@@ -15757,7 +15955,7 @@
         </w:tc>
         <w:tc>
           <w:tcPr>
-            <w:tcW w:w="1078" w:type="dxa"/>
+            <w:tcW w:w="1077" w:type="dxa"/>
             <w:tcBorders>
               <w:top w:val="single" w:sz="12" w:space="0" w:color="000000"/>
               <w:left w:val="single" w:sz="6" w:space="0" w:color="000000"/>
@@ -15838,7 +16036,7 @@
         </w:tc>
         <w:tc>
           <w:tcPr>
-            <w:tcW w:w="544" w:type="dxa"/>
+            <w:tcW w:w="545" w:type="dxa"/>
             <w:tcBorders>
               <w:top w:val="nil"/>
               <w:left w:val="nil"/>
@@ -15873,7 +16071,7 @@
         </w:tc>
         <w:tc>
           <w:tcPr>
-            <w:tcW w:w="2696" w:type="dxa"/>
+            <w:tcW w:w="2695" w:type="dxa"/>
             <w:tcBorders>
               <w:top w:val="nil"/>
               <w:left w:val="nil"/>
@@ -15915,7 +16113,7 @@
         </w:trPr>
         <w:tc>
           <w:tcPr>
-            <w:tcW w:w="1313" w:type="dxa"/>
+            <w:tcW w:w="1312" w:type="dxa"/>
             <w:tcBorders>
               <w:top w:val="single" w:sz="12" w:space="0" w:color="000000"/>
               <w:left w:val="single" w:sz="12" w:space="0" w:color="000000"/>
@@ -15955,7 +16153,7 @@
         </w:tc>
         <w:tc>
           <w:tcPr>
-            <w:tcW w:w="2690" w:type="dxa"/>
+            <w:tcW w:w="2691" w:type="dxa"/>
             <w:tcBorders>
               <w:top w:val="single" w:sz="12" w:space="0" w:color="000000"/>
               <w:left w:val="single" w:sz="6" w:space="0" w:color="000000"/>
@@ -16035,7 +16233,7 @@
         </w:tc>
         <w:tc>
           <w:tcPr>
-            <w:tcW w:w="1078" w:type="dxa"/>
+            <w:tcW w:w="1077" w:type="dxa"/>
             <w:tcBorders>
               <w:top w:val="single" w:sz="12" w:space="0" w:color="000000"/>
               <w:left w:val="single" w:sz="6" w:space="0" w:color="000000"/>
@@ -16117,7 +16315,7 @@
         </w:tc>
         <w:tc>
           <w:tcPr>
-            <w:tcW w:w="544" w:type="dxa"/>
+            <w:tcW w:w="545" w:type="dxa"/>
             <w:tcBorders>
               <w:top w:val="single" w:sz="12" w:space="0" w:color="000000"/>
               <w:left w:val="single" w:sz="6" w:space="0" w:color="000000"/>
@@ -16158,7 +16356,7 @@
         </w:tc>
         <w:tc>
           <w:tcPr>
-            <w:tcW w:w="2696" w:type="dxa"/>
+            <w:tcW w:w="2695" w:type="dxa"/>
             <w:tcBorders>
               <w:top w:val="single" w:sz="12" w:space="0" w:color="000000"/>
               <w:left w:val="single" w:sz="6" w:space="0" w:color="000000"/>
@@ -16204,7 +16402,7 @@
         </w:trPr>
         <w:tc>
           <w:tcPr>
-            <w:tcW w:w="1313" w:type="dxa"/>
+            <w:tcW w:w="1312" w:type="dxa"/>
             <w:tcBorders>
               <w:top w:val="nil"/>
               <w:left w:val="single" w:sz="8" w:space="0" w:color="000000"/>
@@ -16243,7 +16441,7 @@
         </w:tc>
         <w:tc>
           <w:tcPr>
-            <w:tcW w:w="2690" w:type="dxa"/>
+            <w:tcW w:w="2691" w:type="dxa"/>
             <w:tcBorders>
               <w:top w:val="nil"/>
               <w:left w:val="nil"/>
@@ -16321,7 +16519,7 @@
         </w:tc>
         <w:tc>
           <w:tcPr>
-            <w:tcW w:w="1078" w:type="dxa"/>
+            <w:tcW w:w="1077" w:type="dxa"/>
             <w:tcBorders>
               <w:top w:val="single" w:sz="12" w:space="0" w:color="000000"/>
               <w:left w:val="single" w:sz="6" w:space="0" w:color="000000"/>
@@ -16399,7 +16597,7 @@
         </w:tc>
         <w:tc>
           <w:tcPr>
-            <w:tcW w:w="544" w:type="dxa"/>
+            <w:tcW w:w="545" w:type="dxa"/>
             <w:tcBorders>
               <w:top w:val="single" w:sz="12" w:space="0" w:color="000000"/>
               <w:left w:val="single" w:sz="8" w:space="0" w:color="000000"/>
@@ -16432,7 +16630,7 @@
         </w:tc>
         <w:tc>
           <w:tcPr>
-            <w:tcW w:w="2696" w:type="dxa"/>
+            <w:tcW w:w="2695" w:type="dxa"/>
             <w:tcBorders>
               <w:top w:val="single" w:sz="12" w:space="0" w:color="000000"/>
               <w:left w:val="single" w:sz="8" w:space="0" w:color="000000"/>
@@ -16474,7 +16672,7 @@
         </w:trPr>
         <w:tc>
           <w:tcPr>
-            <w:tcW w:w="1313" w:type="dxa"/>
+            <w:tcW w:w="1312" w:type="dxa"/>
             <w:tcBorders>
               <w:top w:val="nil"/>
               <w:left w:val="single" w:sz="8" w:space="0" w:color="000000"/>
@@ -16513,7 +16711,7 @@
         </w:tc>
         <w:tc>
           <w:tcPr>
-            <w:tcW w:w="2690" w:type="dxa"/>
+            <w:tcW w:w="2691" w:type="dxa"/>
             <w:tcBorders>
               <w:top w:val="nil"/>
               <w:left w:val="nil"/>
@@ -16591,7 +16789,7 @@
         </w:tc>
         <w:tc>
           <w:tcPr>
-            <w:tcW w:w="1078" w:type="dxa"/>
+            <w:tcW w:w="1077" w:type="dxa"/>
             <w:tcBorders>
               <w:top w:val="single" w:sz="8" w:space="0" w:color="000000"/>
               <w:left w:val="single" w:sz="6" w:space="0" w:color="000000"/>
@@ -16670,7 +16868,7 @@
         </w:tc>
         <w:tc>
           <w:tcPr>
-            <w:tcW w:w="544" w:type="dxa"/>
+            <w:tcW w:w="545" w:type="dxa"/>
             <w:tcBorders>
               <w:top w:val="single" w:sz="8" w:space="0" w:color="000000"/>
               <w:left w:val="single" w:sz="8" w:space="0" w:color="000000"/>
@@ -16703,7 +16901,7 @@
         </w:tc>
         <w:tc>
           <w:tcPr>
-            <w:tcW w:w="2696" w:type="dxa"/>
+            <w:tcW w:w="2695" w:type="dxa"/>
             <w:tcBorders>
               <w:top w:val="single" w:sz="8" w:space="0" w:color="000000"/>
               <w:left w:val="single" w:sz="8" w:space="0" w:color="000000"/>
@@ -16745,7 +16943,7 @@
         </w:trPr>
         <w:tc>
           <w:tcPr>
-            <w:tcW w:w="1313" w:type="dxa"/>
+            <w:tcW w:w="1312" w:type="dxa"/>
             <w:tcBorders>
               <w:top w:val="single" w:sz="8" w:space="0" w:color="000000"/>
               <w:left w:val="single" w:sz="8" w:space="0" w:color="000000"/>
@@ -16784,7 +16982,7 @@
         </w:tc>
         <w:tc>
           <w:tcPr>
-            <w:tcW w:w="2690" w:type="dxa"/>
+            <w:tcW w:w="2691" w:type="dxa"/>
             <w:tcBorders>
               <w:top w:val="single" w:sz="8" w:space="0" w:color="000000"/>
               <w:left w:val="single" w:sz="8" w:space="0" w:color="000000"/>
@@ -16862,7 +17060,7 @@
         </w:tc>
         <w:tc>
           <w:tcPr>
-            <w:tcW w:w="1078" w:type="dxa"/>
+            <w:tcW w:w="1077" w:type="dxa"/>
             <w:tcBorders>
               <w:top w:val="single" w:sz="8" w:space="0" w:color="000000"/>
               <w:left w:val="single" w:sz="6" w:space="0" w:color="000000"/>
@@ -16940,7 +17138,7 @@
         </w:tc>
         <w:tc>
           <w:tcPr>
-            <w:tcW w:w="544" w:type="dxa"/>
+            <w:tcW w:w="545" w:type="dxa"/>
             <w:tcBorders>
               <w:top w:val="single" w:sz="8" w:space="0" w:color="000000"/>
               <w:left w:val="single" w:sz="8" w:space="0" w:color="000000"/>
@@ -16973,7 +17171,7 @@
         </w:tc>
         <w:tc>
           <w:tcPr>
-            <w:tcW w:w="2696" w:type="dxa"/>
+            <w:tcW w:w="2695" w:type="dxa"/>
             <w:tcBorders>
               <w:top w:val="single" w:sz="8" w:space="0" w:color="000000"/>
               <w:left w:val="single" w:sz="8" w:space="0" w:color="000000"/>
@@ -17015,7 +17213,7 @@
         </w:trPr>
         <w:tc>
           <w:tcPr>
-            <w:tcW w:w="1313" w:type="dxa"/>
+            <w:tcW w:w="1312" w:type="dxa"/>
             <w:tcBorders>
               <w:top w:val="nil"/>
               <w:left w:val="single" w:sz="8" w:space="0" w:color="000000"/>
@@ -17100,7 +17298,7 @@
         </w:tc>
         <w:tc>
           <w:tcPr>
-            <w:tcW w:w="2690" w:type="dxa"/>
+            <w:tcW w:w="2691" w:type="dxa"/>
             <w:tcBorders>
               <w:top w:val="single" w:sz="8" w:space="0" w:color="000000"/>
               <w:left w:val="nil"/>
@@ -17270,7 +17468,7 @@
         </w:tc>
         <w:tc>
           <w:tcPr>
-            <w:tcW w:w="1078" w:type="dxa"/>
+            <w:tcW w:w="1077" w:type="dxa"/>
             <w:tcBorders>
               <w:top w:val="single" w:sz="8" w:space="0" w:color="000000"/>
               <w:left w:val="single" w:sz="6" w:space="0" w:color="000000"/>
@@ -17348,7 +17546,7 @@
         </w:tc>
         <w:tc>
           <w:tcPr>
-            <w:tcW w:w="544" w:type="dxa"/>
+            <w:tcW w:w="545" w:type="dxa"/>
             <w:tcBorders>
               <w:top w:val="single" w:sz="8" w:space="0" w:color="000000"/>
               <w:left w:val="single" w:sz="8" w:space="0" w:color="000000"/>
@@ -17381,7 +17579,7 @@
         </w:tc>
         <w:tc>
           <w:tcPr>
-            <w:tcW w:w="2696" w:type="dxa"/>
+            <w:tcW w:w="2695" w:type="dxa"/>
             <w:tcBorders>
               <w:top w:val="single" w:sz="8" w:space="0" w:color="000000"/>
               <w:left w:val="single" w:sz="8" w:space="0" w:color="000000"/>
@@ -17443,20 +17641,55 @@
         <w:pStyle w:val="Normal"/>
         <w:widowControl w:val="false"/>
         <w:spacing w:before="0" w:after="0"/>
-        <w:ind w:hanging="0"/>
+        <w:ind w:left="0" w:right="0" w:hanging="0"/>
         <w:rPr>
-          <w:rFonts w:cs="Arial"/>
           <w:b/>
           <w:b/>
-          <w:lang w:val="es-ES"/>
         </w:rPr>
       </w:pPr>
       <w:r>
         <w:rPr>
-          <w:rFonts w:cs="Arial"/>
           <w:b/>
-          <w:lang w:val="es-ES"/>
         </w:rPr>
+        <w:t>{{na</w:t>
+      </w:r>
+      <w:r>
+        <w:rPr>
+          <w:b/>
+        </w:rPr>
+        <w:t>7</w:t>
+      </w:r>
+      <w:r>
+        <w:rPr>
+          <w:b/>
+        </w:rPr>
+        <w:t xml:space="preserve">-2}}          </w:t>
+        <w:tab/>
+      </w:r>
+    </w:p>
+    <w:p>
+      <w:pPr>
+        <w:pStyle w:val="Normal"/>
+        <w:widowControl w:val="false"/>
+        <w:spacing w:before="0" w:after="0"/>
+        <w:ind w:left="0" w:right="0" w:hanging="0"/>
+        <w:rPr>
+          <w:b/>
+          <w:b/>
+        </w:rPr>
+      </w:pPr>
+      <w:r>
+        <w:rPr/>
+        <w:tab/>
+        <w:t>{{na</w:t>
+      </w:r>
+      <w:r>
+        <w:rPr/>
+        <w:t>8</w:t>
+      </w:r>
+      <w:r>
+        <w:rPr/>
+        <w:t>-1}}</w:t>
       </w:r>
     </w:p>
     <w:p>
@@ -17522,7 +17755,7 @@
         <w:tblLook w:val="0000" w:noHBand="0" w:noVBand="0" w:firstColumn="0" w:lastRow="0" w:lastColumn="0" w:firstRow="0"/>
       </w:tblPr>
       <w:tblGrid>
-        <w:gridCol w:w="1378"/>
+        <w:gridCol w:w="1377"/>
         <w:gridCol w:w="2691"/>
         <w:gridCol w:w="1003"/>
         <w:gridCol w:w="1078"/>
@@ -17538,7 +17771,7 @@
         </w:trPr>
         <w:tc>
           <w:tcPr>
-            <w:tcW w:w="5072" w:type="dxa"/>
+            <w:tcW w:w="5071" w:type="dxa"/>
             <w:gridSpan w:val="3"/>
             <w:tcBorders>
               <w:top w:val="single" w:sz="12" w:space="0" w:color="000000"/>
@@ -17738,7 +17971,7 @@
         </w:trPr>
         <w:tc>
           <w:tcPr>
-            <w:tcW w:w="1378" w:type="dxa"/>
+            <w:tcW w:w="1377" w:type="dxa"/>
             <w:tcBorders>
               <w:top w:val="single" w:sz="12" w:space="0" w:color="000000"/>
               <w:left w:val="single" w:sz="12" w:space="0" w:color="000000"/>
@@ -18027,7 +18260,7 @@
         </w:trPr>
         <w:tc>
           <w:tcPr>
-            <w:tcW w:w="1378" w:type="dxa"/>
+            <w:tcW w:w="1377" w:type="dxa"/>
             <w:tcBorders>
               <w:top w:val="nil"/>
               <w:left w:val="single" w:sz="8" w:space="0" w:color="000000"/>
@@ -18296,7 +18529,7 @@
         </w:trPr>
         <w:tc>
           <w:tcPr>
-            <w:tcW w:w="1378" w:type="dxa"/>
+            <w:tcW w:w="1377" w:type="dxa"/>
             <w:tcBorders>
               <w:top w:val="nil"/>
               <w:left w:val="single" w:sz="8" w:space="0" w:color="000000"/>
@@ -18565,7 +18798,7 @@
         </w:trPr>
         <w:tc>
           <w:tcPr>
-            <w:tcW w:w="1378" w:type="dxa"/>
+            <w:tcW w:w="1377" w:type="dxa"/>
             <w:tcBorders>
               <w:top w:val="single" w:sz="8" w:space="0" w:color="000000"/>
               <w:left w:val="single" w:sz="8" w:space="0" w:color="000000"/>
@@ -18834,7 +19067,7 @@
         </w:trPr>
         <w:tc>
           <w:tcPr>
-            <w:tcW w:w="1378" w:type="dxa"/>
+            <w:tcW w:w="1377" w:type="dxa"/>
             <w:tcBorders>
               <w:top w:val="single" w:sz="8" w:space="0" w:color="000000"/>
               <w:left w:val="single" w:sz="8" w:space="0" w:color="000000"/>
@@ -19103,7 +19336,7 @@
         </w:trPr>
         <w:tc>
           <w:tcPr>
-            <w:tcW w:w="1378" w:type="dxa"/>
+            <w:tcW w:w="1377" w:type="dxa"/>
             <w:tcBorders>
               <w:top w:val="nil"/>
               <w:left w:val="single" w:sz="8" w:space="0" w:color="000000"/>
@@ -19372,7 +19605,7 @@
         </w:trPr>
         <w:tc>
           <w:tcPr>
-            <w:tcW w:w="1378" w:type="dxa"/>
+            <w:tcW w:w="1377" w:type="dxa"/>
             <w:tcBorders>
               <w:top w:val="nil"/>
               <w:left w:val="single" w:sz="8" w:space="0" w:color="000000"/>
@@ -19640,7 +19873,7 @@
         </w:trPr>
         <w:tc>
           <w:tcPr>
-            <w:tcW w:w="1378" w:type="dxa"/>
+            <w:tcW w:w="1377" w:type="dxa"/>
             <w:tcBorders>
               <w:top w:val="nil"/>
               <w:left w:val="single" w:sz="8" w:space="0" w:color="000000"/>
@@ -19907,24 +20140,55 @@
         <w:pStyle w:val="Normal"/>
         <w:widowControl w:val="false"/>
         <w:spacing w:before="0" w:after="0"/>
-        <w:ind w:hanging="0"/>
+        <w:ind w:left="0" w:right="0" w:hanging="0"/>
         <w:rPr>
-          <w:rFonts w:cs="Arial"/>
           <w:b/>
           <w:b/>
-          <w:sz w:val="22"/>
-          <w:szCs w:val="22"/>
-          <w:lang w:val="es-ES"/>
         </w:rPr>
       </w:pPr>
       <w:r>
         <w:rPr>
-          <w:rFonts w:cs="Arial"/>
           <w:b/>
-          <w:sz w:val="22"/>
-          <w:szCs w:val="22"/>
-          <w:lang w:val="es-ES"/>
         </w:rPr>
+        <w:t>{{na</w:t>
+      </w:r>
+      <w:r>
+        <w:rPr>
+          <w:b/>
+        </w:rPr>
+        <w:t>8</w:t>
+      </w:r>
+      <w:r>
+        <w:rPr>
+          <w:b/>
+        </w:rPr>
+        <w:t xml:space="preserve">-2}}          </w:t>
+        <w:tab/>
+      </w:r>
+    </w:p>
+    <w:p>
+      <w:pPr>
+        <w:pStyle w:val="Normal"/>
+        <w:widowControl w:val="false"/>
+        <w:spacing w:before="0" w:after="0"/>
+        <w:ind w:left="0" w:right="0" w:hanging="0"/>
+        <w:rPr>
+          <w:b/>
+          <w:b/>
+        </w:rPr>
+      </w:pPr>
+      <w:r>
+        <w:rPr/>
+        <w:tab/>
+        <w:t>{{na</w:t>
+      </w:r>
+      <w:r>
+        <w:rPr/>
+        <w:t>11</w:t>
+      </w:r>
+      <w:r>
+        <w:rPr/>
+        <w:t>-1}}</w:t>
       </w:r>
     </w:p>
     <w:p>
@@ -20017,10 +20281,10 @@
       <w:tblGrid>
         <w:gridCol w:w="1059"/>
         <w:gridCol w:w="3057"/>
-        <w:gridCol w:w="900"/>
-        <w:gridCol w:w="1078"/>
+        <w:gridCol w:w="899"/>
+        <w:gridCol w:w="1079"/>
         <w:gridCol w:w="994"/>
-        <w:gridCol w:w="628"/>
+        <w:gridCol w:w="627"/>
         <w:gridCol w:w="2793"/>
       </w:tblGrid>
       <w:tr>
@@ -20031,7 +20295,7 @@
         </w:trPr>
         <w:tc>
           <w:tcPr>
-            <w:tcW w:w="5016" w:type="dxa"/>
+            <w:tcW w:w="5015" w:type="dxa"/>
             <w:gridSpan w:val="3"/>
             <w:tcBorders>
               <w:top w:val="single" w:sz="12" w:space="0" w:color="000000"/>
@@ -20073,7 +20337,7 @@
         </w:tc>
         <w:tc>
           <w:tcPr>
-            <w:tcW w:w="1078" w:type="dxa"/>
+            <w:tcW w:w="1079" w:type="dxa"/>
             <w:tcBorders>
               <w:top w:val="single" w:sz="12" w:space="0" w:color="000000"/>
               <w:left w:val="single" w:sz="6" w:space="0" w:color="000000"/>
@@ -20154,7 +20418,7 @@
         </w:tc>
         <w:tc>
           <w:tcPr>
-            <w:tcW w:w="628" w:type="dxa"/>
+            <w:tcW w:w="627" w:type="dxa"/>
             <w:tcBorders>
               <w:top w:val="nil"/>
               <w:left w:val="nil"/>
@@ -20311,7 +20575,7 @@
         </w:tc>
         <w:tc>
           <w:tcPr>
-            <w:tcW w:w="900" w:type="dxa"/>
+            <w:tcW w:w="899" w:type="dxa"/>
             <w:tcBorders>
               <w:top w:val="single" w:sz="12" w:space="0" w:color="000000"/>
               <w:left w:val="single" w:sz="6" w:space="0" w:color="000000"/>
@@ -20351,7 +20615,7 @@
         </w:tc>
         <w:tc>
           <w:tcPr>
-            <w:tcW w:w="1078" w:type="dxa"/>
+            <w:tcW w:w="1079" w:type="dxa"/>
             <w:tcBorders>
               <w:top w:val="single" w:sz="12" w:space="0" w:color="000000"/>
               <w:left w:val="single" w:sz="6" w:space="0" w:color="000000"/>
@@ -20433,7 +20697,7 @@
         </w:tc>
         <w:tc>
           <w:tcPr>
-            <w:tcW w:w="628" w:type="dxa"/>
+            <w:tcW w:w="627" w:type="dxa"/>
             <w:tcBorders>
               <w:top w:val="single" w:sz="12" w:space="0" w:color="000000"/>
               <w:left w:val="single" w:sz="6" w:space="0" w:color="000000"/>
@@ -20598,7 +20862,7 @@
         </w:tc>
         <w:tc>
           <w:tcPr>
-            <w:tcW w:w="900" w:type="dxa"/>
+            <w:tcW w:w="899" w:type="dxa"/>
             <w:tcBorders>
               <w:top w:val="nil"/>
               <w:left w:val="nil"/>
@@ -20637,7 +20901,7 @@
         </w:tc>
         <w:tc>
           <w:tcPr>
-            <w:tcW w:w="1078" w:type="dxa"/>
+            <w:tcW w:w="1079" w:type="dxa"/>
             <w:tcBorders>
               <w:top w:val="single" w:sz="12" w:space="0" w:color="000000"/>
               <w:left w:val="single" w:sz="6" w:space="0" w:color="000000"/>
@@ -20715,7 +20979,7 @@
         </w:tc>
         <w:tc>
           <w:tcPr>
-            <w:tcW w:w="628" w:type="dxa"/>
+            <w:tcW w:w="627" w:type="dxa"/>
             <w:tcBorders>
               <w:top w:val="single" w:sz="12" w:space="0" w:color="000000"/>
               <w:left w:val="single" w:sz="8" w:space="0" w:color="000000"/>
@@ -20919,7 +21183,7 @@
         </w:tc>
         <w:tc>
           <w:tcPr>
-            <w:tcW w:w="900" w:type="dxa"/>
+            <w:tcW w:w="899" w:type="dxa"/>
             <w:tcBorders>
               <w:top w:val="nil"/>
               <w:left w:val="nil"/>
@@ -20958,7 +21222,7 @@
         </w:tc>
         <w:tc>
           <w:tcPr>
-            <w:tcW w:w="1078" w:type="dxa"/>
+            <w:tcW w:w="1079" w:type="dxa"/>
             <w:tcBorders>
               <w:top w:val="single" w:sz="8" w:space="0" w:color="000000"/>
               <w:left w:val="single" w:sz="6" w:space="0" w:color="000000"/>
@@ -21036,7 +21300,7 @@
         </w:tc>
         <w:tc>
           <w:tcPr>
-            <w:tcW w:w="628" w:type="dxa"/>
+            <w:tcW w:w="627" w:type="dxa"/>
             <w:tcBorders>
               <w:top w:val="single" w:sz="8" w:space="0" w:color="000000"/>
               <w:left w:val="single" w:sz="8" w:space="0" w:color="000000"/>
@@ -21188,7 +21452,7 @@
         </w:tc>
         <w:tc>
           <w:tcPr>
-            <w:tcW w:w="900" w:type="dxa"/>
+            <w:tcW w:w="899" w:type="dxa"/>
             <w:tcBorders>
               <w:top w:val="nil"/>
               <w:left w:val="nil"/>
@@ -21227,7 +21491,7 @@
         </w:tc>
         <w:tc>
           <w:tcPr>
-            <w:tcW w:w="1078" w:type="dxa"/>
+            <w:tcW w:w="1079" w:type="dxa"/>
             <w:tcBorders>
               <w:top w:val="single" w:sz="8" w:space="0" w:color="000000"/>
               <w:left w:val="single" w:sz="6" w:space="0" w:color="000000"/>
@@ -21305,7 +21569,7 @@
         </w:tc>
         <w:tc>
           <w:tcPr>
-            <w:tcW w:w="628" w:type="dxa"/>
+            <w:tcW w:w="627" w:type="dxa"/>
             <w:tcBorders>
               <w:top w:val="single" w:sz="8" w:space="0" w:color="000000"/>
               <w:left w:val="single" w:sz="8" w:space="0" w:color="000000"/>
@@ -21458,7 +21722,7 @@
         </w:tc>
         <w:tc>
           <w:tcPr>
-            <w:tcW w:w="900" w:type="dxa"/>
+            <w:tcW w:w="899" w:type="dxa"/>
             <w:tcBorders>
               <w:top w:val="single" w:sz="8" w:space="0" w:color="000000"/>
               <w:left w:val="nil"/>
@@ -21497,7 +21761,7 @@
         </w:tc>
         <w:tc>
           <w:tcPr>
-            <w:tcW w:w="1078" w:type="dxa"/>
+            <w:tcW w:w="1079" w:type="dxa"/>
             <w:tcBorders>
               <w:top w:val="single" w:sz="8" w:space="0" w:color="000000"/>
               <w:left w:val="single" w:sz="6" w:space="0" w:color="000000"/>
@@ -21575,7 +21839,7 @@
         </w:tc>
         <w:tc>
           <w:tcPr>
-            <w:tcW w:w="628" w:type="dxa"/>
+            <w:tcW w:w="627" w:type="dxa"/>
             <w:tcBorders>
               <w:top w:val="single" w:sz="8" w:space="0" w:color="000000"/>
               <w:left w:val="single" w:sz="8" w:space="0" w:color="000000"/>
@@ -21728,7 +21992,7 @@
         </w:tc>
         <w:tc>
           <w:tcPr>
-            <w:tcW w:w="900" w:type="dxa"/>
+            <w:tcW w:w="899" w:type="dxa"/>
             <w:tcBorders>
               <w:top w:val="single" w:sz="8" w:space="0" w:color="000000"/>
               <w:left w:val="nil"/>
@@ -21767,7 +22031,7 @@
         </w:tc>
         <w:tc>
           <w:tcPr>
-            <w:tcW w:w="1078" w:type="dxa"/>
+            <w:tcW w:w="1079" w:type="dxa"/>
             <w:tcBorders>
               <w:top w:val="single" w:sz="8" w:space="0" w:color="000000"/>
               <w:left w:val="single" w:sz="6" w:space="0" w:color="000000"/>
@@ -21845,7 +22109,7 @@
         </w:tc>
         <w:tc>
           <w:tcPr>
-            <w:tcW w:w="628" w:type="dxa"/>
+            <w:tcW w:w="627" w:type="dxa"/>
             <w:tcBorders>
               <w:top w:val="single" w:sz="8" w:space="0" w:color="000000"/>
               <w:left w:val="single" w:sz="8" w:space="0" w:color="000000"/>
@@ -21944,20 +22208,55 @@
         <w:pStyle w:val="Normal"/>
         <w:widowControl w:val="false"/>
         <w:spacing w:before="0" w:after="0"/>
-        <w:ind w:hanging="0"/>
+        <w:ind w:left="0" w:right="0" w:hanging="0"/>
         <w:rPr>
-          <w:rFonts w:cs="Arial"/>
           <w:b/>
           <w:b/>
-          <w:lang w:val="es-ES"/>
         </w:rPr>
       </w:pPr>
       <w:r>
         <w:rPr>
-          <w:rFonts w:cs="Arial"/>
           <w:b/>
-          <w:lang w:val="es-ES"/>
         </w:rPr>
+        <w:t>{{na1</w:t>
+      </w:r>
+      <w:r>
+        <w:rPr>
+          <w:b/>
+        </w:rPr>
+        <w:t>1</w:t>
+      </w:r>
+      <w:r>
+        <w:rPr>
+          <w:b/>
+        </w:rPr>
+        <w:t xml:space="preserve">-2}}          </w:t>
+        <w:tab/>
+      </w:r>
+    </w:p>
+    <w:p>
+      <w:pPr>
+        <w:pStyle w:val="Normal"/>
+        <w:widowControl w:val="false"/>
+        <w:spacing w:before="0" w:after="0"/>
+        <w:ind w:left="0" w:right="0" w:hanging="0"/>
+        <w:rPr>
+          <w:b/>
+          <w:b/>
+        </w:rPr>
+      </w:pPr>
+      <w:r>
+        <w:rPr/>
+        <w:tab/>
+        <w:t>{{na</w:t>
+      </w:r>
+      <w:r>
+        <w:rPr/>
+        <w:t>1</w:t>
+      </w:r>
+      <w:r>
+        <w:rPr/>
+        <w:t>2-1}}</w:t>
       </w:r>
     </w:p>
     <w:p>
@@ -22025,10 +22324,10 @@
       <w:tblGrid>
         <w:gridCol w:w="1059"/>
         <w:gridCol w:w="3057"/>
-        <w:gridCol w:w="900"/>
-        <w:gridCol w:w="1078"/>
+        <w:gridCol w:w="899"/>
+        <w:gridCol w:w="1079"/>
         <w:gridCol w:w="994"/>
-        <w:gridCol w:w="628"/>
+        <w:gridCol w:w="627"/>
         <w:gridCol w:w="2793"/>
       </w:tblGrid>
       <w:tr>
@@ -22039,7 +22338,7 @@
         </w:trPr>
         <w:tc>
           <w:tcPr>
-            <w:tcW w:w="5016" w:type="dxa"/>
+            <w:tcW w:w="5015" w:type="dxa"/>
             <w:gridSpan w:val="3"/>
             <w:tcBorders>
               <w:top w:val="single" w:sz="12" w:space="0" w:color="000000"/>
@@ -22081,7 +22380,7 @@
         </w:tc>
         <w:tc>
           <w:tcPr>
-            <w:tcW w:w="1078" w:type="dxa"/>
+            <w:tcW w:w="1079" w:type="dxa"/>
             <w:tcBorders>
               <w:top w:val="single" w:sz="12" w:space="0" w:color="000000"/>
               <w:left w:val="single" w:sz="6" w:space="0" w:color="000000"/>
@@ -22162,7 +22461,7 @@
         </w:tc>
         <w:tc>
           <w:tcPr>
-            <w:tcW w:w="628" w:type="dxa"/>
+            <w:tcW w:w="627" w:type="dxa"/>
             <w:tcBorders>
               <w:top w:val="nil"/>
               <w:left w:val="nil"/>
@@ -22319,7 +22618,7 @@
         </w:tc>
         <w:tc>
           <w:tcPr>
-            <w:tcW w:w="900" w:type="dxa"/>
+            <w:tcW w:w="899" w:type="dxa"/>
             <w:tcBorders>
               <w:top w:val="single" w:sz="12" w:space="0" w:color="000000"/>
               <w:left w:val="single" w:sz="6" w:space="0" w:color="000000"/>
@@ -22359,7 +22658,7 @@
         </w:tc>
         <w:tc>
           <w:tcPr>
-            <w:tcW w:w="1078" w:type="dxa"/>
+            <w:tcW w:w="1079" w:type="dxa"/>
             <w:tcBorders>
               <w:top w:val="single" w:sz="12" w:space="0" w:color="000000"/>
               <w:left w:val="single" w:sz="6" w:space="0" w:color="000000"/>
@@ -22441,7 +22740,7 @@
         </w:tc>
         <w:tc>
           <w:tcPr>
-            <w:tcW w:w="628" w:type="dxa"/>
+            <w:tcW w:w="627" w:type="dxa"/>
             <w:tcBorders>
               <w:top w:val="single" w:sz="12" w:space="0" w:color="000000"/>
               <w:left w:val="single" w:sz="6" w:space="0" w:color="000000"/>
@@ -22606,7 +22905,7 @@
         </w:tc>
         <w:tc>
           <w:tcPr>
-            <w:tcW w:w="900" w:type="dxa"/>
+            <w:tcW w:w="899" w:type="dxa"/>
             <w:tcBorders>
               <w:top w:val="nil"/>
               <w:left w:val="nil"/>
@@ -22645,7 +22944,7 @@
         </w:tc>
         <w:tc>
           <w:tcPr>
-            <w:tcW w:w="1078" w:type="dxa"/>
+            <w:tcW w:w="1079" w:type="dxa"/>
             <w:tcBorders>
               <w:top w:val="single" w:sz="12" w:space="0" w:color="000000"/>
               <w:left w:val="single" w:sz="6" w:space="0" w:color="000000"/>
@@ -22723,7 +23022,7 @@
         </w:tc>
         <w:tc>
           <w:tcPr>
-            <w:tcW w:w="628" w:type="dxa"/>
+            <w:tcW w:w="627" w:type="dxa"/>
             <w:tcBorders>
               <w:top w:val="single" w:sz="12" w:space="0" w:color="000000"/>
               <w:left w:val="single" w:sz="8" w:space="0" w:color="000000"/>
@@ -22875,7 +23174,7 @@
         </w:tc>
         <w:tc>
           <w:tcPr>
-            <w:tcW w:w="900" w:type="dxa"/>
+            <w:tcW w:w="899" w:type="dxa"/>
             <w:tcBorders>
               <w:top w:val="nil"/>
               <w:left w:val="single" w:sz="8" w:space="0" w:color="000000"/>
@@ -22914,7 +23213,7 @@
         </w:tc>
         <w:tc>
           <w:tcPr>
-            <w:tcW w:w="1078" w:type="dxa"/>
+            <w:tcW w:w="1079" w:type="dxa"/>
             <w:tcBorders>
               <w:top w:val="single" w:sz="8" w:space="0" w:color="000000"/>
               <w:left w:val="single" w:sz="6" w:space="0" w:color="000000"/>
@@ -22992,7 +23291,7 @@
         </w:tc>
         <w:tc>
           <w:tcPr>
-            <w:tcW w:w="628" w:type="dxa"/>
+            <w:tcW w:w="627" w:type="dxa"/>
             <w:tcBorders>
               <w:top w:val="single" w:sz="8" w:space="0" w:color="000000"/>
               <w:left w:val="single" w:sz="8" w:space="0" w:color="000000"/>
@@ -23145,7 +23444,7 @@
         </w:tc>
         <w:tc>
           <w:tcPr>
-            <w:tcW w:w="900" w:type="dxa"/>
+            <w:tcW w:w="899" w:type="dxa"/>
             <w:tcBorders>
               <w:top w:val="nil"/>
               <w:left w:val="nil"/>
@@ -23184,7 +23483,7 @@
         </w:tc>
         <w:tc>
           <w:tcPr>
-            <w:tcW w:w="1078" w:type="dxa"/>
+            <w:tcW w:w="1079" w:type="dxa"/>
             <w:tcBorders>
               <w:top w:val="single" w:sz="8" w:space="0" w:color="000000"/>
               <w:left w:val="single" w:sz="6" w:space="0" w:color="000000"/>
@@ -23263,7 +23562,7 @@
         </w:tc>
         <w:tc>
           <w:tcPr>
-            <w:tcW w:w="628" w:type="dxa"/>
+            <w:tcW w:w="627" w:type="dxa"/>
             <w:tcBorders>
               <w:top w:val="single" w:sz="8" w:space="0" w:color="000000"/>
               <w:left w:val="single" w:sz="8" w:space="0" w:color="000000"/>
@@ -23337,24 +23636,49 @@
         <w:pStyle w:val="Normal"/>
         <w:widowControl w:val="false"/>
         <w:spacing w:before="0" w:after="0"/>
-        <w:ind w:hanging="0"/>
+        <w:ind w:left="0" w:right="0" w:hanging="0"/>
         <w:rPr>
-          <w:rFonts w:cs="Arial"/>
           <w:b/>
           <w:b/>
-          <w:sz w:val="22"/>
-          <w:szCs w:val="22"/>
-          <w:lang w:val="es-ES"/>
         </w:rPr>
       </w:pPr>
       <w:r>
+        <w:rPr/>
+        <w:t>{{na1</w:t>
+      </w:r>
+      <w:r>
+        <w:rPr/>
+        <w:t>2</w:t>
+      </w:r>
+      <w:r>
+        <w:rPr/>
+        <w:t xml:space="preserve">-2}}          </w:t>
+        <w:tab/>
+      </w:r>
+    </w:p>
+    <w:p>
+      <w:pPr>
+        <w:pStyle w:val="Normal"/>
+        <w:widowControl w:val="false"/>
+        <w:spacing w:before="0" w:after="0"/>
+        <w:ind w:left="0" w:right="0" w:hanging="0"/>
         <w:rPr>
-          <w:rFonts w:cs="Arial"/>
           <w:b/>
-          <w:sz w:val="22"/>
-          <w:szCs w:val="22"/>
-          <w:lang w:val="es-ES"/>
+          <w:b/>
         </w:rPr>
+      </w:pPr>
+      <w:r>
+        <w:rPr/>
+        <w:tab/>
+        <w:t>{{na</w:t>
+      </w:r>
+      <w:r>
+        <w:rPr/>
+        <w:t>13</w:t>
+      </w:r>
+      <w:r>
+        <w:rPr/>
+        <w:t>-1}}</w:t>
       </w:r>
     </w:p>
     <w:p>
@@ -23442,12 +23766,12 @@
       </w:tblPr>
       <w:tblGrid>
         <w:gridCol w:w="1059"/>
-        <w:gridCol w:w="3057"/>
-        <w:gridCol w:w="900"/>
-        <w:gridCol w:w="1068"/>
-        <w:gridCol w:w="1004"/>
+        <w:gridCol w:w="3056"/>
+        <w:gridCol w:w="901"/>
+        <w:gridCol w:w="1067"/>
+        <w:gridCol w:w="1005"/>
         <w:gridCol w:w="628"/>
-        <w:gridCol w:w="2728"/>
+        <w:gridCol w:w="2727"/>
       </w:tblGrid>
       <w:tr>
         <w:trPr>
@@ -23498,7 +23822,7 @@
         </w:tc>
         <w:tc>
           <w:tcPr>
-            <w:tcW w:w="1068" w:type="dxa"/>
+            <w:tcW w:w="1067" w:type="dxa"/>
             <w:tcBorders>
               <w:top w:val="single" w:sz="12" w:space="0" w:color="000000"/>
               <w:left w:val="single" w:sz="6" w:space="0" w:color="000000"/>
@@ -23538,7 +23862,7 @@
         </w:tc>
         <w:tc>
           <w:tcPr>
-            <w:tcW w:w="1004" w:type="dxa"/>
+            <w:tcW w:w="1005" w:type="dxa"/>
             <w:tcBorders>
               <w:top w:val="single" w:sz="12" w:space="0" w:color="000000"/>
               <w:left w:val="single" w:sz="6" w:space="0" w:color="000000"/>
@@ -23614,7 +23938,7 @@
         </w:tc>
         <w:tc>
           <w:tcPr>
-            <w:tcW w:w="2728" w:type="dxa"/>
+            <w:tcW w:w="2727" w:type="dxa"/>
             <w:tcBorders>
               <w:top w:val="nil"/>
               <w:left w:val="nil"/>
@@ -23695,7 +24019,7 @@
         </w:tc>
         <w:tc>
           <w:tcPr>
-            <w:tcW w:w="3057" w:type="dxa"/>
+            <w:tcW w:w="3056" w:type="dxa"/>
             <w:tcBorders>
               <w:top w:val="single" w:sz="12" w:space="0" w:color="000000"/>
               <w:left w:val="single" w:sz="6" w:space="0" w:color="000000"/>
@@ -23735,7 +24059,7 @@
         </w:tc>
         <w:tc>
           <w:tcPr>
-            <w:tcW w:w="900" w:type="dxa"/>
+            <w:tcW w:w="901" w:type="dxa"/>
             <w:tcBorders>
               <w:top w:val="single" w:sz="12" w:space="0" w:color="000000"/>
               <w:left w:val="single" w:sz="6" w:space="0" w:color="000000"/>
@@ -23775,7 +24099,7 @@
         </w:tc>
         <w:tc>
           <w:tcPr>
-            <w:tcW w:w="1068" w:type="dxa"/>
+            <w:tcW w:w="1067" w:type="dxa"/>
             <w:tcBorders>
               <w:top w:val="single" w:sz="12" w:space="0" w:color="000000"/>
               <w:left w:val="single" w:sz="6" w:space="0" w:color="000000"/>
@@ -23816,7 +24140,7 @@
         </w:tc>
         <w:tc>
           <w:tcPr>
-            <w:tcW w:w="1004" w:type="dxa"/>
+            <w:tcW w:w="1005" w:type="dxa"/>
             <w:tcBorders>
               <w:top w:val="single" w:sz="12" w:space="0" w:color="000000"/>
               <w:left w:val="single" w:sz="6" w:space="0" w:color="000000"/>
@@ -23898,7 +24222,7 @@
         </w:tc>
         <w:tc>
           <w:tcPr>
-            <w:tcW w:w="2728" w:type="dxa"/>
+            <w:tcW w:w="2727" w:type="dxa"/>
             <w:tcBorders>
               <w:top w:val="single" w:sz="12" w:space="0" w:color="000000"/>
               <w:left w:val="single" w:sz="6" w:space="0" w:color="000000"/>
@@ -23982,7 +24306,7 @@
         </w:tc>
         <w:tc>
           <w:tcPr>
-            <w:tcW w:w="3057" w:type="dxa"/>
+            <w:tcW w:w="3056" w:type="dxa"/>
             <w:tcBorders>
               <w:top w:val="single" w:sz="8" w:space="0" w:color="000000"/>
               <w:left w:val="nil"/>
@@ -24021,7 +24345,7 @@
         </w:tc>
         <w:tc>
           <w:tcPr>
-            <w:tcW w:w="900" w:type="dxa"/>
+            <w:tcW w:w="901" w:type="dxa"/>
             <w:tcBorders>
               <w:top w:val="nil"/>
               <w:left w:val="nil"/>
@@ -24060,7 +24384,7 @@
         </w:tc>
         <w:tc>
           <w:tcPr>
-            <w:tcW w:w="1068" w:type="dxa"/>
+            <w:tcW w:w="1067" w:type="dxa"/>
             <w:tcBorders>
               <w:top w:val="single" w:sz="12" w:space="0" w:color="000000"/>
               <w:left w:val="single" w:sz="6" w:space="0" w:color="000000"/>
@@ -24099,7 +24423,7 @@
         </w:tc>
         <w:tc>
           <w:tcPr>
-            <w:tcW w:w="1004" w:type="dxa"/>
+            <w:tcW w:w="1005" w:type="dxa"/>
             <w:tcBorders>
               <w:top w:val="single" w:sz="12" w:space="0" w:color="000000"/>
               <w:left w:val="single" w:sz="8" w:space="0" w:color="000000"/>
@@ -24171,7 +24495,7 @@
         </w:tc>
         <w:tc>
           <w:tcPr>
-            <w:tcW w:w="2728" w:type="dxa"/>
+            <w:tcW w:w="2727" w:type="dxa"/>
             <w:tcBorders>
               <w:top w:val="single" w:sz="12" w:space="0" w:color="000000"/>
               <w:left w:val="single" w:sz="8" w:space="0" w:color="000000"/>
@@ -24251,7 +24575,7 @@
         </w:tc>
         <w:tc>
           <w:tcPr>
-            <w:tcW w:w="3057" w:type="dxa"/>
+            <w:tcW w:w="3056" w:type="dxa"/>
             <w:tcBorders>
               <w:top w:val="single" w:sz="8" w:space="0" w:color="000000"/>
               <w:left w:val="single" w:sz="8" w:space="0" w:color="000000"/>
@@ -24290,7 +24614,7 @@
         </w:tc>
         <w:tc>
           <w:tcPr>
-            <w:tcW w:w="900" w:type="dxa"/>
+            <w:tcW w:w="901" w:type="dxa"/>
             <w:tcBorders>
               <w:top w:val="single" w:sz="8" w:space="0" w:color="000000"/>
               <w:left w:val="single" w:sz="8" w:space="0" w:color="000000"/>
@@ -24329,7 +24653,7 @@
         </w:tc>
         <w:tc>
           <w:tcPr>
-            <w:tcW w:w="1068" w:type="dxa"/>
+            <w:tcW w:w="1067" w:type="dxa"/>
             <w:tcBorders>
               <w:top w:val="single" w:sz="8" w:space="0" w:color="000000"/>
               <w:left w:val="single" w:sz="8" w:space="0" w:color="000000"/>
@@ -24368,7 +24692,7 @@
         </w:tc>
         <w:tc>
           <w:tcPr>
-            <w:tcW w:w="1004" w:type="dxa"/>
+            <w:tcW w:w="1005" w:type="dxa"/>
             <w:tcBorders>
               <w:top w:val="single" w:sz="8" w:space="0" w:color="000000"/>
               <w:left w:val="single" w:sz="8" w:space="0" w:color="000000"/>
@@ -24440,7 +24764,7 @@
         </w:tc>
         <w:tc>
           <w:tcPr>
-            <w:tcW w:w="2728" w:type="dxa"/>
+            <w:tcW w:w="2727" w:type="dxa"/>
             <w:tcBorders>
               <w:top w:val="single" w:sz="8" w:space="0" w:color="000000"/>
               <w:left w:val="single" w:sz="8" w:space="0" w:color="000000"/>
@@ -24519,7 +24843,7 @@
         </w:tc>
         <w:tc>
           <w:tcPr>
-            <w:tcW w:w="3057" w:type="dxa"/>
+            <w:tcW w:w="3056" w:type="dxa"/>
             <w:tcBorders>
               <w:top w:val="single" w:sz="8" w:space="0" w:color="000000"/>
               <w:left w:val="single" w:sz="8" w:space="0" w:color="000000"/>
@@ -24558,7 +24882,7 @@
         </w:tc>
         <w:tc>
           <w:tcPr>
-            <w:tcW w:w="900" w:type="dxa"/>
+            <w:tcW w:w="901" w:type="dxa"/>
             <w:tcBorders>
               <w:top w:val="single" w:sz="8" w:space="0" w:color="000000"/>
               <w:left w:val="single" w:sz="8" w:space="0" w:color="000000"/>
@@ -24597,7 +24921,7 @@
         </w:tc>
         <w:tc>
           <w:tcPr>
-            <w:tcW w:w="1068" w:type="dxa"/>
+            <w:tcW w:w="1067" w:type="dxa"/>
             <w:tcBorders>
               <w:top w:val="single" w:sz="8" w:space="0" w:color="000000"/>
               <w:left w:val="single" w:sz="8" w:space="0" w:color="000000"/>
@@ -24636,7 +24960,7 @@
         </w:tc>
         <w:tc>
           <w:tcPr>
-            <w:tcW w:w="1004" w:type="dxa"/>
+            <w:tcW w:w="1005" w:type="dxa"/>
             <w:tcBorders>
               <w:top w:val="single" w:sz="8" w:space="0" w:color="000000"/>
               <w:left w:val="single" w:sz="8" w:space="0" w:color="000000"/>
@@ -24708,7 +25032,7 @@
         </w:tc>
         <w:tc>
           <w:tcPr>
-            <w:tcW w:w="2728" w:type="dxa"/>
+            <w:tcW w:w="2727" w:type="dxa"/>
             <w:tcBorders>
               <w:top w:val="single" w:sz="8" w:space="0" w:color="000000"/>
               <w:left w:val="single" w:sz="8" w:space="0" w:color="000000"/>
@@ -24787,7 +25111,7 @@
         </w:tc>
         <w:tc>
           <w:tcPr>
-            <w:tcW w:w="3057" w:type="dxa"/>
+            <w:tcW w:w="3056" w:type="dxa"/>
             <w:tcBorders>
               <w:top w:val="single" w:sz="8" w:space="0" w:color="000000"/>
               <w:left w:val="single" w:sz="8" w:space="0" w:color="000000"/>
@@ -24826,7 +25150,7 @@
         </w:tc>
         <w:tc>
           <w:tcPr>
-            <w:tcW w:w="900" w:type="dxa"/>
+            <w:tcW w:w="901" w:type="dxa"/>
             <w:tcBorders>
               <w:top w:val="single" w:sz="8" w:space="0" w:color="000000"/>
               <w:left w:val="single" w:sz="8" w:space="0" w:color="000000"/>
@@ -24865,7 +25189,7 @@
         </w:tc>
         <w:tc>
           <w:tcPr>
-            <w:tcW w:w="1068" w:type="dxa"/>
+            <w:tcW w:w="1067" w:type="dxa"/>
             <w:tcBorders>
               <w:top w:val="single" w:sz="8" w:space="0" w:color="000000"/>
               <w:left w:val="single" w:sz="8" w:space="0" w:color="000000"/>
@@ -24904,7 +25228,7 @@
         </w:tc>
         <w:tc>
           <w:tcPr>
-            <w:tcW w:w="1004" w:type="dxa"/>
+            <w:tcW w:w="1005" w:type="dxa"/>
             <w:tcBorders>
               <w:top w:val="single" w:sz="8" w:space="0" w:color="000000"/>
               <w:left w:val="single" w:sz="8" w:space="0" w:color="000000"/>
@@ -24976,7 +25300,7 @@
         </w:tc>
         <w:tc>
           <w:tcPr>
-            <w:tcW w:w="2728" w:type="dxa"/>
+            <w:tcW w:w="2727" w:type="dxa"/>
             <w:tcBorders>
               <w:top w:val="single" w:sz="8" w:space="0" w:color="000000"/>
               <w:left w:val="single" w:sz="8" w:space="0" w:color="000000"/>
@@ -25055,7 +25379,7 @@
         </w:tc>
         <w:tc>
           <w:tcPr>
-            <w:tcW w:w="3057" w:type="dxa"/>
+            <w:tcW w:w="3056" w:type="dxa"/>
             <w:tcBorders>
               <w:top w:val="single" w:sz="8" w:space="0" w:color="000000"/>
               <w:left w:val="single" w:sz="8" w:space="0" w:color="000000"/>
@@ -25094,7 +25418,7 @@
         </w:tc>
         <w:tc>
           <w:tcPr>
-            <w:tcW w:w="900" w:type="dxa"/>
+            <w:tcW w:w="901" w:type="dxa"/>
             <w:tcBorders>
               <w:top w:val="single" w:sz="8" w:space="0" w:color="000000"/>
               <w:left w:val="single" w:sz="8" w:space="0" w:color="000000"/>
@@ -25133,7 +25457,7 @@
         </w:tc>
         <w:tc>
           <w:tcPr>
-            <w:tcW w:w="1068" w:type="dxa"/>
+            <w:tcW w:w="1067" w:type="dxa"/>
             <w:tcBorders>
               <w:top w:val="single" w:sz="8" w:space="0" w:color="000000"/>
               <w:left w:val="single" w:sz="8" w:space="0" w:color="000000"/>
@@ -25172,7 +25496,7 @@
         </w:tc>
         <w:tc>
           <w:tcPr>
-            <w:tcW w:w="1004" w:type="dxa"/>
+            <w:tcW w:w="1005" w:type="dxa"/>
             <w:tcBorders>
               <w:top w:val="single" w:sz="8" w:space="0" w:color="000000"/>
               <w:left w:val="single" w:sz="8" w:space="0" w:color="000000"/>
@@ -25244,7 +25568,7 @@
         </w:tc>
         <w:tc>
           <w:tcPr>
-            <w:tcW w:w="2728" w:type="dxa"/>
+            <w:tcW w:w="2727" w:type="dxa"/>
             <w:tcBorders>
               <w:top w:val="single" w:sz="8" w:space="0" w:color="000000"/>
               <w:left w:val="single" w:sz="8" w:space="0" w:color="000000"/>
@@ -25323,7 +25647,7 @@
         </w:tc>
         <w:tc>
           <w:tcPr>
-            <w:tcW w:w="3057" w:type="dxa"/>
+            <w:tcW w:w="3056" w:type="dxa"/>
             <w:tcBorders>
               <w:top w:val="single" w:sz="8" w:space="0" w:color="000000"/>
               <w:left w:val="single" w:sz="8" w:space="0" w:color="000000"/>
@@ -25362,7 +25686,7 @@
         </w:tc>
         <w:tc>
           <w:tcPr>
-            <w:tcW w:w="900" w:type="dxa"/>
+            <w:tcW w:w="901" w:type="dxa"/>
             <w:tcBorders>
               <w:top w:val="single" w:sz="8" w:space="0" w:color="000000"/>
               <w:left w:val="single" w:sz="8" w:space="0" w:color="000000"/>
@@ -25401,7 +25725,7 @@
         </w:tc>
         <w:tc>
           <w:tcPr>
-            <w:tcW w:w="1068" w:type="dxa"/>
+            <w:tcW w:w="1067" w:type="dxa"/>
             <w:tcBorders>
               <w:top w:val="single" w:sz="8" w:space="0" w:color="000000"/>
               <w:left w:val="single" w:sz="8" w:space="0" w:color="000000"/>
@@ -25440,7 +25764,7 @@
         </w:tc>
         <w:tc>
           <w:tcPr>
-            <w:tcW w:w="1004" w:type="dxa"/>
+            <w:tcW w:w="1005" w:type="dxa"/>
             <w:tcBorders>
               <w:top w:val="single" w:sz="8" w:space="0" w:color="000000"/>
               <w:left w:val="single" w:sz="8" w:space="0" w:color="000000"/>
@@ -25512,7 +25836,7 @@
         </w:tc>
         <w:tc>
           <w:tcPr>
-            <w:tcW w:w="2728" w:type="dxa"/>
+            <w:tcW w:w="2727" w:type="dxa"/>
             <w:tcBorders>
               <w:top w:val="single" w:sz="8" w:space="0" w:color="000000"/>
               <w:left w:val="single" w:sz="8" w:space="0" w:color="000000"/>
@@ -25591,7 +25915,7 @@
         </w:tc>
         <w:tc>
           <w:tcPr>
-            <w:tcW w:w="3057" w:type="dxa"/>
+            <w:tcW w:w="3056" w:type="dxa"/>
             <w:tcBorders>
               <w:top w:val="single" w:sz="8" w:space="0" w:color="000000"/>
               <w:left w:val="single" w:sz="8" w:space="0" w:color="000000"/>
@@ -25630,7 +25954,7 @@
         </w:tc>
         <w:tc>
           <w:tcPr>
-            <w:tcW w:w="900" w:type="dxa"/>
+            <w:tcW w:w="901" w:type="dxa"/>
             <w:tcBorders>
               <w:top w:val="single" w:sz="8" w:space="0" w:color="000000"/>
               <w:left w:val="single" w:sz="8" w:space="0" w:color="000000"/>
@@ -25669,7 +25993,7 @@
         </w:tc>
         <w:tc>
           <w:tcPr>
-            <w:tcW w:w="1068" w:type="dxa"/>
+            <w:tcW w:w="1067" w:type="dxa"/>
             <w:tcBorders>
               <w:top w:val="single" w:sz="8" w:space="0" w:color="000000"/>
               <w:left w:val="single" w:sz="8" w:space="0" w:color="000000"/>
@@ -25708,7 +26032,7 @@
         </w:tc>
         <w:tc>
           <w:tcPr>
-            <w:tcW w:w="1004" w:type="dxa"/>
+            <w:tcW w:w="1005" w:type="dxa"/>
             <w:tcBorders>
               <w:top w:val="single" w:sz="8" w:space="0" w:color="000000"/>
               <w:left w:val="single" w:sz="8" w:space="0" w:color="000000"/>
@@ -25781,7 +26105,7 @@
         </w:tc>
         <w:tc>
           <w:tcPr>
-            <w:tcW w:w="2728" w:type="dxa"/>
+            <w:tcW w:w="2727" w:type="dxa"/>
             <w:tcBorders>
               <w:top w:val="single" w:sz="8" w:space="0" w:color="000000"/>
               <w:left w:val="single" w:sz="8" w:space="0" w:color="000000"/>
@@ -25860,7 +26184,7 @@
         </w:tc>
         <w:tc>
           <w:tcPr>
-            <w:tcW w:w="3057" w:type="dxa"/>
+            <w:tcW w:w="3056" w:type="dxa"/>
             <w:tcBorders>
               <w:top w:val="single" w:sz="8" w:space="0" w:color="000000"/>
               <w:left w:val="single" w:sz="8" w:space="0" w:color="000000"/>
@@ -25899,7 +26223,7 @@
         </w:tc>
         <w:tc>
           <w:tcPr>
-            <w:tcW w:w="900" w:type="dxa"/>
+            <w:tcW w:w="901" w:type="dxa"/>
             <w:tcBorders>
               <w:top w:val="single" w:sz="8" w:space="0" w:color="000000"/>
               <w:left w:val="single" w:sz="8" w:space="0" w:color="000000"/>
@@ -25938,7 +26262,7 @@
         </w:tc>
         <w:tc>
           <w:tcPr>
-            <w:tcW w:w="1068" w:type="dxa"/>
+            <w:tcW w:w="1067" w:type="dxa"/>
             <w:tcBorders>
               <w:top w:val="single" w:sz="8" w:space="0" w:color="000000"/>
               <w:left w:val="single" w:sz="8" w:space="0" w:color="000000"/>
@@ -25977,7 +26301,7 @@
         </w:tc>
         <w:tc>
           <w:tcPr>
-            <w:tcW w:w="1004" w:type="dxa"/>
+            <w:tcW w:w="1005" w:type="dxa"/>
             <w:tcBorders>
               <w:top w:val="single" w:sz="8" w:space="0" w:color="000000"/>
               <w:left w:val="single" w:sz="8" w:space="0" w:color="000000"/>
@@ -26049,7 +26373,7 @@
         </w:tc>
         <w:tc>
           <w:tcPr>
-            <w:tcW w:w="2728" w:type="dxa"/>
+            <w:tcW w:w="2727" w:type="dxa"/>
             <w:tcBorders>
               <w:top w:val="single" w:sz="8" w:space="0" w:color="000000"/>
               <w:left w:val="single" w:sz="8" w:space="0" w:color="000000"/>
@@ -26129,7 +26453,7 @@
         </w:tc>
         <w:tc>
           <w:tcPr>
-            <w:tcW w:w="3057" w:type="dxa"/>
+            <w:tcW w:w="3056" w:type="dxa"/>
             <w:tcBorders>
               <w:top w:val="single" w:sz="8" w:space="0" w:color="000000"/>
               <w:left w:val="single" w:sz="8" w:space="0" w:color="000000"/>
@@ -26167,7 +26491,7 @@
         </w:tc>
         <w:tc>
           <w:tcPr>
-            <w:tcW w:w="900" w:type="dxa"/>
+            <w:tcW w:w="901" w:type="dxa"/>
             <w:tcBorders>
               <w:top w:val="single" w:sz="8" w:space="0" w:color="000000"/>
               <w:left w:val="single" w:sz="8" w:space="0" w:color="000000"/>
@@ -26206,7 +26530,7 @@
         </w:tc>
         <w:tc>
           <w:tcPr>
-            <w:tcW w:w="1068" w:type="dxa"/>
+            <w:tcW w:w="1067" w:type="dxa"/>
             <w:tcBorders>
               <w:top w:val="single" w:sz="8" w:space="0" w:color="000000"/>
               <w:left w:val="single" w:sz="8" w:space="0" w:color="000000"/>
@@ -26245,7 +26569,7 @@
         </w:tc>
         <w:tc>
           <w:tcPr>
-            <w:tcW w:w="1004" w:type="dxa"/>
+            <w:tcW w:w="1005" w:type="dxa"/>
             <w:tcBorders>
               <w:top w:val="single" w:sz="8" w:space="0" w:color="000000"/>
               <w:left w:val="single" w:sz="8" w:space="0" w:color="000000"/>
@@ -26318,7 +26642,7 @@
         </w:tc>
         <w:tc>
           <w:tcPr>
-            <w:tcW w:w="2728" w:type="dxa"/>
+            <w:tcW w:w="2727" w:type="dxa"/>
             <w:tcBorders>
               <w:top w:val="single" w:sz="8" w:space="0" w:color="000000"/>
               <w:left w:val="single" w:sz="8" w:space="0" w:color="000000"/>
@@ -26397,7 +26721,7 @@
         </w:tc>
         <w:tc>
           <w:tcPr>
-            <w:tcW w:w="3057" w:type="dxa"/>
+            <w:tcW w:w="3056" w:type="dxa"/>
             <w:tcBorders>
               <w:top w:val="single" w:sz="8" w:space="0" w:color="000000"/>
               <w:left w:val="single" w:sz="8" w:space="0" w:color="000000"/>
@@ -26435,7 +26759,7 @@
         </w:tc>
         <w:tc>
           <w:tcPr>
-            <w:tcW w:w="900" w:type="dxa"/>
+            <w:tcW w:w="901" w:type="dxa"/>
             <w:tcBorders>
               <w:top w:val="single" w:sz="8" w:space="0" w:color="000000"/>
               <w:left w:val="single" w:sz="8" w:space="0" w:color="000000"/>
@@ -26474,7 +26798,7 @@
         </w:tc>
         <w:tc>
           <w:tcPr>
-            <w:tcW w:w="1068" w:type="dxa"/>
+            <w:tcW w:w="1067" w:type="dxa"/>
             <w:tcBorders>
               <w:top w:val="single" w:sz="8" w:space="0" w:color="000000"/>
               <w:left w:val="single" w:sz="8" w:space="0" w:color="000000"/>
@@ -26513,7 +26837,7 @@
         </w:tc>
         <w:tc>
           <w:tcPr>
-            <w:tcW w:w="1004" w:type="dxa"/>
+            <w:tcW w:w="1005" w:type="dxa"/>
             <w:tcBorders>
               <w:top w:val="single" w:sz="8" w:space="0" w:color="000000"/>
               <w:left w:val="single" w:sz="8" w:space="0" w:color="000000"/>
@@ -26586,7 +26910,7 @@
         </w:tc>
         <w:tc>
           <w:tcPr>
-            <w:tcW w:w="2728" w:type="dxa"/>
+            <w:tcW w:w="2727" w:type="dxa"/>
             <w:tcBorders>
               <w:top w:val="single" w:sz="8" w:space="0" w:color="000000"/>
               <w:left w:val="single" w:sz="8" w:space="0" w:color="000000"/>
@@ -26665,7 +26989,7 @@
         </w:tc>
         <w:tc>
           <w:tcPr>
-            <w:tcW w:w="3057" w:type="dxa"/>
+            <w:tcW w:w="3056" w:type="dxa"/>
             <w:tcBorders>
               <w:top w:val="single" w:sz="8" w:space="0" w:color="000000"/>
               <w:left w:val="single" w:sz="8" w:space="0" w:color="000000"/>
@@ -26704,7 +27028,7 @@
         </w:tc>
         <w:tc>
           <w:tcPr>
-            <w:tcW w:w="900" w:type="dxa"/>
+            <w:tcW w:w="901" w:type="dxa"/>
             <w:tcBorders>
               <w:top w:val="single" w:sz="8" w:space="0" w:color="000000"/>
               <w:left w:val="single" w:sz="8" w:space="0" w:color="000000"/>
@@ -26743,7 +27067,7 @@
         </w:tc>
         <w:tc>
           <w:tcPr>
-            <w:tcW w:w="1068" w:type="dxa"/>
+            <w:tcW w:w="1067" w:type="dxa"/>
             <w:tcBorders>
               <w:top w:val="single" w:sz="8" w:space="0" w:color="000000"/>
               <w:left w:val="single" w:sz="8" w:space="0" w:color="000000"/>
@@ -26782,7 +27106,7 @@
         </w:tc>
         <w:tc>
           <w:tcPr>
-            <w:tcW w:w="1004" w:type="dxa"/>
+            <w:tcW w:w="1005" w:type="dxa"/>
             <w:tcBorders>
               <w:top w:val="single" w:sz="8" w:space="0" w:color="000000"/>
               <w:left w:val="single" w:sz="8" w:space="0" w:color="000000"/>
@@ -26855,7 +27179,7 @@
         </w:tc>
         <w:tc>
           <w:tcPr>
-            <w:tcW w:w="2728" w:type="dxa"/>
+            <w:tcW w:w="2727" w:type="dxa"/>
             <w:tcBorders>
               <w:top w:val="single" w:sz="8" w:space="0" w:color="000000"/>
               <w:left w:val="single" w:sz="8" w:space="0" w:color="000000"/>
@@ -26934,7 +27258,7 @@
         </w:tc>
         <w:tc>
           <w:tcPr>
-            <w:tcW w:w="3057" w:type="dxa"/>
+            <w:tcW w:w="3056" w:type="dxa"/>
             <w:tcBorders>
               <w:top w:val="single" w:sz="8" w:space="0" w:color="000000"/>
               <w:left w:val="single" w:sz="8" w:space="0" w:color="000000"/>
@@ -26972,7 +27296,7 @@
         </w:tc>
         <w:tc>
           <w:tcPr>
-            <w:tcW w:w="900" w:type="dxa"/>
+            <w:tcW w:w="901" w:type="dxa"/>
             <w:tcBorders>
               <w:top w:val="single" w:sz="8" w:space="0" w:color="000000"/>
               <w:left w:val="single" w:sz="8" w:space="0" w:color="000000"/>
@@ -27011,7 +27335,7 @@
         </w:tc>
         <w:tc>
           <w:tcPr>
-            <w:tcW w:w="1068" w:type="dxa"/>
+            <w:tcW w:w="1067" w:type="dxa"/>
             <w:tcBorders>
               <w:top w:val="single" w:sz="8" w:space="0" w:color="000000"/>
               <w:left w:val="single" w:sz="8" w:space="0" w:color="000000"/>
@@ -27050,7 +27374,7 @@
         </w:tc>
         <w:tc>
           <w:tcPr>
-            <w:tcW w:w="1004" w:type="dxa"/>
+            <w:tcW w:w="1005" w:type="dxa"/>
             <w:tcBorders>
               <w:top w:val="single" w:sz="8" w:space="0" w:color="000000"/>
               <w:left w:val="single" w:sz="8" w:space="0" w:color="000000"/>
@@ -27123,7 +27447,7 @@
         </w:tc>
         <w:tc>
           <w:tcPr>
-            <w:tcW w:w="2728" w:type="dxa"/>
+            <w:tcW w:w="2727" w:type="dxa"/>
             <w:tcBorders>
               <w:top w:val="single" w:sz="8" w:space="0" w:color="000000"/>
               <w:left w:val="single" w:sz="8" w:space="0" w:color="000000"/>
@@ -27202,7 +27526,7 @@
         </w:tc>
         <w:tc>
           <w:tcPr>
-            <w:tcW w:w="3057" w:type="dxa"/>
+            <w:tcW w:w="3056" w:type="dxa"/>
             <w:tcBorders>
               <w:top w:val="single" w:sz="8" w:space="0" w:color="000000"/>
               <w:left w:val="single" w:sz="8" w:space="0" w:color="000000"/>
@@ -27241,7 +27565,7 @@
         </w:tc>
         <w:tc>
           <w:tcPr>
-            <w:tcW w:w="900" w:type="dxa"/>
+            <w:tcW w:w="901" w:type="dxa"/>
             <w:tcBorders>
               <w:top w:val="single" w:sz="8" w:space="0" w:color="000000"/>
               <w:left w:val="single" w:sz="8" w:space="0" w:color="000000"/>
@@ -27280,7 +27604,7 @@
         </w:tc>
         <w:tc>
           <w:tcPr>
-            <w:tcW w:w="1068" w:type="dxa"/>
+            <w:tcW w:w="1067" w:type="dxa"/>
             <w:tcBorders>
               <w:top w:val="single" w:sz="8" w:space="0" w:color="000000"/>
               <w:left w:val="single" w:sz="8" w:space="0" w:color="000000"/>
@@ -27319,7 +27643,7 @@
         </w:tc>
         <w:tc>
           <w:tcPr>
-            <w:tcW w:w="1004" w:type="dxa"/>
+            <w:tcW w:w="1005" w:type="dxa"/>
             <w:tcBorders>
               <w:top w:val="single" w:sz="8" w:space="0" w:color="000000"/>
               <w:left w:val="single" w:sz="8" w:space="0" w:color="000000"/>
@@ -27391,7 +27715,7 @@
         </w:tc>
         <w:tc>
           <w:tcPr>
-            <w:tcW w:w="2728" w:type="dxa"/>
+            <w:tcW w:w="2727" w:type="dxa"/>
             <w:tcBorders>
               <w:top w:val="single" w:sz="8" w:space="0" w:color="000000"/>
               <w:left w:val="single" w:sz="8" w:space="0" w:color="000000"/>
@@ -27470,7 +27794,7 @@
         </w:tc>
         <w:tc>
           <w:tcPr>
-            <w:tcW w:w="3057" w:type="dxa"/>
+            <w:tcW w:w="3056" w:type="dxa"/>
             <w:tcBorders>
               <w:top w:val="single" w:sz="8" w:space="0" w:color="000000"/>
               <w:left w:val="single" w:sz="8" w:space="0" w:color="000000"/>
@@ -27509,7 +27833,7 @@
         </w:tc>
         <w:tc>
           <w:tcPr>
-            <w:tcW w:w="900" w:type="dxa"/>
+            <w:tcW w:w="901" w:type="dxa"/>
             <w:tcBorders>
               <w:top w:val="single" w:sz="8" w:space="0" w:color="000000"/>
               <w:left w:val="single" w:sz="8" w:space="0" w:color="000000"/>
@@ -27548,7 +27872,7 @@
         </w:tc>
         <w:tc>
           <w:tcPr>
-            <w:tcW w:w="1068" w:type="dxa"/>
+            <w:tcW w:w="1067" w:type="dxa"/>
             <w:tcBorders>
               <w:top w:val="single" w:sz="8" w:space="0" w:color="000000"/>
               <w:left w:val="single" w:sz="8" w:space="0" w:color="000000"/>
@@ -27587,7 +27911,7 @@
         </w:tc>
         <w:tc>
           <w:tcPr>
-            <w:tcW w:w="1004" w:type="dxa"/>
+            <w:tcW w:w="1005" w:type="dxa"/>
             <w:tcBorders>
               <w:top w:val="single" w:sz="8" w:space="0" w:color="000000"/>
               <w:left w:val="single" w:sz="8" w:space="0" w:color="000000"/>
@@ -27659,7 +27983,7 @@
         </w:tc>
         <w:tc>
           <w:tcPr>
-            <w:tcW w:w="2728" w:type="dxa"/>
+            <w:tcW w:w="2727" w:type="dxa"/>
             <w:tcBorders>
               <w:top w:val="single" w:sz="8" w:space="0" w:color="000000"/>
               <w:left w:val="single" w:sz="8" w:space="0" w:color="000000"/>
@@ -27720,20 +28044,55 @@
         <w:pStyle w:val="Normal"/>
         <w:widowControl w:val="false"/>
         <w:spacing w:before="0" w:after="0"/>
-        <w:ind w:hanging="0"/>
+        <w:ind w:left="0" w:right="0" w:hanging="0"/>
         <w:rPr>
-          <w:rFonts w:cs="Arial"/>
           <w:b/>
           <w:b/>
-          <w:lang w:val="es-ES"/>
         </w:rPr>
       </w:pPr>
       <w:r>
         <w:rPr>
-          <w:rFonts w:cs="Arial"/>
           <w:b/>
-          <w:lang w:val="es-ES"/>
         </w:rPr>
+        <w:t>{{na1</w:t>
+      </w:r>
+      <w:r>
+        <w:rPr>
+          <w:b/>
+        </w:rPr>
+        <w:t>3</w:t>
+      </w:r>
+      <w:r>
+        <w:rPr>
+          <w:b/>
+        </w:rPr>
+        <w:t xml:space="preserve">-2}}          </w:t>
+        <w:tab/>
+      </w:r>
+    </w:p>
+    <w:p>
+      <w:pPr>
+        <w:pStyle w:val="Normal"/>
+        <w:widowControl w:val="false"/>
+        <w:spacing w:before="0" w:after="0"/>
+        <w:ind w:left="0" w:right="0" w:hanging="0"/>
+        <w:rPr>
+          <w:b/>
+          <w:b/>
+        </w:rPr>
+      </w:pPr>
+      <w:r>
+        <w:rPr/>
+        <w:tab/>
+        <w:t>{{na</w:t>
+      </w:r>
+      <w:r>
+        <w:rPr/>
+        <w:t>14</w:t>
+      </w:r>
+      <w:r>
+        <w:rPr/>
+        <w:t>-1}}</w:t>
       </w:r>
     </w:p>
     <w:p>
@@ -27800,12 +28159,12 @@
       </w:tblPr>
       <w:tblGrid>
         <w:gridCol w:w="1059"/>
-        <w:gridCol w:w="3057"/>
-        <w:gridCol w:w="900"/>
+        <w:gridCol w:w="3056"/>
+        <w:gridCol w:w="901"/>
         <w:gridCol w:w="1078"/>
         <w:gridCol w:w="994"/>
         <w:gridCol w:w="628"/>
-        <w:gridCol w:w="2728"/>
+        <w:gridCol w:w="2727"/>
       </w:tblGrid>
       <w:tr>
         <w:trPr>
@@ -27973,7 +28332,7 @@
         </w:tc>
         <w:tc>
           <w:tcPr>
-            <w:tcW w:w="2728" w:type="dxa"/>
+            <w:tcW w:w="2727" w:type="dxa"/>
             <w:tcBorders>
               <w:top w:val="nil"/>
               <w:left w:val="nil"/>
@@ -28055,7 +28414,7 @@
         </w:tc>
         <w:tc>
           <w:tcPr>
-            <w:tcW w:w="3057" w:type="dxa"/>
+            <w:tcW w:w="3056" w:type="dxa"/>
             <w:tcBorders>
               <w:top w:val="single" w:sz="12" w:space="0" w:color="000000"/>
               <w:left w:val="single" w:sz="6" w:space="0" w:color="000000"/>
@@ -28095,7 +28454,7 @@
         </w:tc>
         <w:tc>
           <w:tcPr>
-            <w:tcW w:w="900" w:type="dxa"/>
+            <w:tcW w:w="901" w:type="dxa"/>
             <w:tcBorders>
               <w:top w:val="single" w:sz="12" w:space="0" w:color="000000"/>
               <w:left w:val="single" w:sz="6" w:space="0" w:color="000000"/>
@@ -28258,7 +28617,7 @@
         </w:tc>
         <w:tc>
           <w:tcPr>
-            <w:tcW w:w="2728" w:type="dxa"/>
+            <w:tcW w:w="2727" w:type="dxa"/>
             <w:tcBorders>
               <w:top w:val="single" w:sz="12" w:space="0" w:color="000000"/>
               <w:left w:val="single" w:sz="6" w:space="0" w:color="000000"/>
@@ -28343,7 +28702,7 @@
         </w:tc>
         <w:tc>
           <w:tcPr>
-            <w:tcW w:w="3057" w:type="dxa"/>
+            <w:tcW w:w="3056" w:type="dxa"/>
             <w:tcBorders>
               <w:top w:val="single" w:sz="8" w:space="0" w:color="000000"/>
               <w:left w:val="nil"/>
@@ -28382,7 +28741,7 @@
         </w:tc>
         <w:tc>
           <w:tcPr>
-            <w:tcW w:w="900" w:type="dxa"/>
+            <w:tcW w:w="901" w:type="dxa"/>
             <w:tcBorders>
               <w:top w:val="nil"/>
               <w:left w:val="nil"/>
@@ -28539,7 +28898,7 @@
         </w:tc>
         <w:tc>
           <w:tcPr>
-            <w:tcW w:w="2728" w:type="dxa"/>
+            <w:tcW w:w="2727" w:type="dxa"/>
             <w:tcBorders>
               <w:top w:val="single" w:sz="12" w:space="0" w:color="000000"/>
               <w:left w:val="single" w:sz="8" w:space="0" w:color="000000"/>
@@ -28602,20 +28961,55 @@
         <w:pStyle w:val="Normal"/>
         <w:widowControl w:val="false"/>
         <w:spacing w:before="0" w:after="0"/>
-        <w:ind w:hanging="0"/>
+        <w:ind w:left="0" w:right="0" w:hanging="0"/>
         <w:rPr>
-          <w:rFonts w:cs="Arial"/>
           <w:b/>
           <w:b/>
-          <w:lang w:val="es-ES"/>
         </w:rPr>
       </w:pPr>
       <w:r>
         <w:rPr>
-          <w:rFonts w:cs="Arial"/>
           <w:b/>
-          <w:lang w:val="es-ES"/>
         </w:rPr>
+        <w:t>{{na1</w:t>
+      </w:r>
+      <w:r>
+        <w:rPr>
+          <w:b/>
+        </w:rPr>
+        <w:t>4</w:t>
+      </w:r>
+      <w:r>
+        <w:rPr>
+          <w:b/>
+        </w:rPr>
+        <w:t xml:space="preserve">-2}}          </w:t>
+        <w:tab/>
+      </w:r>
+    </w:p>
+    <w:p>
+      <w:pPr>
+        <w:pStyle w:val="Normal"/>
+        <w:widowControl w:val="false"/>
+        <w:spacing w:before="0" w:after="0"/>
+        <w:ind w:left="0" w:right="0" w:hanging="0"/>
+        <w:rPr>
+          <w:b/>
+          <w:b/>
+        </w:rPr>
+      </w:pPr>
+      <w:r>
+        <w:rPr/>
+        <w:tab/>
+        <w:t>{{na</w:t>
+      </w:r>
+      <w:r>
+        <w:rPr/>
+        <w:t>15</w:t>
+      </w:r>
+      <w:r>
+        <w:rPr/>
+        <w:t>-1}}</w:t>
       </w:r>
     </w:p>
     <w:p>
@@ -28681,12 +29075,12 @@
         <w:tblLook w:val="0000" w:noHBand="0" w:noVBand="0" w:firstColumn="0" w:lastRow="0" w:lastColumn="0" w:firstRow="0"/>
       </w:tblPr>
       <w:tblGrid>
-        <w:gridCol w:w="1078"/>
-        <w:gridCol w:w="3066"/>
+        <w:gridCol w:w="1077"/>
+        <w:gridCol w:w="3067"/>
         <w:gridCol w:w="919"/>
         <w:gridCol w:w="1078"/>
         <w:gridCol w:w="965"/>
-        <w:gridCol w:w="647"/>
+        <w:gridCol w:w="646"/>
         <w:gridCol w:w="2691"/>
       </w:tblGrid>
       <w:tr>
@@ -28820,7 +29214,7 @@
         </w:tc>
         <w:tc>
           <w:tcPr>
-            <w:tcW w:w="647" w:type="dxa"/>
+            <w:tcW w:w="646" w:type="dxa"/>
             <w:tcBorders>
               <w:top w:val="nil"/>
               <w:left w:val="nil"/>
@@ -28897,7 +29291,7 @@
         </w:trPr>
         <w:tc>
           <w:tcPr>
-            <w:tcW w:w="1078" w:type="dxa"/>
+            <w:tcW w:w="1077" w:type="dxa"/>
             <w:tcBorders>
               <w:top w:val="single" w:sz="12" w:space="0" w:color="000000"/>
               <w:left w:val="single" w:sz="12" w:space="0" w:color="000000"/>
@@ -28937,7 +29331,7 @@
         </w:tc>
         <w:tc>
           <w:tcPr>
-            <w:tcW w:w="3066" w:type="dxa"/>
+            <w:tcW w:w="3067" w:type="dxa"/>
             <w:tcBorders>
               <w:top w:val="single" w:sz="12" w:space="0" w:color="000000"/>
               <w:left w:val="single" w:sz="6" w:space="0" w:color="000000"/>
@@ -29099,7 +29493,7 @@
         </w:tc>
         <w:tc>
           <w:tcPr>
-            <w:tcW w:w="647" w:type="dxa"/>
+            <w:tcW w:w="646" w:type="dxa"/>
             <w:tcBorders>
               <w:top w:val="single" w:sz="12" w:space="0" w:color="000000"/>
               <w:left w:val="single" w:sz="6" w:space="0" w:color="000000"/>
@@ -29186,7 +29580,7 @@
         </w:trPr>
         <w:tc>
           <w:tcPr>
-            <w:tcW w:w="1078" w:type="dxa"/>
+            <w:tcW w:w="1077" w:type="dxa"/>
             <w:tcBorders>
               <w:top w:val="nil"/>
               <w:left w:val="single" w:sz="8" w:space="0" w:color="000000"/>
@@ -29225,7 +29619,7 @@
         </w:tc>
         <w:tc>
           <w:tcPr>
-            <w:tcW w:w="3066" w:type="dxa"/>
+            <w:tcW w:w="3067" w:type="dxa"/>
             <w:tcBorders>
               <w:top w:val="nil"/>
               <w:left w:val="nil"/>
@@ -29380,7 +29774,7 @@
         </w:tc>
         <w:tc>
           <w:tcPr>
-            <w:tcW w:w="647" w:type="dxa"/>
+            <w:tcW w:w="646" w:type="dxa"/>
             <w:tcBorders>
               <w:top w:val="single" w:sz="12" w:space="0" w:color="000000"/>
               <w:left w:val="single" w:sz="8" w:space="0" w:color="000000"/>
@@ -29462,7 +29856,7 @@
         </w:trPr>
         <w:tc>
           <w:tcPr>
-            <w:tcW w:w="1078" w:type="dxa"/>
+            <w:tcW w:w="1077" w:type="dxa"/>
             <w:tcBorders>
               <w:top w:val="nil"/>
               <w:left w:val="single" w:sz="8" w:space="0" w:color="000000"/>
@@ -29496,7 +29890,7 @@
         </w:tc>
         <w:tc>
           <w:tcPr>
-            <w:tcW w:w="3066" w:type="dxa"/>
+            <w:tcW w:w="3067" w:type="dxa"/>
             <w:tcBorders>
               <w:top w:val="nil"/>
               <w:left w:val="single" w:sz="8" w:space="0" w:color="2B4B5B"/>
@@ -29652,7 +30046,7 @@
         </w:tc>
         <w:tc>
           <w:tcPr>
-            <w:tcW w:w="647" w:type="dxa"/>
+            <w:tcW w:w="646" w:type="dxa"/>
             <w:tcBorders>
               <w:top w:val="single" w:sz="8" w:space="0" w:color="000000"/>
               <w:left w:val="single" w:sz="8" w:space="0" w:color="000000"/>
@@ -29733,7 +30127,7 @@
         </w:trPr>
         <w:tc>
           <w:tcPr>
-            <w:tcW w:w="1078" w:type="dxa"/>
+            <w:tcW w:w="1077" w:type="dxa"/>
             <w:tcBorders>
               <w:top w:val="nil"/>
               <w:left w:val="single" w:sz="8" w:space="0" w:color="000000"/>
@@ -29772,7 +30166,7 @@
         </w:tc>
         <w:tc>
           <w:tcPr>
-            <w:tcW w:w="3066" w:type="dxa"/>
+            <w:tcW w:w="3067" w:type="dxa"/>
             <w:tcBorders>
               <w:top w:val="nil"/>
               <w:left w:val="single" w:sz="8" w:space="0" w:color="183848"/>
@@ -29927,7 +30321,7 @@
         </w:tc>
         <w:tc>
           <w:tcPr>
-            <w:tcW w:w="647" w:type="dxa"/>
+            <w:tcW w:w="646" w:type="dxa"/>
             <w:tcBorders>
               <w:top w:val="single" w:sz="8" w:space="0" w:color="000000"/>
               <w:left w:val="single" w:sz="8" w:space="0" w:color="000000"/>
@@ -30007,18 +30401,48 @@
         <w:pStyle w:val="Normal"/>
         <w:widowControl w:val="false"/>
         <w:spacing w:before="0" w:after="0"/>
-        <w:ind w:hanging="0"/>
+        <w:ind w:left="0" w:right="0" w:hanging="0"/>
         <w:rPr>
-          <w:rFonts w:cs="Arial"/>
           <w:b/>
           <w:b/>
-          <w:sz w:val="22"/>
-          <w:szCs w:val="22"/>
-          <w:lang w:val="es-ES"/>
         </w:rPr>
       </w:pPr>
       <w:r>
-        <w:rPr/>
+        <w:rPr>
+          <w:b/>
+        </w:rPr>
+        <w:t>{{na1</w:t>
+      </w:r>
+      <w:r>
+        <w:rPr>
+          <w:b/>
+        </w:rPr>
+        <w:t>5</w:t>
+      </w:r>
+      <w:r>
+        <w:rPr>
+          <w:b/>
+        </w:rPr>
+        <w:t xml:space="preserve">-2}}          </w:t>
+        <w:tab/>
+      </w:r>
+    </w:p>
+    <w:p>
+      <w:pPr>
+        <w:pStyle w:val="Normal"/>
+        <w:widowControl w:val="false"/>
+        <w:spacing w:before="0" w:after="0"/>
+        <w:ind w:left="0" w:right="0" w:hanging="0"/>
+        <w:rPr>
+          <w:b/>
+          <w:b/>
+        </w:rPr>
+      </w:pPr>
+      <w:r>
+        <w:rPr>
+          <w:b/>
+        </w:rPr>
+        <w:tab/>
       </w:r>
     </w:p>
     <w:sectPr>

</xml_diff>

<commit_message>
se agrega cuando es viejo
</commit_message>
<xml_diff>
--- a/app/templates/tabla_escala.docx
+++ b/app/templates/tabla_escala.docx
@@ -3323,6 +3323,28 @@
         <w:pStyle w:val="Normal"/>
         <w:widowControl w:val="false"/>
         <w:spacing w:before="0" w:after="0"/>
+        <w:ind w:hanging="0"/>
+        <w:rPr>
+          <w:rFonts w:cs="Arial"/>
+          <w:b/>
+          <w:b/>
+          <w:lang w:val="es-ES"/>
+        </w:rPr>
+      </w:pPr>
+      <w:r>
+        <w:rPr>
+          <w:rFonts w:cs="Arial"/>
+          <w:b/>
+          <w:lang w:val="es-ES"/>
+        </w:rPr>
+        <w:t>{{if_viejo}}</w:t>
+      </w:r>
+    </w:p>
+    <w:p>
+      <w:pPr>
+        <w:pStyle w:val="Normal"/>
+        <w:widowControl w:val="false"/>
+        <w:spacing w:before="0" w:after="0"/>
         <w:ind w:left="0" w:right="0" w:hanging="0"/>
         <w:rPr>
           <w:b/>
@@ -3333,19 +3355,7 @@
         <w:rPr>
           <w:b/>
         </w:rPr>
-        <w:t>{{na1-</w:t>
-      </w:r>
-      <w:r>
-        <w:rPr>
-          <w:b/>
-        </w:rPr>
-        <w:t>1</w:t>
-      </w:r>
-      <w:r>
-        <w:rPr>
-          <w:b/>
-        </w:rPr>
-        <w:t xml:space="preserve">}}          </w:t>
+        <w:t xml:space="preserve">{{na1-1}}          </w:t>
         <w:tab/>
       </w:r>
     </w:p>
@@ -6490,19 +6500,7 @@
         <w:rPr>
           <w:b/>
         </w:rPr>
-        <w:t>{{na</w:t>
-      </w:r>
-      <w:r>
-        <w:rPr>
-          <w:b/>
-        </w:rPr>
-        <w:t>2</w:t>
-      </w:r>
-      <w:r>
-        <w:rPr>
-          <w:b/>
-        </w:rPr>
-        <w:t xml:space="preserve">-2}}          </w:t>
+        <w:t xml:space="preserve">{{na2-2}}          </w:t>
         <w:tab/>
       </w:r>
     </w:p>
@@ -6520,23 +6518,7 @@
       <w:r>
         <w:rPr/>
         <w:tab/>
-        <w:t>{{na</w:t>
-      </w:r>
-      <w:r>
-        <w:rPr/>
-        <w:t>3</w:t>
-      </w:r>
-      <w:r>
-        <w:rPr/>
-        <w:t>-</w:t>
-      </w:r>
-      <w:r>
-        <w:rPr/>
-        <w:t>1</w:t>
-      </w:r>
-      <w:r>
-        <w:rPr/>
-        <w:t>}}</w:t>
+        <w:t>{{na3-1}}</w:t>
       </w:r>
     </w:p>
     <w:p>
@@ -8751,19 +8733,7 @@
         <w:rPr>
           <w:b/>
         </w:rPr>
-        <w:t>{{na</w:t>
-      </w:r>
-      <w:r>
-        <w:rPr>
-          <w:b/>
-        </w:rPr>
-        <w:t>3</w:t>
-      </w:r>
-      <w:r>
-        <w:rPr>
-          <w:b/>
-        </w:rPr>
-        <w:t xml:space="preserve">-2}}          </w:t>
+        <w:t xml:space="preserve">{{na3-2}}          </w:t>
         <w:tab/>
       </w:r>
     </w:p>
@@ -8781,15 +8751,7 @@
       <w:r>
         <w:rPr/>
         <w:tab/>
-        <w:t>{{na</w:t>
-      </w:r>
-      <w:r>
-        <w:rPr/>
-        <w:t>4</w:t>
-      </w:r>
-      <w:r>
-        <w:rPr/>
-        <w:t>-1}}</w:t>
+        <w:t>{{na4-1}}</w:t>
       </w:r>
     </w:p>
     <w:p>
@@ -11834,19 +11796,7 @@
         <w:rPr>
           <w:b/>
         </w:rPr>
-        <w:t>{{na</w:t>
-      </w:r>
-      <w:r>
-        <w:rPr>
-          <w:b/>
-        </w:rPr>
-        <w:t>4</w:t>
-      </w:r>
-      <w:r>
-        <w:rPr>
-          <w:b/>
-        </w:rPr>
-        <w:t xml:space="preserve">-2}}          </w:t>
+        <w:t xml:space="preserve">{{na4-2}}          </w:t>
         <w:tab/>
       </w:r>
     </w:p>
@@ -11864,15 +11814,7 @@
       <w:r>
         <w:rPr/>
         <w:tab/>
-        <w:t>{{na</w:t>
-      </w:r>
-      <w:r>
-        <w:rPr/>
-        <w:t>5</w:t>
-      </w:r>
-      <w:r>
-        <w:rPr/>
-        <w:t>-1}}</w:t>
+        <w:t>{{na5-1}}</w:t>
       </w:r>
     </w:p>
     <w:p>
@@ -13815,19 +13757,7 @@
         <w:rPr>
           <w:b/>
         </w:rPr>
-        <w:t>{{na</w:t>
-      </w:r>
-      <w:r>
-        <w:rPr>
-          <w:b/>
-        </w:rPr>
-        <w:t>5</w:t>
-      </w:r>
-      <w:r>
-        <w:rPr>
-          <w:b/>
-        </w:rPr>
-        <w:t xml:space="preserve">-2}}          </w:t>
+        <w:t xml:space="preserve">{{na5-2}}          </w:t>
         <w:tab/>
       </w:r>
     </w:p>
@@ -13845,15 +13775,7 @@
       <w:r>
         <w:rPr/>
         <w:tab/>
-        <w:t>{{na</w:t>
-      </w:r>
-      <w:r>
-        <w:rPr/>
-        <w:t>6</w:t>
-      </w:r>
-      <w:r>
-        <w:rPr/>
-        <w:t>-1}}</w:t>
+        <w:t>{{na6-1}}</w:t>
       </w:r>
     </w:p>
     <w:p>
@@ -13923,8 +13845,8 @@
         <w:gridCol w:w="2689"/>
         <w:gridCol w:w="1003"/>
         <w:gridCol w:w="1078"/>
-        <w:gridCol w:w="1080"/>
-        <w:gridCol w:w="534"/>
+        <w:gridCol w:w="1081"/>
+        <w:gridCol w:w="533"/>
         <w:gridCol w:w="2718"/>
       </w:tblGrid>
       <w:tr>
@@ -14017,7 +13939,7 @@
         </w:tc>
         <w:tc>
           <w:tcPr>
-            <w:tcW w:w="1080" w:type="dxa"/>
+            <w:tcW w:w="1081" w:type="dxa"/>
             <w:tcBorders>
               <w:top w:val="single" w:sz="12" w:space="0" w:color="000000"/>
               <w:left w:val="single" w:sz="6" w:space="0" w:color="000000"/>
@@ -14058,7 +13980,7 @@
         </w:tc>
         <w:tc>
           <w:tcPr>
-            <w:tcW w:w="534" w:type="dxa"/>
+            <w:tcW w:w="533" w:type="dxa"/>
             <w:tcBorders>
               <w:top w:val="nil"/>
               <w:left w:val="nil"/>
@@ -14296,7 +14218,7 @@
         </w:tc>
         <w:tc>
           <w:tcPr>
-            <w:tcW w:w="1080" w:type="dxa"/>
+            <w:tcW w:w="1081" w:type="dxa"/>
             <w:tcBorders>
               <w:top w:val="single" w:sz="12" w:space="0" w:color="000000"/>
               <w:left w:val="single" w:sz="6" w:space="0" w:color="000000"/>
@@ -14337,7 +14259,7 @@
         </w:tc>
         <w:tc>
           <w:tcPr>
-            <w:tcW w:w="534" w:type="dxa"/>
+            <w:tcW w:w="533" w:type="dxa"/>
             <w:tcBorders>
               <w:top w:val="single" w:sz="12" w:space="0" w:color="000000"/>
               <w:left w:val="single" w:sz="6" w:space="0" w:color="000000"/>
@@ -14578,7 +14500,7 @@
         </w:tc>
         <w:tc>
           <w:tcPr>
-            <w:tcW w:w="1080" w:type="dxa"/>
+            <w:tcW w:w="1081" w:type="dxa"/>
             <w:tcBorders>
               <w:top w:val="single" w:sz="12" w:space="0" w:color="000000"/>
               <w:left w:val="single" w:sz="8" w:space="0" w:color="000000"/>
@@ -14617,7 +14539,7 @@
         </w:tc>
         <w:tc>
           <w:tcPr>
-            <w:tcW w:w="534" w:type="dxa"/>
+            <w:tcW w:w="533" w:type="dxa"/>
             <w:tcBorders>
               <w:top w:val="single" w:sz="12" w:space="0" w:color="000000"/>
               <w:left w:val="single" w:sz="8" w:space="0" w:color="000000"/>
@@ -14846,7 +14768,7 @@
         </w:tc>
         <w:tc>
           <w:tcPr>
-            <w:tcW w:w="1080" w:type="dxa"/>
+            <w:tcW w:w="1081" w:type="dxa"/>
             <w:tcBorders>
               <w:top w:val="single" w:sz="8" w:space="0" w:color="000000"/>
               <w:left w:val="single" w:sz="8" w:space="0" w:color="000000"/>
@@ -14886,7 +14808,7 @@
         </w:tc>
         <w:tc>
           <w:tcPr>
-            <w:tcW w:w="534" w:type="dxa"/>
+            <w:tcW w:w="533" w:type="dxa"/>
             <w:tcBorders>
               <w:top w:val="single" w:sz="8" w:space="0" w:color="000000"/>
               <w:left w:val="single" w:sz="8" w:space="0" w:color="000000"/>
@@ -15114,7 +15036,7 @@
         </w:tc>
         <w:tc>
           <w:tcPr>
-            <w:tcW w:w="1080" w:type="dxa"/>
+            <w:tcW w:w="1081" w:type="dxa"/>
             <w:tcBorders>
               <w:top w:val="single" w:sz="8" w:space="0" w:color="000000"/>
               <w:left w:val="single" w:sz="8" w:space="0" w:color="000000"/>
@@ -15154,7 +15076,7 @@
         </w:tc>
         <w:tc>
           <w:tcPr>
-            <w:tcW w:w="534" w:type="dxa"/>
+            <w:tcW w:w="533" w:type="dxa"/>
             <w:tcBorders>
               <w:top w:val="single" w:sz="8" w:space="0" w:color="000000"/>
               <w:left w:val="single" w:sz="8" w:space="0" w:color="000000"/>
@@ -15383,7 +15305,7 @@
         </w:tc>
         <w:tc>
           <w:tcPr>
-            <w:tcW w:w="1080" w:type="dxa"/>
+            <w:tcW w:w="1081" w:type="dxa"/>
             <w:tcBorders>
               <w:top w:val="single" w:sz="8" w:space="0" w:color="000000"/>
               <w:left w:val="single" w:sz="8" w:space="0" w:color="000000"/>
@@ -15423,7 +15345,7 @@
         </w:tc>
         <w:tc>
           <w:tcPr>
-            <w:tcW w:w="534" w:type="dxa"/>
+            <w:tcW w:w="533" w:type="dxa"/>
             <w:tcBorders>
               <w:top w:val="single" w:sz="8" w:space="0" w:color="000000"/>
               <w:left w:val="single" w:sz="8" w:space="0" w:color="000000"/>
@@ -15652,7 +15574,7 @@
         </w:tc>
         <w:tc>
           <w:tcPr>
-            <w:tcW w:w="1080" w:type="dxa"/>
+            <w:tcW w:w="1081" w:type="dxa"/>
             <w:tcBorders>
               <w:top w:val="single" w:sz="8" w:space="0" w:color="000000"/>
               <w:left w:val="single" w:sz="8" w:space="0" w:color="000000"/>
@@ -15692,7 +15614,7 @@
         </w:tc>
         <w:tc>
           <w:tcPr>
-            <w:tcW w:w="534" w:type="dxa"/>
+            <w:tcW w:w="533" w:type="dxa"/>
             <w:tcBorders>
               <w:top w:val="single" w:sz="8" w:space="0" w:color="000000"/>
               <w:left w:val="single" w:sz="8" w:space="0" w:color="000000"/>
@@ -15797,19 +15719,7 @@
         <w:rPr>
           <w:b/>
         </w:rPr>
-        <w:t>{{na</w:t>
-      </w:r>
-      <w:r>
-        <w:rPr>
-          <w:b/>
-        </w:rPr>
-        <w:t>6</w:t>
-      </w:r>
-      <w:r>
-        <w:rPr>
-          <w:b/>
-        </w:rPr>
-        <w:t xml:space="preserve">-2}}          </w:t>
+        <w:t xml:space="preserve">{{na6-2}}          </w:t>
         <w:tab/>
       </w:r>
     </w:p>
@@ -15827,15 +15737,7 @@
       <w:r>
         <w:rPr/>
         <w:tab/>
-        <w:t>{{na</w:t>
-      </w:r>
-      <w:r>
-        <w:rPr/>
-        <w:t>7</w:t>
-      </w:r>
-      <w:r>
-        <w:rPr/>
-        <w:t>-1}}</w:t>
+        <w:t>{{na7-1}}</w:t>
       </w:r>
     </w:p>
     <w:p>
@@ -15897,8 +15799,8 @@
         <w:tblLook w:val="0000" w:noHBand="0" w:noVBand="0" w:firstColumn="0" w:lastRow="0" w:lastColumn="0" w:firstRow="0"/>
       </w:tblPr>
       <w:tblGrid>
-        <w:gridCol w:w="1312"/>
-        <w:gridCol w:w="2691"/>
+        <w:gridCol w:w="1311"/>
+        <w:gridCol w:w="2692"/>
         <w:gridCol w:w="1003"/>
         <w:gridCol w:w="1077"/>
         <w:gridCol w:w="1088"/>
@@ -16113,7 +16015,7 @@
         </w:trPr>
         <w:tc>
           <w:tcPr>
-            <w:tcW w:w="1312" w:type="dxa"/>
+            <w:tcW w:w="1311" w:type="dxa"/>
             <w:tcBorders>
               <w:top w:val="single" w:sz="12" w:space="0" w:color="000000"/>
               <w:left w:val="single" w:sz="12" w:space="0" w:color="000000"/>
@@ -16153,7 +16055,7 @@
         </w:tc>
         <w:tc>
           <w:tcPr>
-            <w:tcW w:w="2691" w:type="dxa"/>
+            <w:tcW w:w="2692" w:type="dxa"/>
             <w:tcBorders>
               <w:top w:val="single" w:sz="12" w:space="0" w:color="000000"/>
               <w:left w:val="single" w:sz="6" w:space="0" w:color="000000"/>
@@ -16402,7 +16304,7 @@
         </w:trPr>
         <w:tc>
           <w:tcPr>
-            <w:tcW w:w="1312" w:type="dxa"/>
+            <w:tcW w:w="1311" w:type="dxa"/>
             <w:tcBorders>
               <w:top w:val="nil"/>
               <w:left w:val="single" w:sz="8" w:space="0" w:color="000000"/>
@@ -16441,7 +16343,7 @@
         </w:tc>
         <w:tc>
           <w:tcPr>
-            <w:tcW w:w="2691" w:type="dxa"/>
+            <w:tcW w:w="2692" w:type="dxa"/>
             <w:tcBorders>
               <w:top w:val="nil"/>
               <w:left w:val="nil"/>
@@ -16672,7 +16574,7 @@
         </w:trPr>
         <w:tc>
           <w:tcPr>
-            <w:tcW w:w="1312" w:type="dxa"/>
+            <w:tcW w:w="1311" w:type="dxa"/>
             <w:tcBorders>
               <w:top w:val="nil"/>
               <w:left w:val="single" w:sz="8" w:space="0" w:color="000000"/>
@@ -16711,7 +16613,7 @@
         </w:tc>
         <w:tc>
           <w:tcPr>
-            <w:tcW w:w="2691" w:type="dxa"/>
+            <w:tcW w:w="2692" w:type="dxa"/>
             <w:tcBorders>
               <w:top w:val="nil"/>
               <w:left w:val="nil"/>
@@ -16943,7 +16845,7 @@
         </w:trPr>
         <w:tc>
           <w:tcPr>
-            <w:tcW w:w="1312" w:type="dxa"/>
+            <w:tcW w:w="1311" w:type="dxa"/>
             <w:tcBorders>
               <w:top w:val="single" w:sz="8" w:space="0" w:color="000000"/>
               <w:left w:val="single" w:sz="8" w:space="0" w:color="000000"/>
@@ -16982,7 +16884,7 @@
         </w:tc>
         <w:tc>
           <w:tcPr>
-            <w:tcW w:w="2691" w:type="dxa"/>
+            <w:tcW w:w="2692" w:type="dxa"/>
             <w:tcBorders>
               <w:top w:val="single" w:sz="8" w:space="0" w:color="000000"/>
               <w:left w:val="single" w:sz="8" w:space="0" w:color="000000"/>
@@ -17213,7 +17115,7 @@
         </w:trPr>
         <w:tc>
           <w:tcPr>
-            <w:tcW w:w="1312" w:type="dxa"/>
+            <w:tcW w:w="1311" w:type="dxa"/>
             <w:tcBorders>
               <w:top w:val="nil"/>
               <w:left w:val="single" w:sz="8" w:space="0" w:color="000000"/>
@@ -17298,7 +17200,7 @@
         </w:tc>
         <w:tc>
           <w:tcPr>
-            <w:tcW w:w="2691" w:type="dxa"/>
+            <w:tcW w:w="2692" w:type="dxa"/>
             <w:tcBorders>
               <w:top w:val="single" w:sz="8" w:space="0" w:color="000000"/>
               <w:left w:val="nil"/>
@@ -17651,19 +17553,7 @@
         <w:rPr>
           <w:b/>
         </w:rPr>
-        <w:t>{{na</w:t>
-      </w:r>
-      <w:r>
-        <w:rPr>
-          <w:b/>
-        </w:rPr>
-        <w:t>7</w:t>
-      </w:r>
-      <w:r>
-        <w:rPr>
-          <w:b/>
-        </w:rPr>
-        <w:t xml:space="preserve">-2}}          </w:t>
+        <w:t xml:space="preserve">{{na7-2}}          </w:t>
         <w:tab/>
       </w:r>
     </w:p>
@@ -17681,15 +17571,7 @@
       <w:r>
         <w:rPr/>
         <w:tab/>
-        <w:t>{{na</w:t>
-      </w:r>
-      <w:r>
-        <w:rPr/>
-        <w:t>8</w:t>
-      </w:r>
-      <w:r>
-        <w:rPr/>
-        <w:t>-1}}</w:t>
+        <w:t>{{na8-1}}</w:t>
       </w:r>
     </w:p>
     <w:p>
@@ -17755,8 +17637,8 @@
         <w:tblLook w:val="0000" w:noHBand="0" w:noVBand="0" w:firstColumn="0" w:lastRow="0" w:lastColumn="0" w:firstRow="0"/>
       </w:tblPr>
       <w:tblGrid>
-        <w:gridCol w:w="1377"/>
-        <w:gridCol w:w="2691"/>
+        <w:gridCol w:w="1376"/>
+        <w:gridCol w:w="2692"/>
         <w:gridCol w:w="1003"/>
         <w:gridCol w:w="1078"/>
         <w:gridCol w:w="1078"/>
@@ -17971,7 +17853,7 @@
         </w:trPr>
         <w:tc>
           <w:tcPr>
-            <w:tcW w:w="1377" w:type="dxa"/>
+            <w:tcW w:w="1376" w:type="dxa"/>
             <w:tcBorders>
               <w:top w:val="single" w:sz="12" w:space="0" w:color="000000"/>
               <w:left w:val="single" w:sz="12" w:space="0" w:color="000000"/>
@@ -18011,7 +17893,7 @@
         </w:tc>
         <w:tc>
           <w:tcPr>
-            <w:tcW w:w="2691" w:type="dxa"/>
+            <w:tcW w:w="2692" w:type="dxa"/>
             <w:tcBorders>
               <w:top w:val="single" w:sz="12" w:space="0" w:color="000000"/>
               <w:left w:val="single" w:sz="6" w:space="0" w:color="000000"/>
@@ -18260,7 +18142,7 @@
         </w:trPr>
         <w:tc>
           <w:tcPr>
-            <w:tcW w:w="1377" w:type="dxa"/>
+            <w:tcW w:w="1376" w:type="dxa"/>
             <w:tcBorders>
               <w:top w:val="nil"/>
               <w:left w:val="single" w:sz="8" w:space="0" w:color="000000"/>
@@ -18299,7 +18181,7 @@
         </w:tc>
         <w:tc>
           <w:tcPr>
-            <w:tcW w:w="2691" w:type="dxa"/>
+            <w:tcW w:w="2692" w:type="dxa"/>
             <w:tcBorders>
               <w:top w:val="nil"/>
               <w:left w:val="nil"/>
@@ -18529,7 +18411,7 @@
         </w:trPr>
         <w:tc>
           <w:tcPr>
-            <w:tcW w:w="1377" w:type="dxa"/>
+            <w:tcW w:w="1376" w:type="dxa"/>
             <w:tcBorders>
               <w:top w:val="nil"/>
               <w:left w:val="single" w:sz="8" w:space="0" w:color="000000"/>
@@ -18568,7 +18450,7 @@
         </w:tc>
         <w:tc>
           <w:tcPr>
-            <w:tcW w:w="2691" w:type="dxa"/>
+            <w:tcW w:w="2692" w:type="dxa"/>
             <w:tcBorders>
               <w:top w:val="single" w:sz="8" w:space="0" w:color="000000"/>
               <w:left w:val="nil"/>
@@ -18798,7 +18680,7 @@
         </w:trPr>
         <w:tc>
           <w:tcPr>
-            <w:tcW w:w="1377" w:type="dxa"/>
+            <w:tcW w:w="1376" w:type="dxa"/>
             <w:tcBorders>
               <w:top w:val="single" w:sz="8" w:space="0" w:color="000000"/>
               <w:left w:val="single" w:sz="8" w:space="0" w:color="000000"/>
@@ -18837,7 +18719,7 @@
         </w:tc>
         <w:tc>
           <w:tcPr>
-            <w:tcW w:w="2691" w:type="dxa"/>
+            <w:tcW w:w="2692" w:type="dxa"/>
             <w:tcBorders>
               <w:top w:val="single" w:sz="8" w:space="0" w:color="000000"/>
               <w:left w:val="nil"/>
@@ -19067,7 +18949,7 @@
         </w:trPr>
         <w:tc>
           <w:tcPr>
-            <w:tcW w:w="1377" w:type="dxa"/>
+            <w:tcW w:w="1376" w:type="dxa"/>
             <w:tcBorders>
               <w:top w:val="single" w:sz="8" w:space="0" w:color="000000"/>
               <w:left w:val="single" w:sz="8" w:space="0" w:color="000000"/>
@@ -19106,7 +18988,7 @@
         </w:tc>
         <w:tc>
           <w:tcPr>
-            <w:tcW w:w="2691" w:type="dxa"/>
+            <w:tcW w:w="2692" w:type="dxa"/>
             <w:tcBorders>
               <w:top w:val="single" w:sz="8" w:space="0" w:color="000000"/>
               <w:left w:val="nil"/>
@@ -19336,7 +19218,7 @@
         </w:trPr>
         <w:tc>
           <w:tcPr>
-            <w:tcW w:w="1377" w:type="dxa"/>
+            <w:tcW w:w="1376" w:type="dxa"/>
             <w:tcBorders>
               <w:top w:val="nil"/>
               <w:left w:val="single" w:sz="8" w:space="0" w:color="000000"/>
@@ -19375,7 +19257,7 @@
         </w:tc>
         <w:tc>
           <w:tcPr>
-            <w:tcW w:w="2691" w:type="dxa"/>
+            <w:tcW w:w="2692" w:type="dxa"/>
             <w:tcBorders>
               <w:top w:val="nil"/>
               <w:left w:val="nil"/>
@@ -19605,7 +19487,7 @@
         </w:trPr>
         <w:tc>
           <w:tcPr>
-            <w:tcW w:w="1377" w:type="dxa"/>
+            <w:tcW w:w="1376" w:type="dxa"/>
             <w:tcBorders>
               <w:top w:val="nil"/>
               <w:left w:val="single" w:sz="8" w:space="0" w:color="000000"/>
@@ -19644,7 +19526,7 @@
         </w:tc>
         <w:tc>
           <w:tcPr>
-            <w:tcW w:w="2691" w:type="dxa"/>
+            <w:tcW w:w="2692" w:type="dxa"/>
             <w:tcBorders>
               <w:top w:val="nil"/>
               <w:left w:val="nil"/>
@@ -19873,7 +19755,7 @@
         </w:trPr>
         <w:tc>
           <w:tcPr>
-            <w:tcW w:w="1377" w:type="dxa"/>
+            <w:tcW w:w="1376" w:type="dxa"/>
             <w:tcBorders>
               <w:top w:val="nil"/>
               <w:left w:val="single" w:sz="8" w:space="0" w:color="000000"/>
@@ -19912,7 +19794,7 @@
         </w:tc>
         <w:tc>
           <w:tcPr>
-            <w:tcW w:w="2691" w:type="dxa"/>
+            <w:tcW w:w="2692" w:type="dxa"/>
             <w:tcBorders>
               <w:top w:val="nil"/>
               <w:left w:val="nil"/>
@@ -20150,19 +20032,7 @@
         <w:rPr>
           <w:b/>
         </w:rPr>
-        <w:t>{{na</w:t>
-      </w:r>
-      <w:r>
-        <w:rPr>
-          <w:b/>
-        </w:rPr>
-        <w:t>8</w:t>
-      </w:r>
-      <w:r>
-        <w:rPr>
-          <w:b/>
-        </w:rPr>
-        <w:t xml:space="preserve">-2}}          </w:t>
+        <w:t xml:space="preserve">{{na8-2}}          </w:t>
         <w:tab/>
       </w:r>
     </w:p>
@@ -20180,15 +20050,7 @@
       <w:r>
         <w:rPr/>
         <w:tab/>
-        <w:t>{{na</w:t>
-      </w:r>
-      <w:r>
-        <w:rPr/>
-        <w:t>11</w:t>
-      </w:r>
-      <w:r>
-        <w:rPr/>
-        <w:t>-1}}</w:t>
+        <w:t>{{na11-1}}</w:t>
       </w:r>
     </w:p>
     <w:p>
@@ -22218,19 +22080,7 @@
         <w:rPr>
           <w:b/>
         </w:rPr>
-        <w:t>{{na1</w:t>
-      </w:r>
-      <w:r>
-        <w:rPr>
-          <w:b/>
-        </w:rPr>
-        <w:t>1</w:t>
-      </w:r>
-      <w:r>
-        <w:rPr>
-          <w:b/>
-        </w:rPr>
-        <w:t xml:space="preserve">-2}}          </w:t>
+        <w:t xml:space="preserve">{{na11-2}}          </w:t>
         <w:tab/>
       </w:r>
     </w:p>
@@ -22248,15 +22098,7 @@
       <w:r>
         <w:rPr/>
         <w:tab/>
-        <w:t>{{na</w:t>
-      </w:r>
-      <w:r>
-        <w:rPr/>
-        <w:t>1</w:t>
-      </w:r>
-      <w:r>
-        <w:rPr/>
-        <w:t>2-1}}</w:t>
+        <w:t>{{na12-1}}</w:t>
       </w:r>
     </w:p>
     <w:p>
@@ -23644,15 +23486,7 @@
       </w:pPr>
       <w:r>
         <w:rPr/>
-        <w:t>{{na1</w:t>
-      </w:r>
-      <w:r>
-        <w:rPr/>
-        <w:t>2</w:t>
-      </w:r>
-      <w:r>
-        <w:rPr/>
-        <w:t xml:space="preserve">-2}}          </w:t>
+        <w:t xml:space="preserve">{{na12-2}}          </w:t>
         <w:tab/>
       </w:r>
     </w:p>
@@ -23670,15 +23504,7 @@
       <w:r>
         <w:rPr/>
         <w:tab/>
-        <w:t>{{na</w:t>
-      </w:r>
-      <w:r>
-        <w:rPr/>
-        <w:t>13</w:t>
-      </w:r>
-      <w:r>
-        <w:rPr/>
-        <w:t>-1}}</w:t>
+        <w:t>{{na13-1}}</w:t>
       </w:r>
     </w:p>
     <w:p>
@@ -23766,12 +23592,12 @@
       </w:tblPr>
       <w:tblGrid>
         <w:gridCol w:w="1059"/>
-        <w:gridCol w:w="3056"/>
-        <w:gridCol w:w="901"/>
+        <w:gridCol w:w="3055"/>
+        <w:gridCol w:w="902"/>
         <w:gridCol w:w="1067"/>
         <w:gridCol w:w="1005"/>
-        <w:gridCol w:w="628"/>
-        <w:gridCol w:w="2727"/>
+        <w:gridCol w:w="629"/>
+        <w:gridCol w:w="2726"/>
       </w:tblGrid>
       <w:tr>
         <w:trPr>
@@ -23903,7 +23729,7 @@
         </w:tc>
         <w:tc>
           <w:tcPr>
-            <w:tcW w:w="628" w:type="dxa"/>
+            <w:tcW w:w="629" w:type="dxa"/>
             <w:tcBorders>
               <w:top w:val="nil"/>
               <w:left w:val="nil"/>
@@ -23938,7 +23764,7 @@
         </w:tc>
         <w:tc>
           <w:tcPr>
-            <w:tcW w:w="2727" w:type="dxa"/>
+            <w:tcW w:w="2726" w:type="dxa"/>
             <w:tcBorders>
               <w:top w:val="nil"/>
               <w:left w:val="nil"/>
@@ -24019,7 +23845,7 @@
         </w:tc>
         <w:tc>
           <w:tcPr>
-            <w:tcW w:w="3056" w:type="dxa"/>
+            <w:tcW w:w="3055" w:type="dxa"/>
             <w:tcBorders>
               <w:top w:val="single" w:sz="12" w:space="0" w:color="000000"/>
               <w:left w:val="single" w:sz="6" w:space="0" w:color="000000"/>
@@ -24059,7 +23885,7 @@
         </w:tc>
         <w:tc>
           <w:tcPr>
-            <w:tcW w:w="901" w:type="dxa"/>
+            <w:tcW w:w="902" w:type="dxa"/>
             <w:tcBorders>
               <w:top w:val="single" w:sz="12" w:space="0" w:color="000000"/>
               <w:left w:val="single" w:sz="6" w:space="0" w:color="000000"/>
@@ -24181,7 +24007,7 @@
         </w:tc>
         <w:tc>
           <w:tcPr>
-            <w:tcW w:w="628" w:type="dxa"/>
+            <w:tcW w:w="629" w:type="dxa"/>
             <w:tcBorders>
               <w:top w:val="single" w:sz="12" w:space="0" w:color="000000"/>
               <w:left w:val="single" w:sz="6" w:space="0" w:color="000000"/>
@@ -24222,7 +24048,7 @@
         </w:tc>
         <w:tc>
           <w:tcPr>
-            <w:tcW w:w="2727" w:type="dxa"/>
+            <w:tcW w:w="2726" w:type="dxa"/>
             <w:tcBorders>
               <w:top w:val="single" w:sz="12" w:space="0" w:color="000000"/>
               <w:left w:val="single" w:sz="6" w:space="0" w:color="000000"/>
@@ -24306,7 +24132,7 @@
         </w:tc>
         <w:tc>
           <w:tcPr>
-            <w:tcW w:w="3056" w:type="dxa"/>
+            <w:tcW w:w="3055" w:type="dxa"/>
             <w:tcBorders>
               <w:top w:val="single" w:sz="8" w:space="0" w:color="000000"/>
               <w:left w:val="nil"/>
@@ -24345,7 +24171,7 @@
         </w:tc>
         <w:tc>
           <w:tcPr>
-            <w:tcW w:w="901" w:type="dxa"/>
+            <w:tcW w:w="902" w:type="dxa"/>
             <w:tcBorders>
               <w:top w:val="nil"/>
               <w:left w:val="nil"/>
@@ -24462,7 +24288,7 @@
         </w:tc>
         <w:tc>
           <w:tcPr>
-            <w:tcW w:w="628" w:type="dxa"/>
+            <w:tcW w:w="629" w:type="dxa"/>
             <w:tcBorders>
               <w:top w:val="single" w:sz="12" w:space="0" w:color="000000"/>
               <w:left w:val="single" w:sz="8" w:space="0" w:color="000000"/>
@@ -24495,7 +24321,7 @@
         </w:tc>
         <w:tc>
           <w:tcPr>
-            <w:tcW w:w="2727" w:type="dxa"/>
+            <w:tcW w:w="2726" w:type="dxa"/>
             <w:tcBorders>
               <w:top w:val="single" w:sz="12" w:space="0" w:color="000000"/>
               <w:left w:val="single" w:sz="8" w:space="0" w:color="000000"/>
@@ -24575,7 +24401,7 @@
         </w:tc>
         <w:tc>
           <w:tcPr>
-            <w:tcW w:w="3056" w:type="dxa"/>
+            <w:tcW w:w="3055" w:type="dxa"/>
             <w:tcBorders>
               <w:top w:val="single" w:sz="8" w:space="0" w:color="000000"/>
               <w:left w:val="single" w:sz="8" w:space="0" w:color="000000"/>
@@ -24614,7 +24440,7 @@
         </w:tc>
         <w:tc>
           <w:tcPr>
-            <w:tcW w:w="901" w:type="dxa"/>
+            <w:tcW w:w="902" w:type="dxa"/>
             <w:tcBorders>
               <w:top w:val="single" w:sz="8" w:space="0" w:color="000000"/>
               <w:left w:val="single" w:sz="8" w:space="0" w:color="000000"/>
@@ -24731,7 +24557,7 @@
         </w:tc>
         <w:tc>
           <w:tcPr>
-            <w:tcW w:w="628" w:type="dxa"/>
+            <w:tcW w:w="629" w:type="dxa"/>
             <w:tcBorders>
               <w:top w:val="single" w:sz="8" w:space="0" w:color="000000"/>
               <w:left w:val="single" w:sz="8" w:space="0" w:color="000000"/>
@@ -24764,7 +24590,7 @@
         </w:tc>
         <w:tc>
           <w:tcPr>
-            <w:tcW w:w="2727" w:type="dxa"/>
+            <w:tcW w:w="2726" w:type="dxa"/>
             <w:tcBorders>
               <w:top w:val="single" w:sz="8" w:space="0" w:color="000000"/>
               <w:left w:val="single" w:sz="8" w:space="0" w:color="000000"/>
@@ -24843,7 +24669,7 @@
         </w:tc>
         <w:tc>
           <w:tcPr>
-            <w:tcW w:w="3056" w:type="dxa"/>
+            <w:tcW w:w="3055" w:type="dxa"/>
             <w:tcBorders>
               <w:top w:val="single" w:sz="8" w:space="0" w:color="000000"/>
               <w:left w:val="single" w:sz="8" w:space="0" w:color="000000"/>
@@ -24882,7 +24708,7 @@
         </w:tc>
         <w:tc>
           <w:tcPr>
-            <w:tcW w:w="901" w:type="dxa"/>
+            <w:tcW w:w="902" w:type="dxa"/>
             <w:tcBorders>
               <w:top w:val="single" w:sz="8" w:space="0" w:color="000000"/>
               <w:left w:val="single" w:sz="8" w:space="0" w:color="000000"/>
@@ -24999,7 +24825,7 @@
         </w:tc>
         <w:tc>
           <w:tcPr>
-            <w:tcW w:w="628" w:type="dxa"/>
+            <w:tcW w:w="629" w:type="dxa"/>
             <w:tcBorders>
               <w:top w:val="single" w:sz="8" w:space="0" w:color="000000"/>
               <w:left w:val="single" w:sz="8" w:space="0" w:color="000000"/>
@@ -25032,7 +24858,7 @@
         </w:tc>
         <w:tc>
           <w:tcPr>
-            <w:tcW w:w="2727" w:type="dxa"/>
+            <w:tcW w:w="2726" w:type="dxa"/>
             <w:tcBorders>
               <w:top w:val="single" w:sz="8" w:space="0" w:color="000000"/>
               <w:left w:val="single" w:sz="8" w:space="0" w:color="000000"/>
@@ -25111,7 +24937,7 @@
         </w:tc>
         <w:tc>
           <w:tcPr>
-            <w:tcW w:w="3056" w:type="dxa"/>
+            <w:tcW w:w="3055" w:type="dxa"/>
             <w:tcBorders>
               <w:top w:val="single" w:sz="8" w:space="0" w:color="000000"/>
               <w:left w:val="single" w:sz="8" w:space="0" w:color="000000"/>
@@ -25150,7 +24976,7 @@
         </w:tc>
         <w:tc>
           <w:tcPr>
-            <w:tcW w:w="901" w:type="dxa"/>
+            <w:tcW w:w="902" w:type="dxa"/>
             <w:tcBorders>
               <w:top w:val="single" w:sz="8" w:space="0" w:color="000000"/>
               <w:left w:val="single" w:sz="8" w:space="0" w:color="000000"/>
@@ -25267,7 +25093,7 @@
         </w:tc>
         <w:tc>
           <w:tcPr>
-            <w:tcW w:w="628" w:type="dxa"/>
+            <w:tcW w:w="629" w:type="dxa"/>
             <w:tcBorders>
               <w:top w:val="single" w:sz="8" w:space="0" w:color="000000"/>
               <w:left w:val="single" w:sz="8" w:space="0" w:color="000000"/>
@@ -25300,7 +25126,7 @@
         </w:tc>
         <w:tc>
           <w:tcPr>
-            <w:tcW w:w="2727" w:type="dxa"/>
+            <w:tcW w:w="2726" w:type="dxa"/>
             <w:tcBorders>
               <w:top w:val="single" w:sz="8" w:space="0" w:color="000000"/>
               <w:left w:val="single" w:sz="8" w:space="0" w:color="000000"/>
@@ -25379,7 +25205,7 @@
         </w:tc>
         <w:tc>
           <w:tcPr>
-            <w:tcW w:w="3056" w:type="dxa"/>
+            <w:tcW w:w="3055" w:type="dxa"/>
             <w:tcBorders>
               <w:top w:val="single" w:sz="8" w:space="0" w:color="000000"/>
               <w:left w:val="single" w:sz="8" w:space="0" w:color="000000"/>
@@ -25418,7 +25244,7 @@
         </w:tc>
         <w:tc>
           <w:tcPr>
-            <w:tcW w:w="901" w:type="dxa"/>
+            <w:tcW w:w="902" w:type="dxa"/>
             <w:tcBorders>
               <w:top w:val="single" w:sz="8" w:space="0" w:color="000000"/>
               <w:left w:val="single" w:sz="8" w:space="0" w:color="000000"/>
@@ -25535,7 +25361,7 @@
         </w:tc>
         <w:tc>
           <w:tcPr>
-            <w:tcW w:w="628" w:type="dxa"/>
+            <w:tcW w:w="629" w:type="dxa"/>
             <w:tcBorders>
               <w:top w:val="single" w:sz="8" w:space="0" w:color="000000"/>
               <w:left w:val="single" w:sz="8" w:space="0" w:color="000000"/>
@@ -25568,7 +25394,7 @@
         </w:tc>
         <w:tc>
           <w:tcPr>
-            <w:tcW w:w="2727" w:type="dxa"/>
+            <w:tcW w:w="2726" w:type="dxa"/>
             <w:tcBorders>
               <w:top w:val="single" w:sz="8" w:space="0" w:color="000000"/>
               <w:left w:val="single" w:sz="8" w:space="0" w:color="000000"/>
@@ -25647,7 +25473,7 @@
         </w:tc>
         <w:tc>
           <w:tcPr>
-            <w:tcW w:w="3056" w:type="dxa"/>
+            <w:tcW w:w="3055" w:type="dxa"/>
             <w:tcBorders>
               <w:top w:val="single" w:sz="8" w:space="0" w:color="000000"/>
               <w:left w:val="single" w:sz="8" w:space="0" w:color="000000"/>
@@ -25686,7 +25512,7 @@
         </w:tc>
         <w:tc>
           <w:tcPr>
-            <w:tcW w:w="901" w:type="dxa"/>
+            <w:tcW w:w="902" w:type="dxa"/>
             <w:tcBorders>
               <w:top w:val="single" w:sz="8" w:space="0" w:color="000000"/>
               <w:left w:val="single" w:sz="8" w:space="0" w:color="000000"/>
@@ -25803,7 +25629,7 @@
         </w:tc>
         <w:tc>
           <w:tcPr>
-            <w:tcW w:w="628" w:type="dxa"/>
+            <w:tcW w:w="629" w:type="dxa"/>
             <w:tcBorders>
               <w:top w:val="single" w:sz="8" w:space="0" w:color="000000"/>
               <w:left w:val="single" w:sz="8" w:space="0" w:color="000000"/>
@@ -25836,7 +25662,7 @@
         </w:tc>
         <w:tc>
           <w:tcPr>
-            <w:tcW w:w="2727" w:type="dxa"/>
+            <w:tcW w:w="2726" w:type="dxa"/>
             <w:tcBorders>
               <w:top w:val="single" w:sz="8" w:space="0" w:color="000000"/>
               <w:left w:val="single" w:sz="8" w:space="0" w:color="000000"/>
@@ -25915,7 +25741,7 @@
         </w:tc>
         <w:tc>
           <w:tcPr>
-            <w:tcW w:w="3056" w:type="dxa"/>
+            <w:tcW w:w="3055" w:type="dxa"/>
             <w:tcBorders>
               <w:top w:val="single" w:sz="8" w:space="0" w:color="000000"/>
               <w:left w:val="single" w:sz="8" w:space="0" w:color="000000"/>
@@ -25954,7 +25780,7 @@
         </w:tc>
         <w:tc>
           <w:tcPr>
-            <w:tcW w:w="901" w:type="dxa"/>
+            <w:tcW w:w="902" w:type="dxa"/>
             <w:tcBorders>
               <w:top w:val="single" w:sz="8" w:space="0" w:color="000000"/>
               <w:left w:val="single" w:sz="8" w:space="0" w:color="000000"/>
@@ -26072,7 +25898,7 @@
         </w:tc>
         <w:tc>
           <w:tcPr>
-            <w:tcW w:w="628" w:type="dxa"/>
+            <w:tcW w:w="629" w:type="dxa"/>
             <w:tcBorders>
               <w:top w:val="single" w:sz="8" w:space="0" w:color="000000"/>
               <w:left w:val="single" w:sz="8" w:space="0" w:color="000000"/>
@@ -26105,7 +25931,7 @@
         </w:tc>
         <w:tc>
           <w:tcPr>
-            <w:tcW w:w="2727" w:type="dxa"/>
+            <w:tcW w:w="2726" w:type="dxa"/>
             <w:tcBorders>
               <w:top w:val="single" w:sz="8" w:space="0" w:color="000000"/>
               <w:left w:val="single" w:sz="8" w:space="0" w:color="000000"/>
@@ -26184,7 +26010,7 @@
         </w:tc>
         <w:tc>
           <w:tcPr>
-            <w:tcW w:w="3056" w:type="dxa"/>
+            <w:tcW w:w="3055" w:type="dxa"/>
             <w:tcBorders>
               <w:top w:val="single" w:sz="8" w:space="0" w:color="000000"/>
               <w:left w:val="single" w:sz="8" w:space="0" w:color="000000"/>
@@ -26223,7 +26049,7 @@
         </w:tc>
         <w:tc>
           <w:tcPr>
-            <w:tcW w:w="901" w:type="dxa"/>
+            <w:tcW w:w="902" w:type="dxa"/>
             <w:tcBorders>
               <w:top w:val="single" w:sz="8" w:space="0" w:color="000000"/>
               <w:left w:val="single" w:sz="8" w:space="0" w:color="000000"/>
@@ -26340,7 +26166,7 @@
         </w:tc>
         <w:tc>
           <w:tcPr>
-            <w:tcW w:w="628" w:type="dxa"/>
+            <w:tcW w:w="629" w:type="dxa"/>
             <w:tcBorders>
               <w:top w:val="single" w:sz="8" w:space="0" w:color="000000"/>
               <w:left w:val="single" w:sz="8" w:space="0" w:color="000000"/>
@@ -26373,7 +26199,7 @@
         </w:tc>
         <w:tc>
           <w:tcPr>
-            <w:tcW w:w="2727" w:type="dxa"/>
+            <w:tcW w:w="2726" w:type="dxa"/>
             <w:tcBorders>
               <w:top w:val="single" w:sz="8" w:space="0" w:color="000000"/>
               <w:left w:val="single" w:sz="8" w:space="0" w:color="000000"/>
@@ -26453,7 +26279,7 @@
         </w:tc>
         <w:tc>
           <w:tcPr>
-            <w:tcW w:w="3056" w:type="dxa"/>
+            <w:tcW w:w="3055" w:type="dxa"/>
             <w:tcBorders>
               <w:top w:val="single" w:sz="8" w:space="0" w:color="000000"/>
               <w:left w:val="single" w:sz="8" w:space="0" w:color="000000"/>
@@ -26491,7 +26317,7 @@
         </w:tc>
         <w:tc>
           <w:tcPr>
-            <w:tcW w:w="901" w:type="dxa"/>
+            <w:tcW w:w="902" w:type="dxa"/>
             <w:tcBorders>
               <w:top w:val="single" w:sz="8" w:space="0" w:color="000000"/>
               <w:left w:val="single" w:sz="8" w:space="0" w:color="000000"/>
@@ -26609,7 +26435,7 @@
         </w:tc>
         <w:tc>
           <w:tcPr>
-            <w:tcW w:w="628" w:type="dxa"/>
+            <w:tcW w:w="629" w:type="dxa"/>
             <w:tcBorders>
               <w:top w:val="single" w:sz="8" w:space="0" w:color="000000"/>
               <w:left w:val="single" w:sz="8" w:space="0" w:color="000000"/>
@@ -26642,7 +26468,7 @@
         </w:tc>
         <w:tc>
           <w:tcPr>
-            <w:tcW w:w="2727" w:type="dxa"/>
+            <w:tcW w:w="2726" w:type="dxa"/>
             <w:tcBorders>
               <w:top w:val="single" w:sz="8" w:space="0" w:color="000000"/>
               <w:left w:val="single" w:sz="8" w:space="0" w:color="000000"/>
@@ -26721,7 +26547,7 @@
         </w:tc>
         <w:tc>
           <w:tcPr>
-            <w:tcW w:w="3056" w:type="dxa"/>
+            <w:tcW w:w="3055" w:type="dxa"/>
             <w:tcBorders>
               <w:top w:val="single" w:sz="8" w:space="0" w:color="000000"/>
               <w:left w:val="single" w:sz="8" w:space="0" w:color="000000"/>
@@ -26759,7 +26585,7 @@
         </w:tc>
         <w:tc>
           <w:tcPr>
-            <w:tcW w:w="901" w:type="dxa"/>
+            <w:tcW w:w="902" w:type="dxa"/>
             <w:tcBorders>
               <w:top w:val="single" w:sz="8" w:space="0" w:color="000000"/>
               <w:left w:val="single" w:sz="8" w:space="0" w:color="000000"/>
@@ -26877,7 +26703,7 @@
         </w:tc>
         <w:tc>
           <w:tcPr>
-            <w:tcW w:w="628" w:type="dxa"/>
+            <w:tcW w:w="629" w:type="dxa"/>
             <w:tcBorders>
               <w:top w:val="single" w:sz="8" w:space="0" w:color="000000"/>
               <w:left w:val="single" w:sz="8" w:space="0" w:color="000000"/>
@@ -26910,7 +26736,7 @@
         </w:tc>
         <w:tc>
           <w:tcPr>
-            <w:tcW w:w="2727" w:type="dxa"/>
+            <w:tcW w:w="2726" w:type="dxa"/>
             <w:tcBorders>
               <w:top w:val="single" w:sz="8" w:space="0" w:color="000000"/>
               <w:left w:val="single" w:sz="8" w:space="0" w:color="000000"/>
@@ -26989,7 +26815,7 @@
         </w:tc>
         <w:tc>
           <w:tcPr>
-            <w:tcW w:w="3056" w:type="dxa"/>
+            <w:tcW w:w="3055" w:type="dxa"/>
             <w:tcBorders>
               <w:top w:val="single" w:sz="8" w:space="0" w:color="000000"/>
               <w:left w:val="single" w:sz="8" w:space="0" w:color="000000"/>
@@ -27028,7 +26854,7 @@
         </w:tc>
         <w:tc>
           <w:tcPr>
-            <w:tcW w:w="901" w:type="dxa"/>
+            <w:tcW w:w="902" w:type="dxa"/>
             <w:tcBorders>
               <w:top w:val="single" w:sz="8" w:space="0" w:color="000000"/>
               <w:left w:val="single" w:sz="8" w:space="0" w:color="000000"/>
@@ -27146,7 +26972,7 @@
         </w:tc>
         <w:tc>
           <w:tcPr>
-            <w:tcW w:w="628" w:type="dxa"/>
+            <w:tcW w:w="629" w:type="dxa"/>
             <w:tcBorders>
               <w:top w:val="single" w:sz="8" w:space="0" w:color="000000"/>
               <w:left w:val="single" w:sz="8" w:space="0" w:color="000000"/>
@@ -27179,7 +27005,7 @@
         </w:tc>
         <w:tc>
           <w:tcPr>
-            <w:tcW w:w="2727" w:type="dxa"/>
+            <w:tcW w:w="2726" w:type="dxa"/>
             <w:tcBorders>
               <w:top w:val="single" w:sz="8" w:space="0" w:color="000000"/>
               <w:left w:val="single" w:sz="8" w:space="0" w:color="000000"/>
@@ -27258,7 +27084,7 @@
         </w:tc>
         <w:tc>
           <w:tcPr>
-            <w:tcW w:w="3056" w:type="dxa"/>
+            <w:tcW w:w="3055" w:type="dxa"/>
             <w:tcBorders>
               <w:top w:val="single" w:sz="8" w:space="0" w:color="000000"/>
               <w:left w:val="single" w:sz="8" w:space="0" w:color="000000"/>
@@ -27296,7 +27122,7 @@
         </w:tc>
         <w:tc>
           <w:tcPr>
-            <w:tcW w:w="901" w:type="dxa"/>
+            <w:tcW w:w="902" w:type="dxa"/>
             <w:tcBorders>
               <w:top w:val="single" w:sz="8" w:space="0" w:color="000000"/>
               <w:left w:val="single" w:sz="8" w:space="0" w:color="000000"/>
@@ -27414,7 +27240,7 @@
         </w:tc>
         <w:tc>
           <w:tcPr>
-            <w:tcW w:w="628" w:type="dxa"/>
+            <w:tcW w:w="629" w:type="dxa"/>
             <w:tcBorders>
               <w:top w:val="single" w:sz="8" w:space="0" w:color="000000"/>
               <w:left w:val="single" w:sz="8" w:space="0" w:color="000000"/>
@@ -27447,7 +27273,7 @@
         </w:tc>
         <w:tc>
           <w:tcPr>
-            <w:tcW w:w="2727" w:type="dxa"/>
+            <w:tcW w:w="2726" w:type="dxa"/>
             <w:tcBorders>
               <w:top w:val="single" w:sz="8" w:space="0" w:color="000000"/>
               <w:left w:val="single" w:sz="8" w:space="0" w:color="000000"/>
@@ -27526,7 +27352,7 @@
         </w:tc>
         <w:tc>
           <w:tcPr>
-            <w:tcW w:w="3056" w:type="dxa"/>
+            <w:tcW w:w="3055" w:type="dxa"/>
             <w:tcBorders>
               <w:top w:val="single" w:sz="8" w:space="0" w:color="000000"/>
               <w:left w:val="single" w:sz="8" w:space="0" w:color="000000"/>
@@ -27565,7 +27391,7 @@
         </w:tc>
         <w:tc>
           <w:tcPr>
-            <w:tcW w:w="901" w:type="dxa"/>
+            <w:tcW w:w="902" w:type="dxa"/>
             <w:tcBorders>
               <w:top w:val="single" w:sz="8" w:space="0" w:color="000000"/>
               <w:left w:val="single" w:sz="8" w:space="0" w:color="000000"/>
@@ -27682,7 +27508,7 @@
         </w:tc>
         <w:tc>
           <w:tcPr>
-            <w:tcW w:w="628" w:type="dxa"/>
+            <w:tcW w:w="629" w:type="dxa"/>
             <w:tcBorders>
               <w:top w:val="single" w:sz="8" w:space="0" w:color="000000"/>
               <w:left w:val="single" w:sz="8" w:space="0" w:color="000000"/>
@@ -27715,7 +27541,7 @@
         </w:tc>
         <w:tc>
           <w:tcPr>
-            <w:tcW w:w="2727" w:type="dxa"/>
+            <w:tcW w:w="2726" w:type="dxa"/>
             <w:tcBorders>
               <w:top w:val="single" w:sz="8" w:space="0" w:color="000000"/>
               <w:left w:val="single" w:sz="8" w:space="0" w:color="000000"/>
@@ -27794,7 +27620,7 @@
         </w:tc>
         <w:tc>
           <w:tcPr>
-            <w:tcW w:w="3056" w:type="dxa"/>
+            <w:tcW w:w="3055" w:type="dxa"/>
             <w:tcBorders>
               <w:top w:val="single" w:sz="8" w:space="0" w:color="000000"/>
               <w:left w:val="single" w:sz="8" w:space="0" w:color="000000"/>
@@ -27833,7 +27659,7 @@
         </w:tc>
         <w:tc>
           <w:tcPr>
-            <w:tcW w:w="901" w:type="dxa"/>
+            <w:tcW w:w="902" w:type="dxa"/>
             <w:tcBorders>
               <w:top w:val="single" w:sz="8" w:space="0" w:color="000000"/>
               <w:left w:val="single" w:sz="8" w:space="0" w:color="000000"/>
@@ -27950,7 +27776,7 @@
         </w:tc>
         <w:tc>
           <w:tcPr>
-            <w:tcW w:w="628" w:type="dxa"/>
+            <w:tcW w:w="629" w:type="dxa"/>
             <w:tcBorders>
               <w:top w:val="single" w:sz="8" w:space="0" w:color="000000"/>
               <w:left w:val="single" w:sz="8" w:space="0" w:color="000000"/>
@@ -27983,7 +27809,7 @@
         </w:tc>
         <w:tc>
           <w:tcPr>
-            <w:tcW w:w="2727" w:type="dxa"/>
+            <w:tcW w:w="2726" w:type="dxa"/>
             <w:tcBorders>
               <w:top w:val="single" w:sz="8" w:space="0" w:color="000000"/>
               <w:left w:val="single" w:sz="8" w:space="0" w:color="000000"/>
@@ -28054,19 +27880,7 @@
         <w:rPr>
           <w:b/>
         </w:rPr>
-        <w:t>{{na1</w:t>
-      </w:r>
-      <w:r>
-        <w:rPr>
-          <w:b/>
-        </w:rPr>
-        <w:t>3</w:t>
-      </w:r>
-      <w:r>
-        <w:rPr>
-          <w:b/>
-        </w:rPr>
-        <w:t xml:space="preserve">-2}}          </w:t>
+        <w:t xml:space="preserve">{{na13-2}}          </w:t>
         <w:tab/>
       </w:r>
     </w:p>
@@ -28084,15 +27898,7 @@
       <w:r>
         <w:rPr/>
         <w:tab/>
-        <w:t>{{na</w:t>
-      </w:r>
-      <w:r>
-        <w:rPr/>
-        <w:t>14</w:t>
-      </w:r>
-      <w:r>
-        <w:rPr/>
-        <w:t>-1}}</w:t>
+        <w:t>{{na14-1}}</w:t>
       </w:r>
     </w:p>
     <w:p>
@@ -28159,12 +27965,12 @@
       </w:tblPr>
       <w:tblGrid>
         <w:gridCol w:w="1059"/>
-        <w:gridCol w:w="3056"/>
-        <w:gridCol w:w="901"/>
+        <w:gridCol w:w="3055"/>
+        <w:gridCol w:w="902"/>
         <w:gridCol w:w="1078"/>
         <w:gridCol w:w="994"/>
-        <w:gridCol w:w="628"/>
-        <w:gridCol w:w="2727"/>
+        <w:gridCol w:w="629"/>
+        <w:gridCol w:w="2726"/>
       </w:tblGrid>
       <w:tr>
         <w:trPr>
@@ -28297,7 +28103,7 @@
         </w:tc>
         <w:tc>
           <w:tcPr>
-            <w:tcW w:w="628" w:type="dxa"/>
+            <w:tcW w:w="629" w:type="dxa"/>
             <w:tcBorders>
               <w:top w:val="nil"/>
               <w:left w:val="nil"/>
@@ -28332,7 +28138,7 @@
         </w:tc>
         <w:tc>
           <w:tcPr>
-            <w:tcW w:w="2727" w:type="dxa"/>
+            <w:tcW w:w="2726" w:type="dxa"/>
             <w:tcBorders>
               <w:top w:val="nil"/>
               <w:left w:val="nil"/>
@@ -28414,7 +28220,7 @@
         </w:tc>
         <w:tc>
           <w:tcPr>
-            <w:tcW w:w="3056" w:type="dxa"/>
+            <w:tcW w:w="3055" w:type="dxa"/>
             <w:tcBorders>
               <w:top w:val="single" w:sz="12" w:space="0" w:color="000000"/>
               <w:left w:val="single" w:sz="6" w:space="0" w:color="000000"/>
@@ -28454,7 +28260,7 @@
         </w:tc>
         <w:tc>
           <w:tcPr>
-            <w:tcW w:w="901" w:type="dxa"/>
+            <w:tcW w:w="902" w:type="dxa"/>
             <w:tcBorders>
               <w:top w:val="single" w:sz="12" w:space="0" w:color="000000"/>
               <w:left w:val="single" w:sz="6" w:space="0" w:color="000000"/>
@@ -28576,7 +28382,7 @@
         </w:tc>
         <w:tc>
           <w:tcPr>
-            <w:tcW w:w="628" w:type="dxa"/>
+            <w:tcW w:w="629" w:type="dxa"/>
             <w:tcBorders>
               <w:top w:val="single" w:sz="12" w:space="0" w:color="000000"/>
               <w:left w:val="single" w:sz="6" w:space="0" w:color="000000"/>
@@ -28617,7 +28423,7 @@
         </w:tc>
         <w:tc>
           <w:tcPr>
-            <w:tcW w:w="2727" w:type="dxa"/>
+            <w:tcW w:w="2726" w:type="dxa"/>
             <w:tcBorders>
               <w:top w:val="single" w:sz="12" w:space="0" w:color="000000"/>
               <w:left w:val="single" w:sz="6" w:space="0" w:color="000000"/>
@@ -28702,7 +28508,7 @@
         </w:tc>
         <w:tc>
           <w:tcPr>
-            <w:tcW w:w="3056" w:type="dxa"/>
+            <w:tcW w:w="3055" w:type="dxa"/>
             <w:tcBorders>
               <w:top w:val="single" w:sz="8" w:space="0" w:color="000000"/>
               <w:left w:val="nil"/>
@@ -28741,7 +28547,7 @@
         </w:tc>
         <w:tc>
           <w:tcPr>
-            <w:tcW w:w="901" w:type="dxa"/>
+            <w:tcW w:w="902" w:type="dxa"/>
             <w:tcBorders>
               <w:top w:val="nil"/>
               <w:left w:val="nil"/>
@@ -28859,7 +28665,7 @@
         </w:tc>
         <w:tc>
           <w:tcPr>
-            <w:tcW w:w="628" w:type="dxa"/>
+            <w:tcW w:w="629" w:type="dxa"/>
             <w:tcBorders>
               <w:top w:val="single" w:sz="12" w:space="0" w:color="000000"/>
               <w:left w:val="single" w:sz="8" w:space="0" w:color="000000"/>
@@ -28898,7 +28704,7 @@
         </w:tc>
         <w:tc>
           <w:tcPr>
-            <w:tcW w:w="2727" w:type="dxa"/>
+            <w:tcW w:w="2726" w:type="dxa"/>
             <w:tcBorders>
               <w:top w:val="single" w:sz="12" w:space="0" w:color="000000"/>
               <w:left w:val="single" w:sz="8" w:space="0" w:color="000000"/>
@@ -28971,19 +28777,7 @@
         <w:rPr>
           <w:b/>
         </w:rPr>
-        <w:t>{{na1</w:t>
-      </w:r>
-      <w:r>
-        <w:rPr>
-          <w:b/>
-        </w:rPr>
-        <w:t>4</w:t>
-      </w:r>
-      <w:r>
-        <w:rPr>
-          <w:b/>
-        </w:rPr>
-        <w:t xml:space="preserve">-2}}          </w:t>
+        <w:t xml:space="preserve">{{na14-2}}          </w:t>
         <w:tab/>
       </w:r>
     </w:p>
@@ -29001,15 +28795,7 @@
       <w:r>
         <w:rPr/>
         <w:tab/>
-        <w:t>{{na</w:t>
-      </w:r>
-      <w:r>
-        <w:rPr/>
-        <w:t>15</w:t>
-      </w:r>
-      <w:r>
-        <w:rPr/>
-        <w:t>-1}}</w:t>
+        <w:t>{{na15-1}}</w:t>
       </w:r>
     </w:p>
     <w:p>
@@ -29075,12 +28861,12 @@
         <w:tblLook w:val="0000" w:noHBand="0" w:noVBand="0" w:firstColumn="0" w:lastRow="0" w:lastColumn="0" w:firstRow="0"/>
       </w:tblPr>
       <w:tblGrid>
-        <w:gridCol w:w="1077"/>
-        <w:gridCol w:w="3067"/>
+        <w:gridCol w:w="1076"/>
+        <w:gridCol w:w="3068"/>
         <w:gridCol w:w="919"/>
         <w:gridCol w:w="1078"/>
-        <w:gridCol w:w="965"/>
-        <w:gridCol w:w="646"/>
+        <w:gridCol w:w="966"/>
+        <w:gridCol w:w="645"/>
         <w:gridCol w:w="2691"/>
       </w:tblGrid>
       <w:tr>
@@ -29173,7 +28959,7 @@
         </w:tc>
         <w:tc>
           <w:tcPr>
-            <w:tcW w:w="965" w:type="dxa"/>
+            <w:tcW w:w="966" w:type="dxa"/>
             <w:tcBorders>
               <w:top w:val="single" w:sz="12" w:space="0" w:color="000000"/>
               <w:left w:val="single" w:sz="6" w:space="0" w:color="000000"/>
@@ -29214,7 +29000,7 @@
         </w:tc>
         <w:tc>
           <w:tcPr>
-            <w:tcW w:w="646" w:type="dxa"/>
+            <w:tcW w:w="645" w:type="dxa"/>
             <w:tcBorders>
               <w:top w:val="nil"/>
               <w:left w:val="nil"/>
@@ -29291,7 +29077,7 @@
         </w:trPr>
         <w:tc>
           <w:tcPr>
-            <w:tcW w:w="1077" w:type="dxa"/>
+            <w:tcW w:w="1076" w:type="dxa"/>
             <w:tcBorders>
               <w:top w:val="single" w:sz="12" w:space="0" w:color="000000"/>
               <w:left w:val="single" w:sz="12" w:space="0" w:color="000000"/>
@@ -29331,7 +29117,7 @@
         </w:tc>
         <w:tc>
           <w:tcPr>
-            <w:tcW w:w="3067" w:type="dxa"/>
+            <w:tcW w:w="3068" w:type="dxa"/>
             <w:tcBorders>
               <w:top w:val="single" w:sz="12" w:space="0" w:color="000000"/>
               <w:left w:val="single" w:sz="6" w:space="0" w:color="000000"/>
@@ -29452,7 +29238,7 @@
         </w:tc>
         <w:tc>
           <w:tcPr>
-            <w:tcW w:w="965" w:type="dxa"/>
+            <w:tcW w:w="966" w:type="dxa"/>
             <w:tcBorders>
               <w:top w:val="single" w:sz="12" w:space="0" w:color="000000"/>
               <w:left w:val="single" w:sz="6" w:space="0" w:color="000000"/>
@@ -29493,7 +29279,7 @@
         </w:tc>
         <w:tc>
           <w:tcPr>
-            <w:tcW w:w="646" w:type="dxa"/>
+            <w:tcW w:w="645" w:type="dxa"/>
             <w:tcBorders>
               <w:top w:val="single" w:sz="12" w:space="0" w:color="000000"/>
               <w:left w:val="single" w:sz="6" w:space="0" w:color="000000"/>
@@ -29580,7 +29366,7 @@
         </w:trPr>
         <w:tc>
           <w:tcPr>
-            <w:tcW w:w="1077" w:type="dxa"/>
+            <w:tcW w:w="1076" w:type="dxa"/>
             <w:tcBorders>
               <w:top w:val="nil"/>
               <w:left w:val="single" w:sz="8" w:space="0" w:color="000000"/>
@@ -29619,7 +29405,7 @@
         </w:tc>
         <w:tc>
           <w:tcPr>
-            <w:tcW w:w="3067" w:type="dxa"/>
+            <w:tcW w:w="3068" w:type="dxa"/>
             <w:tcBorders>
               <w:top w:val="nil"/>
               <w:left w:val="nil"/>
@@ -29735,7 +29521,7 @@
         </w:tc>
         <w:tc>
           <w:tcPr>
-            <w:tcW w:w="965" w:type="dxa"/>
+            <w:tcW w:w="966" w:type="dxa"/>
             <w:tcBorders>
               <w:top w:val="single" w:sz="12" w:space="0" w:color="000000"/>
               <w:left w:val="single" w:sz="8" w:space="0" w:color="000000"/>
@@ -29774,7 +29560,7 @@
         </w:tc>
         <w:tc>
           <w:tcPr>
-            <w:tcW w:w="646" w:type="dxa"/>
+            <w:tcW w:w="645" w:type="dxa"/>
             <w:tcBorders>
               <w:top w:val="single" w:sz="12" w:space="0" w:color="000000"/>
               <w:left w:val="single" w:sz="8" w:space="0" w:color="000000"/>
@@ -29856,7 +29642,7 @@
         </w:trPr>
         <w:tc>
           <w:tcPr>
-            <w:tcW w:w="1077" w:type="dxa"/>
+            <w:tcW w:w="1076" w:type="dxa"/>
             <w:tcBorders>
               <w:top w:val="nil"/>
               <w:left w:val="single" w:sz="8" w:space="0" w:color="000000"/>
@@ -29890,7 +29676,7 @@
         </w:tc>
         <w:tc>
           <w:tcPr>
-            <w:tcW w:w="3067" w:type="dxa"/>
+            <w:tcW w:w="3068" w:type="dxa"/>
             <w:tcBorders>
               <w:top w:val="nil"/>
               <w:left w:val="single" w:sz="8" w:space="0" w:color="2B4B5B"/>
@@ -30006,7 +29792,7 @@
         </w:tc>
         <w:tc>
           <w:tcPr>
-            <w:tcW w:w="965" w:type="dxa"/>
+            <w:tcW w:w="966" w:type="dxa"/>
             <w:tcBorders>
               <w:top w:val="single" w:sz="8" w:space="0" w:color="000000"/>
               <w:left w:val="single" w:sz="8" w:space="0" w:color="000000"/>
@@ -30046,7 +29832,7 @@
         </w:tc>
         <w:tc>
           <w:tcPr>
-            <w:tcW w:w="646" w:type="dxa"/>
+            <w:tcW w:w="645" w:type="dxa"/>
             <w:tcBorders>
               <w:top w:val="single" w:sz="8" w:space="0" w:color="000000"/>
               <w:left w:val="single" w:sz="8" w:space="0" w:color="000000"/>
@@ -30127,7 +29913,7 @@
         </w:trPr>
         <w:tc>
           <w:tcPr>
-            <w:tcW w:w="1077" w:type="dxa"/>
+            <w:tcW w:w="1076" w:type="dxa"/>
             <w:tcBorders>
               <w:top w:val="nil"/>
               <w:left w:val="single" w:sz="8" w:space="0" w:color="000000"/>
@@ -30166,7 +29952,7 @@
         </w:tc>
         <w:tc>
           <w:tcPr>
-            <w:tcW w:w="3067" w:type="dxa"/>
+            <w:tcW w:w="3068" w:type="dxa"/>
             <w:tcBorders>
               <w:top w:val="nil"/>
               <w:left w:val="single" w:sz="8" w:space="0" w:color="183848"/>
@@ -30282,7 +30068,7 @@
         </w:tc>
         <w:tc>
           <w:tcPr>
-            <w:tcW w:w="965" w:type="dxa"/>
+            <w:tcW w:w="966" w:type="dxa"/>
             <w:tcBorders>
               <w:top w:val="single" w:sz="8" w:space="0" w:color="000000"/>
               <w:left w:val="single" w:sz="8" w:space="0" w:color="000000"/>
@@ -30321,7 +30107,7 @@
         </w:tc>
         <w:tc>
           <w:tcPr>
-            <w:tcW w:w="646" w:type="dxa"/>
+            <w:tcW w:w="645" w:type="dxa"/>
             <w:tcBorders>
               <w:top w:val="single" w:sz="8" w:space="0" w:color="000000"/>
               <w:left w:val="single" w:sz="8" w:space="0" w:color="000000"/>
@@ -30411,19 +30197,7 @@
         <w:rPr>
           <w:b/>
         </w:rPr>
-        <w:t>{{na1</w:t>
-      </w:r>
-      <w:r>
-        <w:rPr>
-          <w:b/>
-        </w:rPr>
-        <w:t>5</w:t>
-      </w:r>
-      <w:r>
-        <w:rPr>
-          <w:b/>
-        </w:rPr>
-        <w:t xml:space="preserve">-2}}          </w:t>
+        <w:t xml:space="preserve">{{na15-2}}          </w:t>
         <w:tab/>
       </w:r>
     </w:p>

</xml_diff>